<commit_message>
Add Melissa PowerPoint notes, transfer/CAQH/FASD billing, and intern supervision sections
Incorporates content from "Notes from Melissa POwer points.docx" and
"More to add.docx" into the onboarding manual:

- Section 12: Billing Absolutes, mental health as medical providers,
  documentation as legal requirement, productivity expectations
- Section 13.1: Case transfer form requirements (Durae)
- Section 13.2: Licensed therapist CAQH 90-day attestation
- Section 13.3: FASD payor usage rules + open question on out-of-area
  (e.g. Orlando) therapist billing
- Section 13.4: Registered intern supervision-hour logging rules
- Renumbered "How Conflicts..." to Section 14; TOC updated

Co-Authored-By: Claude Opus 4.6 (1M context) <noreply@anthropic.com>
</commit_message>
<xml_diff>
--- a/FASD_Mental_Health_Onboarding_Manual.docx
+++ b/FASD_Mental_Health_Onboarding_Manual.docx
@@ -190,7 +190,55 @@
         <w:ind w:left="360"/>
       </w:pPr>
       <w:r>
-        <w:t>12. How Conflicts in This Manual Are Flagged</w:t>
+        <w:t>12. Notes from Melissa’s PowerPoint Training Slides</w:t>
+      </w:r>
+    </w:p>
+    <w:p>
+      <w:pPr>
+        <w:ind w:left="360"/>
+      </w:pPr>
+      <w:r>
+        <w:t>13. Additional Procedures and Requirements</w:t>
+      </w:r>
+    </w:p>
+    <w:p>
+      <w:pPr>
+        <w:ind w:left="360"/>
+      </w:pPr>
+      <w:r>
+        <w:t>13.1 Case Transfers and the Transfer Form</w:t>
+      </w:r>
+    </w:p>
+    <w:p>
+      <w:pPr>
+        <w:ind w:left="360"/>
+      </w:pPr>
+      <w:r>
+        <w:t>13.2 Licensed Therapists: CAQH Attestation</w:t>
+      </w:r>
+    </w:p>
+    <w:p>
+      <w:pPr>
+        <w:ind w:left="360"/>
+      </w:pPr>
+      <w:r>
+        <w:t>13.3 Billing for FASD — Payor Usage</w:t>
+      </w:r>
+    </w:p>
+    <w:p>
+      <w:pPr>
+        <w:ind w:left="360"/>
+      </w:pPr>
+      <w:r>
+        <w:t>13.4 Registered Interns: Logging Supervision Hours for Licensure</w:t>
+      </w:r>
+    </w:p>
+    <w:p>
+      <w:pPr>
+        <w:ind w:left="360"/>
+      </w:pPr>
+      <w:r>
+        <w:t>14. How Conflicts in This Manual Are Flagged</w:t>
       </w:r>
     </w:p>
     <w:p>
@@ -2529,7 +2577,637 @@
         <w:pStyle w:val="Heading1"/>
       </w:pPr>
       <w:r>
-        <w:t>12. How Conflicts in This Manual Are Flagged</w:t>
+        <w:t>12. Notes from Melissa's PowerPoint Training Slides</w:t>
+      </w:r>
+    </w:p>
+    <w:p>
+      <w:pPr/>
+      <w:r>
+        <w:t>The following content comes from training slides shared by Melissa (dated 9/5/25 and 12/5/25). It is included here so interns and new hires have a written record of the clinical, billing, documentation, and productivity expectations presented in those sessions.</w:t>
+      </w:r>
+    </w:p>
+    <w:p>
+      <w:pPr>
+        <w:pStyle w:val="Heading2"/>
+      </w:pPr>
+      <w:r>
+        <w:t>12.1 The Billing Absolutes — No Ifs, Ands, or Buts</w:t>
+      </w:r>
+    </w:p>
+    <w:p>
+      <w:pPr>
+        <w:pStyle w:val="ListBullet"/>
+      </w:pPr>
+      <w:r>
+        <w:t>Rule #1 — No client can be seen until consents are signed.</w:t>
+      </w:r>
+    </w:p>
+    <w:p>
+      <w:pPr>
+        <w:pStyle w:val="ListBullet"/>
+      </w:pPr>
+      <w:r>
+        <w:t>Rule #2 — The assessment is always billed first. Nothing else can be billed before it (unless it is an ITXXCC or CCM, which are not billable codes).</w:t>
+      </w:r>
+    </w:p>
+    <w:p>
+      <w:pPr>
+        <w:pStyle w:val="ListBullet"/>
+      </w:pPr>
+      <w:r>
+        <w:t>Rule #3 — You must do a Treatment Plan and get it signed by the caregiver.</w:t>
+      </w:r>
+    </w:p>
+    <w:p>
+      <w:pPr>
+        <w:pStyle w:val="ListBullet"/>
+      </w:pPr>
+      <w:r>
+        <w:t>Rule #4 — You must track when documents expire and cannot see clients until they have been renewed. This applies to consents, assessments, treatment plans, and treatment plan reviews.</w:t>
+      </w:r>
+    </w:p>
+    <w:p>
+      <w:pPr>
+        <w:pStyle w:val="Heading2"/>
+      </w:pPr>
+      <w:r>
+        <w:t>12.2 Why Mental Health Therapists Are Considered Medical Providers</w:t>
+      </w:r>
+    </w:p>
+    <w:p>
+      <w:pPr/>
+      <w:r>
+        <w:t>Mental health treatment is healthcare. Licensed mental health clinicians diagnose mental health conditions, deliver evidence-based treatment, and manage clinical risk. These are medical/clinical services even if they do not involve prescribing medication.</w:t>
+      </w:r>
+    </w:p>
+    <w:p>
+      <w:pPr/>
+      <w:r>
+        <w:t>We operate under healthcare laws and standards. Therapy is regulated by:</w:t>
+      </w:r>
+    </w:p>
+    <w:p>
+      <w:pPr>
+        <w:pStyle w:val="ListBullet"/>
+      </w:pPr>
+      <w:r>
+        <w:t>State licensing boards</w:t>
+      </w:r>
+    </w:p>
+    <w:p>
+      <w:pPr>
+        <w:pStyle w:val="ListBullet"/>
+      </w:pPr>
+      <w:r>
+        <w:t>Federal laws (HIPAA, CMS guidelines, etc.)</w:t>
+      </w:r>
+    </w:p>
+    <w:p>
+      <w:pPr>
+        <w:pStyle w:val="ListBullet"/>
+      </w:pPr>
+      <w:r>
+        <w:t>Insurance / Medicaid requirements</w:t>
+      </w:r>
+    </w:p>
+    <w:p>
+      <w:pPr/>
+      <w:r>
+        <w:t>These standards classify mental health clinicians as healthcare providers and hold us to medical-level documentation expectations.</w:t>
+      </w:r>
+    </w:p>
+    <w:p>
+      <w:pPr/>
+      <w:r>
+        <w:t>We provide billable clinical services. When a therapist bills insurance, they are functioning as a medical provider. Every billable service must be supported by documentation that demonstrates:</w:t>
+      </w:r>
+    </w:p>
+    <w:p>
+      <w:pPr>
+        <w:pStyle w:val="ListBullet"/>
+      </w:pPr>
+      <w:r>
+        <w:t>Clinical necessity</w:t>
+      </w:r>
+    </w:p>
+    <w:p>
+      <w:pPr>
+        <w:pStyle w:val="ListBullet"/>
+      </w:pPr>
+      <w:r>
+        <w:t>Treatment intervention</w:t>
+      </w:r>
+    </w:p>
+    <w:p>
+      <w:pPr>
+        <w:pStyle w:val="ListBullet"/>
+      </w:pPr>
+      <w:r>
+        <w:t>Client progress</w:t>
+      </w:r>
+    </w:p>
+    <w:p>
+      <w:pPr>
+        <w:pStyle w:val="ListBullet"/>
+      </w:pPr>
+      <w:r>
+        <w:t>Medical necessity</w:t>
+      </w:r>
+    </w:p>
+    <w:p>
+      <w:pPr/>
+      <w:r>
+        <w:t>Without documentation, the service is not legally billable.</w:t>
+      </w:r>
+    </w:p>
+    <w:p>
+      <w:pPr/>
+      <w:r>
+        <w:t>Our work affects medical and legal outcomes. Therapy notes may be reviewed:</w:t>
+      </w:r>
+    </w:p>
+    <w:p>
+      <w:pPr>
+        <w:pStyle w:val="ListBullet"/>
+      </w:pPr>
+      <w:r>
+        <w:t>In insurance audits</w:t>
+      </w:r>
+    </w:p>
+    <w:p>
+      <w:pPr>
+        <w:pStyle w:val="ListBullet"/>
+      </w:pPr>
+      <w:r>
+        <w:t>During coordination with psychiatrists, primary care, or hospitals</w:t>
+      </w:r>
+    </w:p>
+    <w:p>
+      <w:pPr>
+        <w:pStyle w:val="ListBullet"/>
+      </w:pPr>
+      <w:r>
+        <w:t>In legal or child welfare cases</w:t>
+      </w:r>
+    </w:p>
+    <w:p>
+      <w:pPr>
+        <w:pStyle w:val="ListBullet"/>
+      </w:pPr>
+      <w:r>
+        <w:t>For disability determinations</w:t>
+      </w:r>
+    </w:p>
+    <w:p>
+      <w:pPr/>
+      <w:r>
+        <w:t>Because our documentation can influence medical decisions and legal actions, it must meet medical standards.</w:t>
+      </w:r>
+    </w:p>
+    <w:p>
+      <w:pPr>
+        <w:pStyle w:val="Heading2"/>
+      </w:pPr>
+      <w:r>
+        <w:t>12.3 Why Documentation Is a Requirement of the Job, Not Just a Company Preference</w:t>
+      </w:r>
+    </w:p>
+    <w:p>
+      <w:pPr/>
+      <w:r>
+        <w:t>It's required by law. HIPAA, state practice acts, and professional ethics codes all require accurate and timely clinical records. Not documenting appropriately is a legal and ethical violation, not just a workplace one.</w:t>
+      </w:r>
+    </w:p>
+    <w:p>
+      <w:pPr/>
+      <w:r>
+        <w:t>It protects the clinician. Good documentation is your main defense in:</w:t>
+      </w:r>
+    </w:p>
+    <w:p>
+      <w:pPr>
+        <w:pStyle w:val="ListBullet"/>
+      </w:pPr>
+      <w:r>
+        <w:t>Client complaints</w:t>
+      </w:r>
+    </w:p>
+    <w:p>
+      <w:pPr>
+        <w:pStyle w:val="ListBullet"/>
+      </w:pPr>
+      <w:r>
+        <w:t>Licensing board investigations</w:t>
+      </w:r>
+    </w:p>
+    <w:p>
+      <w:pPr>
+        <w:pStyle w:val="ListBullet"/>
+      </w:pPr>
+      <w:r>
+        <w:t>Liability concerns</w:t>
+      </w:r>
+    </w:p>
+    <w:p>
+      <w:pPr/>
+      <w:r>
+        <w:t>If you have been professional and made sound clinical decisions, your notes are what show it.</w:t>
+      </w:r>
+    </w:p>
+    <w:p>
+      <w:pPr/>
+      <w:r>
+        <w:t>It protects the client. Documentation provides continuity of care. If a client moves clinics, switches providers, or ends up in crisis services, the record shows what has been tried and what risks are in play.</w:t>
+      </w:r>
+    </w:p>
+    <w:p>
+      <w:pPr/>
+      <w:r>
+        <w:t>It ensures medical necessity for payment. Insurance companies can and do demand proof of medical necessity. If documentation is missing or incomplete, they can:</w:t>
+      </w:r>
+    </w:p>
+    <w:p>
+      <w:pPr>
+        <w:pStyle w:val="ListBullet"/>
+      </w:pPr>
+      <w:r>
+        <w:t>Deny payment</w:t>
+      </w:r>
+    </w:p>
+    <w:p>
+      <w:pPr>
+        <w:pStyle w:val="ListBullet"/>
+      </w:pPr>
+      <w:r>
+        <w:t>Demand repayment</w:t>
+      </w:r>
+    </w:p>
+    <w:p>
+      <w:pPr>
+        <w:pStyle w:val="ListBullet"/>
+      </w:pPr>
+      <w:r>
+        <w:t>Penalize the organization</w:t>
+      </w:r>
+    </w:p>
+    <w:p>
+      <w:pPr/>
+      <w:r>
+        <w:t>Documentation is therefore part of the clinical service itself — not an optional add-on.</w:t>
+      </w:r>
+    </w:p>
+    <w:p>
+      <w:pPr>
+        <w:pStyle w:val="Heading2"/>
+      </w:pPr>
+      <w:r>
+        <w:t>12.4 Productivity Expectations</w:t>
+      </w:r>
+    </w:p>
+    <w:p>
+      <w:pPr/>
+      <w:r>
+        <w:t>Overall productivity has been looking much better. The general rule is roughly 1½ hours of client work and 2 hours of administrative work per day as the working target.</w:t>
+      </w:r>
+    </w:p>
+    <w:p>
+      <w:pPr/>
+      <w:r>
+        <w:t>Your productivity is your responsibility to track. If you are unable to meet the expectation due to caseload issues, frequent absences, or other obstacles, you need to bring that up to your supervisor. Supervisors will not assume a problem exists if it has not been raised.</w:t>
+      </w:r>
+    </w:p>
+    <w:p>
+      <w:pPr/>
+      <w:r>
+        <w:t>If productivity concerns persist, you may be asked to take on clients in other programs (for example, outpatient mental health) so that there is enough work to fill the expectations of the scheduled work week.</w:t>
+      </w:r>
+    </w:p>
+    <w:p>
+      <w:pPr>
+        <w:pStyle w:val="Heading1"/>
+      </w:pPr>
+      <w:r>
+        <w:t>13. Additional Procedures and Requirements</w:t>
+      </w:r>
+    </w:p>
+    <w:p>
+      <w:pPr/>
+      <w:r>
+        <w:t>This section consolidates additional procedures that interns, new hires, and licensed therapists are expected to follow. Topics include case transfers, CAQH attestation for licensed clinicians, and payor usage rules for FASD billing.</w:t>
+      </w:r>
+    </w:p>
+    <w:p>
+      <w:pPr>
+        <w:pStyle w:val="Heading2"/>
+      </w:pPr>
+      <w:r>
+        <w:t>13.1 Case Transfers and the Transfer Form</w:t>
+      </w:r>
+    </w:p>
+    <w:p>
+      <w:pPr/>
+      <w:r>
+        <w:t>To improve accuracy when transferring cases, the transfer form must be completed in full each time. When a case is moved from one program to another, Durae needs a fully completed form before the transfer can be processed.</w:t>
+      </w:r>
+    </w:p>
+    <w:p>
+      <w:pPr/>
+      <w:r>
+        <w:t>A complete transfer form must include:</w:t>
+      </w:r>
+    </w:p>
+    <w:p>
+      <w:pPr>
+        <w:pStyle w:val="ListBullet"/>
+      </w:pPr>
+      <w:r>
+        <w:t>The originating and receiving programs (for example, OPMH to SBMH).</w:t>
+      </w:r>
+    </w:p>
+    <w:p>
+      <w:pPr>
+        <w:pStyle w:val="ListBullet"/>
+      </w:pPr>
+      <w:r>
+        <w:t>Whether the case is being assigned to an intern.</w:t>
+      </w:r>
+    </w:p>
+    <w:p>
+      <w:pPr>
+        <w:pStyle w:val="ListBullet"/>
+      </w:pPr>
+      <w:r>
+        <w:t>Which payor will be used.</w:t>
+      </w:r>
+    </w:p>
+    <w:p>
+      <w:pPr>
+        <w:pStyle w:val="ListBullet"/>
+      </w:pPr>
+      <w:r>
+        <w:t>Any other identifying information the form requests.</w:t>
+      </w:r>
+    </w:p>
+    <w:p>
+      <w:pPr/>
+      <w:r>
+        <w:t>If the form is not completed in full, Durae will reject the request and the case will not be transferred until all required information has been received. Please do not assume Durae can infer missing details — she has asked that every field be filled out so she knows exactly who is who, when to use intern codes, and when to use billable units and the correct payor.</w:t>
+      </w:r>
+    </w:p>
+    <w:p>
+      <w:pPr/>
+      <w:r>
+        <w:t>Reference — original request from Durae (paraphrased from an email dated 3/30): she is asking that parts of the transfer form be treated as required fields, because it is important she be told who is assigned to the case, when intern codes should be used, and when she needs to switch back to billable units / the client’s payor. She stopped assuming some time ago and needs the form filled out with as much information as possible.</w:t>
+      </w:r>
+    </w:p>
+    <w:p>
+      <w:pPr>
+        <w:pStyle w:val="Heading2"/>
+      </w:pPr>
+      <w:r>
+        <w:t>13.2 Licensed Therapists: CAQH Attestation</w:t>
+      </w:r>
+    </w:p>
+    <w:p>
+      <w:pPr/>
+      <w:r>
+        <w:t>This subsection applies to licensed therapists only. It does not apply to registered interns.</w:t>
+      </w:r>
+    </w:p>
+    <w:p>
+      <w:pPr/>
+      <w:r>
+        <w:t>If you are a licensed therapist, you must keep your CAQH profile current:</w:t>
+      </w:r>
+    </w:p>
+    <w:p>
+      <w:pPr>
+        <w:pStyle w:val="ListBullet"/>
+      </w:pPr>
+      <w:r>
+        <w:t>Log in to your CAQH ProView portal at https://proview.caqh.org/login/.</w:t>
+      </w:r>
+    </w:p>
+    <w:p>
+      <w:pPr>
+        <w:pStyle w:val="ListBullet"/>
+      </w:pPr>
+      <w:r>
+        <w:t>Review your information for accuracy and update anything that has changed (including practice location details).</w:t>
+      </w:r>
+    </w:p>
+    <w:p>
+      <w:pPr>
+        <w:pStyle w:val="ListBullet"/>
+      </w:pPr>
+      <w:r>
+        <w:t>Click "Reattest" and submit.</w:t>
+      </w:r>
+    </w:p>
+    <w:p>
+      <w:pPr>
+        <w:pStyle w:val="ListBullet"/>
+      </w:pPr>
+      <w:r>
+        <w:t>Authorize release of your profile information to the payors who need it (for example, Carelon Behavioral Health) so your data appears in their provider directory.</w:t>
+      </w:r>
+    </w:p>
+    <w:p>
+      <w:pPr/>
+      <w:r>
+        <w:t>CAQH will email you every 90 days asking you to reattest. You must reattest before the deadline listed in each reminder email. If you do not, payors such as Carelon can remove you from their provider directory, which puts your ability to bill at risk.</w:t>
+      </w:r>
+    </w:p>
+    <w:p>
+      <w:pPr/>
+      <w:r>
+        <w:t>Why this matters: under the Consolidated Appropriations Act of 2021 and related state rules, payors are required to confirm that provider directory information is accurate on a regular schedule (every 90 days for commercial lines of business; Medicaid/Medicare and other lines follow state guidance). Keeping CAQH up to date is how we meet that requirement.</w:t>
+      </w:r>
+    </w:p>
+    <w:p>
+      <w:pPr/>
+      <w:r>
+        <w:t>If you have questions about CAQH itself, you can contact CAQH directly at 888-599-1771, or use the chat support at https://proview.caqh.org/PR. If you are not a CAQH participating provider, data can instead be attested through the Carelon Behavioral Health Provider Portal at https://providerportal.CarelonBehavioralHealth.com/index.html#/login — log in with your ProviderConnect credentials, choose "Update Demographic Information," scroll to the bottom, choose "Attestation," update data as needed, and click "Save Attestation."</w:t>
+      </w:r>
+    </w:p>
+    <w:p>
+      <w:pPr>
+        <w:pStyle w:val="Heading2"/>
+      </w:pPr>
+      <w:r>
+        <w:t>13.3 Billing for FASD — Payor Usage</w:t>
+      </w:r>
+    </w:p>
+    <w:p>
+      <w:pPr/>
+      <w:r>
+        <w:t>The following rules clarify which payor to use when billing FASD-related services. Use this as a quick reference; confirm with Charmian if a situation is not covered here.</w:t>
+      </w:r>
+    </w:p>
+    <w:p>
+      <w:pPr/>
+      <w:r>
+        <w:t>If Jackie is running out of units for continued service and we are unable to get approval for additional units, "G-Fetal Alcohol-Srq Office" can be used to support the work being done. H2019 can be included under this payor (pending final confirmation with Charmian).</w:t>
+      </w:r>
+    </w:p>
+    <w:p>
+      <w:pPr/>
+      <w:r>
+        <w:t>Regarding the use of "FASD Unassigned Client" with "G-Fetal Alcohol County": the safest approach is to discontinue this practice. If you need to track work being done with individuals who are not yet clients, you may continue using "FASD Unassigned Client," but the payor must be "G-Fetal Alcohol-Srq Office."</w:t>
+      </w:r>
+    </w:p>
+    <w:p>
+      <w:pPr/>
+      <w:r>
+        <w:t>Quick reference:</w:t>
+      </w:r>
+    </w:p>
+    <w:p>
+      <w:pPr>
+        <w:pStyle w:val="ListBullet"/>
+      </w:pPr>
+      <w:r>
+        <w:t>"G-Fetal Alcohol County" — only to be used by Jackie for intervention with an established Sarasota County client. May also be used by the evaluation team when completing an evaluation for a confirmed Sarasota County resident.</w:t>
+      </w:r>
+    </w:p>
+    <w:p>
+      <w:pPr>
+        <w:pStyle w:val="ListBullet"/>
+      </w:pPr>
+      <w:r>
+        <w:t>"G-Fetal Alcohol-Srq Office" — use for all other situations not noted above. This is the only payor to be used with "FASD Unassigned Client."</w:t>
+      </w:r>
+    </w:p>
+    <w:p>
+      <w:pPr/>
+      <w:r>
+        <w:t>Open question — out-of-area therapists: If a therapist working out of another location (for example, Orlando) provides therapy to an FASD client, do we bill that work to a different payor or office code than the Sarasota-based options above? This needs to be confirmed with Charmian / Jackie before billing, because neither "G-Fetal Alcohol County" nor "G-Fetal Alcohol-Srq Office" clearly covers services delivered from outside the Sarasota area.</w:t>
+      </w:r>
+    </w:p>
+    <w:p>
+      <w:pPr>
+        <w:pStyle w:val="Heading2"/>
+      </w:pPr>
+      <w:r>
+        <w:t>13.4 Registered Interns: Logging Supervision Hours for Licensure</w:t>
+      </w:r>
+    </w:p>
+    <w:p>
+      <w:pPr/>
+      <w:r>
+        <w:t>This subsection applies to registered interns who are accruing therapy and supervision hours toward licensure. It does not apply to licensed therapists.</w:t>
+      </w:r>
+    </w:p>
+    <w:p>
+      <w:pPr/>
+      <w:r>
+        <w:t>Each month, registered interns will receive a log of their accrued therapy hours and supervision hours. The log is to be signed by the intern, the intern’s supervisor, and the qualified supervisor (if that person is within the agency). Only actual supervision time should be logged to the supervision service code in Lauris, and the appointment must be marked "complete" in Lauris in order for it to count.</w:t>
+      </w:r>
+    </w:p>
+    <w:p>
+      <w:pPr/>
+      <w:r>
+        <w:t>What counts toward supervision for licensure:</w:t>
+      </w:r>
+    </w:p>
+    <w:p>
+      <w:pPr>
+        <w:pStyle w:val="ListBullet"/>
+      </w:pPr>
+      <w:r>
+        <w:t>Individual Supervision</w:t>
+      </w:r>
+    </w:p>
+    <w:p>
+      <w:pPr>
+        <w:pStyle w:val="ListBullet"/>
+      </w:pPr>
+      <w:r>
+        <w:t>Group Supervision</w:t>
+      </w:r>
+    </w:p>
+    <w:p>
+      <w:pPr>
+        <w:pStyle w:val="ListBullet"/>
+      </w:pPr>
+      <w:r>
+        <w:t>Reflective Supervision</w:t>
+      </w:r>
+    </w:p>
+    <w:p>
+      <w:pPr>
+        <w:pStyle w:val="ListBullet"/>
+      </w:pPr>
+      <w:r>
+        <w:t>Clinical meetings — only if your team meets in breakout rooms after the main portion and discusses clinical content (reviewing cases, reflecting on cases, etc.).</w:t>
+      </w:r>
+    </w:p>
+    <w:p>
+      <w:pPr/>
+      <w:r>
+        <w:t>What does not count toward supervision for licensure:</w:t>
+      </w:r>
+    </w:p>
+    <w:p>
+      <w:pPr>
+        <w:pStyle w:val="ListBullet"/>
+      </w:pPr>
+      <w:r>
+        <w:t>Meetings with people who are not supervising you</w:t>
+      </w:r>
+    </w:p>
+    <w:p>
+      <w:pPr>
+        <w:pStyle w:val="ListBullet"/>
+      </w:pPr>
+      <w:r>
+        <w:t>Team parties</w:t>
+      </w:r>
+    </w:p>
+    <w:p>
+      <w:pPr>
+        <w:pStyle w:val="ListBullet"/>
+      </w:pPr>
+      <w:r>
+        <w:t>Trainings</w:t>
+      </w:r>
+    </w:p>
+    <w:p>
+      <w:pPr>
+        <w:pStyle w:val="ListBullet"/>
+      </w:pPr>
+      <w:r>
+        <w:t>Chart reviews</w:t>
+      </w:r>
+    </w:p>
+    <w:p>
+      <w:pPr>
+        <w:pStyle w:val="ListBullet"/>
+      </w:pPr>
+      <w:r>
+        <w:t>Book club</w:t>
+      </w:r>
+    </w:p>
+    <w:p>
+      <w:pPr>
+        <w:pStyle w:val="ListBullet"/>
+      </w:pPr>
+      <w:r>
+        <w:t>Other non-supervisory activities</w:t>
+      </w:r>
+    </w:p>
+    <w:p>
+      <w:pPr/>
+      <w:r>
+        <w:t>Please keep this in mind when logging time in Lauris. If you are not sure whether a particular meeting counts, ask your supervisor before logging it to the supervision service code.</w:t>
+      </w:r>
+    </w:p>
+    <w:p>
+      <w:pPr>
+        <w:pStyle w:val="Heading1"/>
+      </w:pPr>
+      <w:r>
+        <w:t>14. How Conflicts in This Manual Are Flagged</w:t>
       </w:r>
     </w:p>
     <w:p>

</xml_diff>

<commit_message>
Rewrite MH manual §12.4: productivity tied to funding source
Recast §12.4 Productivity Expectations: typically 75% of the job is billable to a funding source, 25% (~2 hrs/day) admin. Clarify that consultation/case management only count as billable where a program has a funder linked to them (keep consultation ~1 hr/week); where no funding is connected, focus on direct mental health services.

Replaces the old '1.5 hours of client work' line, resolving the §12.4 vs OPS-112 discrepancy in favor of OPS-112. Queue updated to mark applied.

Co-Authored-By: Claude Opus 4.8 (1M context) <noreply@anthropic.com>
</commit_message>
<xml_diff>
--- a/FASD_Mental_Health_Onboarding_Manual.docx
+++ b/FASD_Mental_Health_Onboarding_Manual.docx
@@ -3331,7 +3331,12 @@
     </w:p>
     <w:p>
       <w:r>
-        <w:t>The general rule is roughly 1½ hours of client work and 2 hours of administrative work per day as the working target.</w:t>
+        <w:t>Typically, 75% of the job is billable to a funding source, with the remaining 25% (about 2 hours per day) as administrative time.</w:t>
+      </w:r>
+    </w:p>
+    <w:p>
+      <w:r>
+        <w:t>How consultation and case management fit into that 75% depends on your program. Some programs have a funding source linked specifically to consultation, case management, and similar duties — and some do not. Where a funder pays for those activities, they count toward your billable time (keep consultation small — about one hour once a week). Where there is no funding source connected to case management and consultation, those activities do not count as billable, so your focus needs to be on direct mental health services. Put simply: if a duty is not tied to a funder, it should not be filling your billable time.</w:t>
       </w:r>
     </w:p>
     <w:p>

</xml_diff>

<commit_message>
Manual: TFC Supports bullet, Using Lauris section; drop two planning notes
- §2 FASD Families May Need More: add "TFC Supports" bullet
- New "Using Lauris and Lauris Reports" section: Lauris orientation +
  Common Tasks (cross-linked to existing procedures) + Lauris Reports
  block moved out of Appendix B
- Remove the "Supervising Intern" and "Additional Supports" @Claude
  planning notes (intern content folded into the future MH Supervisors
  section)

Co-Authored-By: Claude Opus 4.8 (1M context) <noreply@anthropic.com>
</commit_message>
<xml_diff>
--- a/FASD_Mental_Health_Onboarding_Manual.docx
+++ b/FASD_Mental_Health_Onboarding_Manual.docx
@@ -647,23 +647,10 @@
     </w:p>
     <w:p>
       <w:r>
-        <w:t xml:space="preserve">Section: Supervising Intern:  </w:t>
-      </w:r>
-      <w:r>
-        <w:t>Get with Bob and same as therapist. Need to include which payor.  Non-payor. (intern, need to be using FASD) Assign to Intern, high co-pay with deductible (IN at the end), Non-payor – 20 units, h codes (CCM/ITXX), group therapy</w:t>
-      </w:r>
-    </w:p>
-    <w:p>
-      <w:r>
-        <w:t xml:space="preserve">Section X: </w:t>
-      </w:r>
-      <w:r>
-        <w:t xml:space="preserve">Additional Supports both within the Florida Center and outside. (I need to think of a better title)  Would be condensing FASD Families May Need More and the different types of therapies available at The Florida Center. </w:t>
-      </w:r>
-    </w:p>
-    <w:p>
-      <w:r>
-        <w:t>Section X: Using Lauris and Lauris Reports:  Lauris Opening/Closing a Case</w:t>
+        <w:rPr>
+          <w:strike/>
+        </w:rPr>
+        <w:t>✓ Section X: Using Lauris and Lauris Reports:  Lauris Opening/Closing a Case</w:t>
       </w:r>
     </w:p>
     <w:p>
@@ -898,6 +885,14 @@
       </w:pPr>
       <w:r>
         <w:t>Parent Advocate</w:t>
+      </w:r>
+    </w:p>
+    <w:p>
+      <w:pPr>
+        <w:pStyle w:val="ListBullet"/>
+      </w:pPr>
+      <w:r>
+        <w:t xml:space="preserve">TFC Supports: other therapies and services available at The Florida Center.</w:t>
       </w:r>
     </w:p>
     <w:p>
@@ -4276,10 +4271,12 @@
       <w:pPr>
         <w:pStyle w:val="Heading1"/>
       </w:pPr>
+      <w:bookmarkStart w:id="11" w:name="ClosingCase"/>
       <w:r>
         <w:lastRenderedPageBreak/>
         <w:t>10. Closing a Case</w:t>
       </w:r>
+      <w:bookmarkEnd w:id="11"/>
     </w:p>
     <w:p>
       <w:pPr>
@@ -4809,9 +4806,11 @@
       <w:pPr>
         <w:pStyle w:val="Heading2"/>
       </w:pPr>
+      <w:bookmarkStart w:id="10" w:name="ClientTransfers"/>
       <w:r>
         <w:t xml:space="preserve">Client Transfers and Dual Enrollment</w:t>
       </w:r>
+      <w:bookmarkEnd w:id="10"/>
     </w:p>
     <w:p>
       <w:pPr/>
@@ -4920,6 +4919,165 @@
       <w:pPr/>
       <w:r>
         <w:t xml:space="preserve">Reference - original request from Durae (paraphrased from an email dated 3/30): she is asking that parts of the form be treated as required fields, because it is important she be told who is assigned to the case, when intern codes should be used, and when she needs to switch back to billable units / the client's payor. She stopped assuming some time ago and needs the form filled out with as much information as possible.</w:t>
+      </w:r>
+    </w:p>
+    <w:p>
+      <w:pPr>
+        <w:pStyle w:val="Heading1"/>
+      </w:pPr>
+      <w:r>
+        <w:t xml:space="preserve">Using Lauris and Lauris Reports</w:t>
+      </w:r>
+    </w:p>
+    <w:p>
+      <w:pPr/>
+      <w:r>
+        <w:t xml:space="preserve">Lauris is the electronic health record (EHR) where you manage your caseload - scheduling, session notes, forms, outcome measures, and billing all live here. All client files are kept electronically in Lauris; there are no hard files.</w:t>
+      </w:r>
+    </w:p>
+    <w:p>
+      <w:pPr>
+        <w:pStyle w:val="Heading2"/>
+      </w:pPr>
+      <w:r>
+        <w:t xml:space="preserve">Common Tasks in Lauris</w:t>
+      </w:r>
+    </w:p>
+    <w:p>
+      <w:pPr>
+        <w:pStyle w:val="ListBullet"/>
+      </w:pPr>
+      <w:r>
+        <w:t xml:space="preserve">Opening, closing, or transferring a case: use the Open/Close Transfer Request form (Choose Form &gt; Request Forms &gt; Open/Close Transfer Request). For the step-by-step, go to </w:t>
+      </w:r>
+      <w:hyperlink w:anchor="LaurisTransferForm">
+        <w:r>
+          <w:rPr>
+            <w:rStyle w:val="Hyperlink"/>
+          </w:rPr>
+          <w:t xml:space="preserve">Lauris: Closing a Case</w:t>
+        </w:r>
+      </w:hyperlink>
+      <w:r>
+        <w:t xml:space="preserve">; for the program-transfer and dual-enrollment rules, go to </w:t>
+      </w:r>
+      <w:hyperlink w:anchor="ClientTransfers">
+        <w:r>
+          <w:rPr>
+            <w:rStyle w:val="Hyperlink"/>
+          </w:rPr>
+          <w:t xml:space="preserve">Client Transfers and Dual Enrollment</w:t>
+        </w:r>
+      </w:hyperlink>
+      <w:r>
+        <w:t xml:space="preserve">.</w:t>
+      </w:r>
+    </w:p>
+    <w:p>
+      <w:pPr>
+        <w:pStyle w:val="ListBullet"/>
+      </w:pPr>
+      <w:r>
+        <w:t xml:space="preserve">Discharge Plan: completed in Lauris when you close a case. For the step-by-step, go to </w:t>
+      </w:r>
+      <w:hyperlink w:anchor="ClosingCase">
+        <w:r>
+          <w:rPr>
+            <w:rStyle w:val="Hyperlink"/>
+          </w:rPr>
+          <w:t xml:space="preserve">Closing a Case</w:t>
+        </w:r>
+      </w:hyperlink>
+      <w:r>
+        <w:t xml:space="preserve">.</w:t>
+      </w:r>
+    </w:p>
+    <w:p>
+      <w:pPr>
+        <w:pStyle w:val="ListBullet"/>
+      </w:pPr>
+      <w:r>
+        <w:t xml:space="preserve">DAP notes, CFARS, no-shows and cancellations (Memo-to-Chart), and uploading signed treatment plans are all done in Lauris, each within its required timeframe.</w:t>
+      </w:r>
+    </w:p>
+    <w:p>
+      <w:pPr>
+        <w:pStyle w:val="Heading2"/>
+      </w:pPr>
+      <w:r>
+        <w:t xml:space="preserve">Lauris Reports</w:t>
+      </w:r>
+    </w:p>
+    <w:p>
+      <w:pPr/>
+      <w:r>
+        <w:t xml:space="preserve">Bob Toth sends clinicians monthly reports. These reports do not mean a clinician is in trouble; they are a way to track the things we need to stay on top of so the work we do gets reimbursed. Reports include:</w:t>
+      </w:r>
+    </w:p>
+    <w:p>
+      <w:pPr>
+        <w:pStyle w:val="ListBullet"/>
+      </w:pPr>
+      <w:r>
+        <w:t xml:space="preserve">Productivity.</w:t>
+      </w:r>
+    </w:p>
+    <w:p>
+      <w:pPr>
+        <w:pStyle w:val="ListBullet"/>
+      </w:pPr>
+      <w:r>
+        <w:t xml:space="preserve">Reminders to complete CFARS / annual consents, Assessments (BPS, IDA), and Treatment Plans.</w:t>
+      </w:r>
+    </w:p>
+    <w:p>
+      <w:pPr>
+        <w:pStyle w:val="ListBullet"/>
+      </w:pPr>
+      <w:r>
+        <w:t xml:space="preserve">Number of sessions.</w:t>
+      </w:r>
+    </w:p>
+    <w:p>
+      <w:pPr/>
+      <w:r>
+        <w:t xml:space="preserve">You can request these reports as often as you like. Because there can be a number of corrections, it helps to have them sent throughout the month so you can stay on top of them.</w:t>
+      </w:r>
+    </w:p>
+    <w:p>
+      <w:pPr/>
+      <w:r>
+        <w:t xml:space="preserve">For Mental Health Supervisors, there are additional reports. Common problems they catch:</w:t>
+      </w:r>
+    </w:p>
+    <w:p>
+      <w:pPr>
+        <w:pStyle w:val="ListBullet"/>
+      </w:pPr>
+      <w:r>
+        <w:t xml:space="preserve">Wrong service type - the service on the Lauris calendar does not match the form completed (for example, scheduled as FASD Case Management but the form is entered as FASD Consult).</w:t>
+      </w:r>
+    </w:p>
+    <w:p>
+      <w:pPr>
+        <w:pStyle w:val="ListBullet"/>
+      </w:pPr>
+      <w:r>
+        <w:t xml:space="preserve">Time overlaps - something is on the calendar and a different service is entered over the same time.</w:t>
+      </w:r>
+    </w:p>
+    <w:p>
+      <w:pPr>
+        <w:pStyle w:val="ListBullet"/>
+      </w:pPr>
+      <w:r>
+        <w:t xml:space="preserve">A completed service on the calendar where the form was never finished.</w:t>
+      </w:r>
+    </w:p>
+    <w:p>
+      <w:pPr/>
+      <w:r>
+        <w:t xml:space="preserve">A reminder also appears in Lauris the following year: another BPS or IDA cannot be conducted until one year from the original date of completion.</w:t>
       </w:r>
     </w:p>
     <w:p>
@@ -5649,214 +5807,6 @@
         <w:rPr>
           <w:i/>
         </w:rPr>
-      </w:pPr>
-    </w:p>
-    <w:p>
-      <w:pPr>
-        <w:rPr>
-          <w:iCs/>
-        </w:rPr>
-      </w:pPr>
-      <w:r>
-        <w:rPr>
-          <w:iCs/>
-        </w:rPr>
-        <w:t>Lauris Reports</w:t>
-      </w:r>
-    </w:p>
-    <w:p>
-      <w:pPr>
-        <w:rPr>
-          <w:iCs/>
-        </w:rPr>
-      </w:pPr>
-      <w:r>
-        <w:rPr>
-          <w:iCs/>
-        </w:rPr>
-        <w:t xml:space="preserve">Bob Toth will be sending clinicians monthly reports.  These reports do not mean a clinician is getting in trouble, but it is a way to track </w:t>
-      </w:r>
-      <w:r>
-        <w:rPr>
-          <w:iCs/>
-        </w:rPr>
-        <w:t xml:space="preserve">many of the things we need to hold to ensure that we get reimbursed for the work that is done.  Some of the reports that are included: </w:t>
-      </w:r>
-    </w:p>
-    <w:p>
-      <w:pPr>
-        <w:pStyle w:val="ListParagraph"/>
-        <w:numPr>
-          <w:ilvl w:val="0"/>
-          <w:numId w:val="23"/>
-        </w:numPr>
-        <w:rPr>
-          <w:iCs/>
-        </w:rPr>
-      </w:pPr>
-      <w:r>
-        <w:rPr>
-          <w:iCs/>
-        </w:rPr>
-        <w:t>Productivity</w:t>
-      </w:r>
-    </w:p>
-    <w:p>
-      <w:pPr>
-        <w:pStyle w:val="ListParagraph"/>
-        <w:numPr>
-          <w:ilvl w:val="0"/>
-          <w:numId w:val="23"/>
-        </w:numPr>
-        <w:rPr>
-          <w:rFonts w:ascii="Segoe UI" w:hAnsi="Segoe UI" w:cs="Segoe UI"/>
-        </w:rPr>
-      </w:pPr>
-      <w:r>
-        <w:rPr>
-          <w:rFonts w:ascii="Segoe UI" w:hAnsi="Segoe UI" w:cs="Segoe UI"/>
-        </w:rPr>
-        <w:t xml:space="preserve">Reminders to do CFARS/annual consents, Assessments (BPS, IDA) and Treatment Plans.  </w:t>
-      </w:r>
-    </w:p>
-    <w:p>
-      <w:pPr>
-        <w:pStyle w:val="ListParagraph"/>
-        <w:numPr>
-          <w:ilvl w:val="0"/>
-          <w:numId w:val="23"/>
-        </w:numPr>
-        <w:rPr>
-          <w:iCs/>
-        </w:rPr>
-      </w:pPr>
-      <w:r>
-        <w:rPr>
-          <w:iCs/>
-        </w:rPr>
-        <w:t># of sessions</w:t>
-      </w:r>
-    </w:p>
-    <w:p>
-      <w:pPr>
-        <w:rPr>
-          <w:rFonts w:ascii="Segoe UI" w:hAnsi="Segoe UI" w:cs="Segoe UI"/>
-        </w:rPr>
-      </w:pPr>
-      <w:r>
-        <w:rPr>
-          <w:rFonts w:ascii="Segoe UI" w:hAnsi="Segoe UI" w:cs="Segoe UI"/>
-        </w:rPr>
-        <w:t xml:space="preserve">For Mental Health Supervisors, there are additional reports to support you: </w:t>
-      </w:r>
-    </w:p>
-    <w:p>
-      <w:pPr>
-        <w:rPr>
-          <w:rFonts w:ascii="Segoe UI" w:hAnsi="Segoe UI" w:cs="Segoe UI"/>
-        </w:rPr>
-      </w:pPr>
-    </w:p>
-    <w:p>
-      <w:pPr>
-        <w:rPr>
-          <w:rFonts w:ascii="Segoe UI" w:hAnsi="Segoe UI" w:cs="Segoe UI"/>
-        </w:rPr>
-      </w:pPr>
-      <w:r>
-        <w:rPr>
-          <w:rFonts w:ascii="Segoe UI" w:hAnsi="Segoe UI" w:cs="Segoe UI"/>
-        </w:rPr>
-        <w:t>Common problems</w:t>
-      </w:r>
-    </w:p>
-    <w:p>
-      <w:pPr>
-        <w:rPr>
-          <w:rFonts w:ascii="Segoe UI" w:hAnsi="Segoe UI" w:cs="Segoe UI"/>
-        </w:rPr>
-      </w:pPr>
-      <w:r>
-        <w:rPr>
-          <w:rFonts w:ascii="Segoe UI" w:hAnsi="Segoe UI" w:cs="Segoe UI"/>
-        </w:rPr>
-        <w:lastRenderedPageBreak/>
-        <w:t xml:space="preserve">Wrong service type (what is on calendar in Lauris) with form (when completing service). I.E. FASD Case Management Service but enter in Form as FASD Consult. </w:t>
-      </w:r>
-    </w:p>
-    <w:p>
-      <w:pPr>
-        <w:rPr>
-          <w:rFonts w:ascii="Segoe UI" w:hAnsi="Segoe UI" w:cs="Segoe UI"/>
-        </w:rPr>
-      </w:pPr>
-      <w:r>
-        <w:rPr>
-          <w:rFonts w:ascii="Segoe UI" w:hAnsi="Segoe UI" w:cs="Segoe UI"/>
-        </w:rPr>
-        <w:t xml:space="preserve">Time overlaps. There is something on the calendar and then puts something else as a service. </w:t>
-      </w:r>
-    </w:p>
-    <w:p>
-      <w:pPr>
-        <w:rPr>
-          <w:rFonts w:ascii="Segoe UI" w:hAnsi="Segoe UI" w:cs="Segoe UI"/>
-        </w:rPr>
-      </w:pPr>
-      <w:r>
-        <w:rPr>
-          <w:rFonts w:ascii="Segoe UI" w:hAnsi="Segoe UI" w:cs="Segoe UI"/>
-        </w:rPr>
-        <w:t>Completed service on calendar and get side tracked and did not complete form.</w:t>
-      </w:r>
-    </w:p>
-    <w:p>
-      <w:pPr>
-        <w:rPr>
-          <w:rFonts w:ascii="Segoe UI" w:hAnsi="Segoe UI" w:cs="Segoe UI"/>
-        </w:rPr>
-      </w:pPr>
-      <w:r>
-        <w:rPr>
-          <w:rFonts w:ascii="Segoe UI" w:hAnsi="Segoe UI" w:cs="Segoe UI"/>
-        </w:rPr>
-        <w:t xml:space="preserve">Bob’s report comes monthly – if you did something, you didn’t see something wrong. </w:t>
-      </w:r>
-    </w:p>
-    <w:p>
-      <w:pPr>
-        <w:rPr>
-          <w:rFonts w:ascii="Segoe UI" w:hAnsi="Segoe UI" w:cs="Segoe UI"/>
-        </w:rPr>
-      </w:pPr>
-      <w:r>
-        <w:rPr>
-          <w:rFonts w:ascii="Segoe UI" w:hAnsi="Segoe UI" w:cs="Segoe UI"/>
-        </w:rPr>
-        <w:t xml:space="preserve">You can get it as much as want.  There can be a lot of corrections, send throughout the month so can be on top of it. </w:t>
-      </w:r>
-    </w:p>
-    <w:p>
-      <w:pPr>
-        <w:pStyle w:val="ListBullet"/>
-        <w:rPr>
-          <w:highlight w:val="yellow"/>
-        </w:rPr>
-      </w:pPr>
-      <w:r>
-        <w:rPr>
-          <w:highlight w:val="yellow"/>
-        </w:rPr>
-        <w:t>A reminder is in Lauris for the following year: another BPS or IDA cannot be conducted until one year from the original date of completion.</w:t>
-      </w:r>
-    </w:p>
-    <w:p>
-      <w:pPr>
-        <w:pStyle w:val="ListBullet"/>
-        <w:numPr>
-          <w:ilvl w:val="0"/>
-          <w:numId w:val="0"/>
-        </w:numPr>
       </w:pPr>
     </w:p>
     <w:p>

</xml_diff>

<commit_message>
Manual: add For Mental Health Supervisors section; finalize Groups wording
- New "For Mental Health Supervisors" section: Expectations, Leader Portal,
  Monthly Updates, Qualified Supervisors, Supervisor Meetings, Interns
  (ideal cases + link), Quarterly Supervisor Review, MH Audits, Compliance
  Monitoring, Transferring Cases (cross-link), Collaboration with Other
  Programs. Internal Google links included.
- Groups: limit bullet now uses the exact Service Codes table wording
  (156 units/39 hrs per recipient; in-person only; no group+individual same day)

Co-Authored-By: Claude Opus 4.8 (1M context) <noreply@anthropic.com>
</commit_message>
<xml_diff>
--- a/FASD_Mental_Health_Onboarding_Manual.docx
+++ b/FASD_Mental_Health_Onboarding_Manual.docx
@@ -634,6 +634,7 @@
         <w:rPr>
           <w:strike/>
         </w:rPr>
+        <w:lastRenderedPageBreak/>
         <w:t xml:space="preserve">✓ Even though this is an intern and no real dollars attached, we still follow the guidelines. </w:t>
       </w:r>
     </w:p>
@@ -671,12 +672,18 @@
     </w:p>
     <w:p>
       <w:r>
-        <w:t>Section X:  This is a section for mental health supervisors (not sure the title)</w:t>
-      </w:r>
-    </w:p>
-    <w:p>
-      <w:r>
-        <w:t>Here are some things I want to include:  Intranet link for supervisors:  It a source of great information that will give an overview of the mental health teams and contact information, information about chart reviews the hiring</w:t>
+        <w:rPr>
+          <w:strike/>
+        </w:rPr>
+        <w:t>✓ Section X:  This is a section for mental health supervisors (not sure the title)</w:t>
+      </w:r>
+    </w:p>
+    <w:p>
+      <w:r>
+        <w:rPr>
+          <w:strike/>
+        </w:rPr>
+        <w:t>✓ Here are some things I want to include:  Intranet link for supervisors:  It a source of great information that will give an overview of the mental health teams and contact information, information about chart reviews the hiring</w:t>
       </w:r>
     </w:p>
     <w:p>
@@ -688,19 +695,40 @@
           <w:t>https://sites.google.com/thefloridacenter.org/programs/mental-health-services-home/leader-portal</w:t>
         </w:r>
       </w:hyperlink>
-    </w:p>
-    <w:p>
-      <w:r>
-        <w:t xml:space="preserve">Update at least monthly calendar, pops up each month, Update all staff roster, include interns, MH, all supervisors, parent advocates (not needed:  Intake) </w:t>
-      </w:r>
-    </w:p>
-    <w:p>
+      <w:r>
+        <w:rPr>
+          <w:strike/>
+        </w:rPr>
+        <w:t xml:space="preserve">✓ </w:t>
+      </w:r>
+    </w:p>
+    <w:p>
+      <w:r>
+        <w:rPr>
+          <w:strike/>
+        </w:rPr>
+        <w:t xml:space="preserve">✓ Update at least monthly calendar, pops up each month, Update all staff roster, include interns, MH, all supervisors, parent advocates (not needed:  Intake) </w:t>
+      </w:r>
+    </w:p>
+    <w:p>
+      <w:r>
+        <w:rPr>
+          <w:strike/>
+        </w:rPr>
+        <w:t xml:space="preserve">✓ </w:t>
+      </w:r>
       <w:proofErr w:type="spellStart"/>
       <w:r>
+        <w:rPr>
+          <w:strike/>
+        </w:rPr>
         <w:t>QS,if</w:t>
       </w:r>
       <w:proofErr w:type="spellEnd"/>
       <w:r>
+        <w:rPr>
+          <w:strike/>
+        </w:rPr>
         <w:t xml:space="preserve"> you are the qualified supervisor for a clinician, need to be the same profession/degree, Lauris will track hours, need to put name on the list.   </w:t>
       </w:r>
       <w:hyperlink r:id="rId9" w:history="1">
@@ -714,31 +742,52 @@
     </w:p>
     <w:p>
       <w:r>
-        <w:t>Supervisor meetings, once a month, 3rd Friday of the month at 12pm in</w:t>
-      </w:r>
-      <w:r>
+        <w:rPr>
+          <w:strike/>
+        </w:rPr>
+        <w:t>✓ Supervisor meetings, once a month, 3rd Friday of the month at 12pm in</w:t>
+      </w:r>
+      <w:r>
+        <w:rPr>
+          <w:strike/>
+        </w:rPr>
         <w:t xml:space="preserve"> June and then</w:t>
       </w:r>
       <w:r>
+        <w:rPr>
+          <w:strike/>
+        </w:rPr>
         <w:t xml:space="preserve"> August </w:t>
       </w:r>
     </w:p>
     <w:p>
       <w:r>
-        <w:t xml:space="preserve">Expectations:  </w:t>
+        <w:rPr>
+          <w:strike/>
+        </w:rPr>
+        <w:t xml:space="preserve">✓ Expectations:  </w:t>
       </w:r>
     </w:p>
     <w:p/>
     <w:p>
       <w:r>
-        <w:t xml:space="preserve">Compliance </w:t>
+        <w:rPr>
+          <w:strike/>
+        </w:rPr>
+        <w:t xml:space="preserve">✓ Compliance </w:t>
       </w:r>
       <w:proofErr w:type="spellStart"/>
       <w:r>
+        <w:rPr>
+          <w:strike/>
+        </w:rPr>
         <w:t>Montioring</w:t>
       </w:r>
       <w:proofErr w:type="spellEnd"/>
       <w:r>
+        <w:rPr>
+          <w:strike/>
+        </w:rPr>
         <w:t xml:space="preserve">:  </w:t>
       </w:r>
       <w:hyperlink r:id="rId10" w:anchor="gid=53724778" w:history="1">
@@ -753,33 +802,54 @@
     <w:p/>
     <w:p>
       <w:r>
-        <w:t>How to Transfer cases:</w:t>
+        <w:rPr>
+          <w:strike/>
+        </w:rPr>
+        <w:t>✓ How to Transfer cases:</w:t>
       </w:r>
     </w:p>
     <w:p/>
     <w:p>
       <w:r>
-        <w:t xml:space="preserve">Quarterly Supervisor Review:  </w:t>
-      </w:r>
-      <w:r>
+        <w:rPr>
+          <w:strike/>
+        </w:rPr>
+        <w:t xml:space="preserve">✓ Quarterly Supervisor Review:  </w:t>
+      </w:r>
+      <w:r>
+        <w:rPr>
+          <w:strike/>
+        </w:rPr>
         <w:t>Bob sends a report, and basically every active client needs to be reviewed by the supervisor at least one time per quarter.  Supervisors should enter notes for areas of guidance that they verbally tell their supervisees as a form of documentation that the conversation occurred (example:  Discussed client’s receive self-injurious statements and advised therapist to complete a safety plan with the child and caregivers).</w:t>
       </w:r>
     </w:p>
     <w:p>
       <w:r>
+        <w:rPr>
+          <w:strike/>
+        </w:rPr>
+        <w:t>✓ MH Audits:  MH department does this quarterly.  Assign each program to a quarter and supervisors facilitate with their staff one per year (</w:t>
+      </w:r>
+      <w:r>
+        <w:rPr>
+          <w:strike/>
+        </w:rPr>
+        <w:t>(example:  Q1 is OPMH/ECMHC Sarasota, Q2 OPMH/ECMHC North Port, Q3 SBMH, Q4 FASD/ECC.</w:t>
+      </w:r>
+      <w:r>
+        <w:rPr>
+          <w:strike/>
+        </w:rPr>
+        <w:t>)</w:t>
+      </w:r>
+    </w:p>
+    <w:p>
+      <w:r>
+        <w:rPr>
+          <w:strike/>
+        </w:rPr>
         <w:lastRenderedPageBreak/>
-        <w:t>MH Audits:  MH department does this quarterly.  Assign each program to a quarter and supervisors facilitate with their staff one per year (</w:t>
-      </w:r>
-      <w:r>
-        <w:t>(example:  Q1 is OPMH/ECMHC Sarasota, Q2 OPMH/ECMHC North Port, Q3 SBMH, Q4 FASD/ECC.</w:t>
-      </w:r>
-      <w:r>
-        <w:t>)</w:t>
-      </w:r>
-    </w:p>
-    <w:p>
-      <w:r>
-        <w:t>Collaboration with other programs:  Why is it important</w:t>
+        <w:t>✓ Collaboration with other programs:  Why is it important</w:t>
       </w:r>
     </w:p>
     <w:p>
@@ -859,16 +929,16 @@
       <w:r>
         <w:t xml:space="preserve">Connecting with LRT (Local Review Team): LRT staffing is called when a community child is not getting the care they need - not for lack of the parents' efforts - and multiple agencies need to come together to contribute to a solution. It can also be requested for post-adoption cases or for children currently in the child welfare system who need additional supportive services. To make a referral, </w:t>
       </w:r>
-      <w:hyperlink r:id="rId31">
+      <w:hyperlink r:id="rId11">
         <w:r>
           <w:rPr>
             <w:rStyle w:val="Hyperlink"/>
           </w:rPr>
-          <w:t xml:space="preserve">complete the LRT referral form</w:t>
+          <w:t>complete the LRT referral form</w:t>
         </w:r>
       </w:hyperlink>
       <w:r>
-        <w:t xml:space="preserve">.</w:t>
+        <w:t>.</w:t>
       </w:r>
     </w:p>
     <w:p>
@@ -892,7 +962,7 @@
         <w:pStyle w:val="ListBullet"/>
       </w:pPr>
       <w:r>
-        <w:t xml:space="preserve">TFC Supports: other therapies and services available at The Florida Center.</w:t>
+        <w:t>TFC Supports: other therapies and services available at The Florida Center.</w:t>
       </w:r>
     </w:p>
     <w:p>
@@ -973,11 +1043,12 @@
       <w:pPr>
         <w:pStyle w:val="Heading2"/>
       </w:pPr>
-      <w:bookmarkStart w:id="9" w:name="ServiceCodes"/>
-      <w:r>
+      <w:bookmarkStart w:id="0" w:name="ServiceCodes"/>
+      <w:r>
+        <w:lastRenderedPageBreak/>
         <w:t>3.2 Service Codes</w:t>
       </w:r>
-      <w:bookmarkEnd w:id="9"/>
+      <w:bookmarkEnd w:id="0"/>
     </w:p>
     <w:p>
       <w:r>
@@ -1006,7 +1077,6 @@
               <w:rPr>
                 <w:b/>
               </w:rPr>
-              <w:lastRenderedPageBreak/>
               <w:t>Code</w:t>
             </w:r>
           </w:p>
@@ -1413,7 +1483,14 @@
               <w:rPr>
                 <w:sz w:val="20"/>
               </w:rPr>
-              <w:t>Maximum 156 quarter-hour units (39 hours) per recipient per state fiscal year. In-person only — Medicaid does not reimburse telehealth groups. Cannot bill group and individual on the same day.</w:t>
+              <w:t xml:space="preserve">Maximum 156 quarter-hour units (39 hours) per recipient per state fiscal year. In-person only — Medicaid does not reimburse telehealth groups. Cannot bill </w:t>
+            </w:r>
+            <w:r>
+              <w:rPr>
+                <w:sz w:val="20"/>
+              </w:rPr>
+              <w:lastRenderedPageBreak/>
+              <w:t>group and individual on the same day.</w:t>
             </w:r>
           </w:p>
         </w:tc>
@@ -1429,6 +1506,7 @@
                 <w:b/>
                 <w:sz w:val="20"/>
               </w:rPr>
+              <w:lastRenderedPageBreak/>
               <w:t>T1023 HA</w:t>
             </w:r>
           </w:p>
@@ -1455,14 +1533,7 @@
               <w:rPr>
                 <w:sz w:val="20"/>
               </w:rPr>
-              <w:t xml:space="preserve">40 units (10 hours) per calendar year. Used for tests, inventories, questionnaires, and structured observations to assess the </w:t>
-            </w:r>
-            <w:r>
-              <w:rPr>
-                <w:sz w:val="20"/>
-              </w:rPr>
-              <w:lastRenderedPageBreak/>
-              <w:t>caregiver-child relationship and inform treatment plan development. Not used often because reimbursement is low; clinicians often prefer to incorporate this work into regular billing.</w:t>
+              <w:t>40 units (10 hours) per calendar year. Used for tests, inventories, questionnaires, and structured observations to assess the caregiver-child relationship and inform treatment plan development. Not used often because reimbursement is low; clinicians often prefer to incorporate this work into regular billing.</w:t>
             </w:r>
           </w:p>
         </w:tc>
@@ -1478,7 +1549,6 @@
                 <w:b/>
                 <w:sz w:val="20"/>
               </w:rPr>
-              <w:lastRenderedPageBreak/>
               <w:t>T1027</w:t>
             </w:r>
           </w:p>
@@ -1722,17 +1792,16 @@
       <w:pPr>
         <w:pStyle w:val="Heading2"/>
       </w:pPr>
-      <w:r>
+      <w:bookmarkStart w:id="1" w:name="InternCodes"/>
+      <w:r>
+        <w:lastRenderedPageBreak/>
         <w:t>3.3 Intern Service Codes</w:t>
       </w:r>
-    </w:p>
-    <w:p>
-      <w:r>
-        <w:t xml:space="preserve">Interns track their work using the codes below. The IN suffix tells the EHR that the service is non-billable, so nothing flows to a payor. Use these codes when assigning a case to an intern. The payor depends on the program: for OPMH and FASD, use Non-Payor (intern, high-copay/deductible cases); for SBMH, the work is logged under the school grant. Even though no real dollars are attached, the same compliance </w:t>
-      </w:r>
-      <w:r>
-        <w:lastRenderedPageBreak/>
-        <w:t>and documentation standards apply — a CFARS, BPS, IDA, treatment plan, or DAP note must be completed to the same standard as the licensed clinician's work.</w:t>
+      <w:bookmarkEnd w:id="1"/>
+    </w:p>
+    <w:p>
+      <w:r>
+        <w:t>Interns track their work using the codes below. The IN suffix tells the EHR that the service is non-billable, so nothing flows to a payor. Use these codes when assigning a case to an intern. The payor depends on the program: for OPMH and FASD, use Non-Payor (intern, high-copay/deductible cases); for SBMH, the work is logged under the school grant. Even though no real dollars are attached, the same compliance and documentation standards apply — a CFARS, BPS, IDA, treatment plan, or DAP note must be completed to the same standard as the licensed clinician's work.</w:t>
       </w:r>
     </w:p>
     <w:tbl>
@@ -2112,11 +2181,11 @@
       <w:pPr>
         <w:pStyle w:val="Heading2"/>
       </w:pPr>
-      <w:bookmarkStart w:id="4" w:name="OptimizingBilling"/>
+      <w:bookmarkStart w:id="2" w:name="OptimizingBilling"/>
       <w:r>
         <w:t>3.5 Optimizing Billing</w:t>
       </w:r>
-      <w:bookmarkEnd w:id="4"/>
+      <w:bookmarkEnd w:id="2"/>
     </w:p>
     <w:p>
       <w:pPr>
@@ -2152,6 +2221,7 @@
         <w:pStyle w:val="ListBullet"/>
       </w:pPr>
       <w:r>
+        <w:lastRenderedPageBreak/>
         <w:t>Another option: a clinician can bill all three of the following on the same day: ONE PSY (H0031 HN) or IDA (H0031 HO/TS) — 1 unit, ONE TP (H0032) — 1 unit, ONE CFARS (H0031) — 1 unit. Medicaid only; client must be present.</w:t>
       </w:r>
     </w:p>
@@ -2167,12 +2237,11 @@
       <w:pPr>
         <w:pStyle w:val="Heading2"/>
       </w:pPr>
-      <w:bookmarkStart w:id="5" w:name="WhoCanBill"/>
-      <w:r>
-        <w:lastRenderedPageBreak/>
+      <w:bookmarkStart w:id="3" w:name="WhoCanBill"/>
+      <w:r>
         <w:t>3.6 Who Can Bill What</w:t>
       </w:r>
-      <w:bookmarkEnd w:id="5"/>
+      <w:bookmarkEnd w:id="3"/>
     </w:p>
     <w:p>
       <w:r>
@@ -2227,11 +2296,11 @@
       <w:pPr>
         <w:pStyle w:val="Heading2"/>
       </w:pPr>
-      <w:bookmarkStart w:id="6" w:name="TimelineBilling"/>
+      <w:bookmarkStart w:id="4" w:name="TimelineBilling"/>
       <w:r>
         <w:t>3.7 Timeline for Billing</w:t>
       </w:r>
-      <w:bookmarkEnd w:id="6"/>
+      <w:bookmarkEnd w:id="4"/>
     </w:p>
     <w:p>
       <w:r>
@@ -2307,6 +2376,7 @@
         <w:pStyle w:val="ListBullet"/>
       </w:pPr>
       <w:r>
+        <w:lastRenderedPageBreak/>
         <w:t>The caregiver's signature does NOT have to be received within the 10-calendar-day window.</w:t>
       </w:r>
     </w:p>
@@ -2337,7 +2407,6 @@
         <w:pStyle w:val="ListBullet"/>
       </w:pPr>
       <w:r>
-        <w:lastRenderedPageBreak/>
         <w:t>Because the plan is completed quickly, you may have a provisional diagnosis or treatment goal. You can make an addendum or revise at the Treatment Plan Review. Diagnoses can only be changed at Treatment Plan Reviews or Assessments.</w:t>
       </w:r>
     </w:p>
@@ -2505,6 +2574,7 @@
         <w:rPr>
           <w:b/>
         </w:rPr>
+        <w:lastRenderedPageBreak/>
         <w:t xml:space="preserve">Unit availability: </w:t>
       </w:r>
       <w:r>
@@ -2532,7 +2602,6 @@
         <w:pStyle w:val="ListBullet"/>
       </w:pPr>
       <w:r>
-        <w:lastRenderedPageBreak/>
         <w:t>A BPS or IDA is billed event-based, not by the 60-minute / quarter-hour maximum that applies to individual or family therapy sessions. Longer sessions are appropriate when the assessment requires it.</w:t>
       </w:r>
     </w:p>
@@ -2595,65 +2664,53 @@
         <w:pStyle w:val="Heading2"/>
       </w:pPr>
       <w:r>
-        <w:t xml:space="preserve">Groups</w:t>
-      </w:r>
-    </w:p>
-    <w:p>
-      <w:pPr/>
-      <w:r>
-        <w:t xml:space="preserve">Group therapy is billed under H2019 HQ and follows these rules:</w:t>
-      </w:r>
-    </w:p>
-    <w:p>
-      <w:pPr>
-        <w:pStyle w:val="ListBullet"/>
-      </w:pPr>
-      <w:r>
-        <w:t xml:space="preserve">Each client may receive a maximum of 156 quarter-hour units (39 hours) of group therapy per state fiscal year.</w:t>
-      </w:r>
-    </w:p>
-    <w:p>
-      <w:pPr>
-        <w:pStyle w:val="ListBullet"/>
-      </w:pPr>
-      <w:r>
-        <w:t xml:space="preserve">Groups are only reimbursed in person. Medicaid does not reimburse group therapy delivered virtually.</w:t>
-      </w:r>
-    </w:p>
-    <w:p>
-      <w:pPr>
-        <w:pStyle w:val="ListBullet"/>
-      </w:pPr>
-      <w:r>
-        <w:t xml:space="preserve">A client cannot be seen twice in the same day - for example, a child cannot attend a group and also have an individual session on the same day.</w:t>
-      </w:r>
-    </w:p>
-    <w:p>
-      <w:pPr>
-        <w:pStyle w:val="ListBullet"/>
-      </w:pPr>
-      <w:r>
-        <w:t xml:space="preserve">Each child in the group must have their own note for documentation.</w:t>
-      </w:r>
-    </w:p>
-    <w:p>
-      <w:pPr>
-        <w:pStyle w:val="ListBullet"/>
-      </w:pPr>
-      <w:r>
-        <w:t xml:space="preserve">If a child is attending group each week, list "Group Therapy" on the service table of their treatment plan.</w:t>
-      </w:r>
-    </w:p>
-    <w:p>
-      <w:pPr>
-        <w:pStyle w:val="ListBullet"/>
-      </w:pPr>
-      <w:r>
-        <w:t xml:space="preserve">The same rules apply to interns. Even though an intern's services carry no real dollars, we still follow the same group guidelines and documentation standards.</w:t>
-      </w:r>
-    </w:p>
-    <w:p>
-      <w:pPr/>
+        <w:t>Groups</w:t>
+      </w:r>
+    </w:p>
+    <w:p>
+      <w:r>
+        <w:t>Group therapy is billed under H2019 HQ and fol</w:t>
+      </w:r>
+      <w:r>
+        <w:t>lows these rules:</w:t>
+      </w:r>
+    </w:p>
+    <w:p>
+      <w:pPr>
+        <w:pStyle w:val="ListBullet"/>
+      </w:pPr>
+      <w:r>
+        <w:t xml:space="preserve">Maximum 156 quarter-hour units (39 hours) per recipient per state fiscal year. In-person only — Medicaid does not reimburse telehealth groups. Cannot bill group and individual on the same day.</w:t>
+      </w:r>
+    </w:p>
+    <w:p>
+      <w:pPr>
+        <w:pStyle w:val="ListBullet"/>
+      </w:pPr>
+      <w:r>
+        <w:t>Each child in the group must have their own note for documentation.</w:t>
+      </w:r>
+    </w:p>
+    <w:p>
+      <w:pPr>
+        <w:pStyle w:val="ListBullet"/>
+      </w:pPr>
+      <w:r>
+        <w:t>If a child is attending group each week, list "Group Therapy" on the s</w:t>
+      </w:r>
+      <w:r>
+        <w:t>ervice table of their treatment plan.</w:t>
+      </w:r>
+    </w:p>
+    <w:p>
+      <w:pPr>
+        <w:pStyle w:val="ListBullet"/>
+      </w:pPr>
+      <w:r>
+        <w:t>The same rules apply to interns. Even though an intern's services carry no real dollars, we still follow the same group guidelines and documentation standards.</w:t>
+      </w:r>
+    </w:p>
+    <w:p>
       <w:r>
         <w:t xml:space="preserve">For more detailed information, go to </w:t>
       </w:r>
@@ -2662,11 +2719,11 @@
           <w:rPr>
             <w:rStyle w:val="Hyperlink"/>
           </w:rPr>
-          <w:t xml:space="preserve">Service Codes</w:t>
+          <w:t>Service Codes</w:t>
         </w:r>
       </w:hyperlink>
       <w:r>
-        <w:t xml:space="preserve">.</w:t>
+        <w:t>.</w:t>
       </w:r>
     </w:p>
     <w:p>
@@ -2687,6 +2744,7 @@
         <w:pStyle w:val="Heading1"/>
       </w:pPr>
       <w:r>
+        <w:lastRenderedPageBreak/>
         <w:t>Choosing the Billing Client: Child vs. Adult</w:t>
       </w:r>
     </w:p>
@@ -2704,7 +2762,15 @@
       </w:r>
     </w:p>
     <w:p>
-      <w:r>
+      <w:pPr>
+        <w:rPr>
+          <w:i/>
+        </w:rPr>
+      </w:pPr>
+      <w:r>
+        <w:rPr>
+          <w:i/>
+        </w:rPr>
         <w:t>Internal (FASD Team) Referral to MH Services</w:t>
       </w:r>
     </w:p>
@@ -2757,10 +2823,9 @@
         <w:spacing w:after="160" w:line="259" w:lineRule="auto"/>
       </w:pPr>
       <w:r>
-        <w:lastRenderedPageBreak/>
         <w:t xml:space="preserve">Parent Advocate sends completed documentation to </w:t>
       </w:r>
-      <w:hyperlink r:id="rId11" w:history="1">
+      <w:hyperlink r:id="rId12" w:history="1">
         <w:r>
           <w:rPr>
             <w:rStyle w:val="Hyperlink"/>
@@ -2838,7 +2903,15 @@
       </w:r>
     </w:p>
     <w:p>
-      <w:r>
+      <w:pPr>
+        <w:rPr>
+          <w:i/>
+        </w:rPr>
+      </w:pPr>
+      <w:r>
+        <w:rPr>
+          <w:i/>
+        </w:rPr>
         <w:t>OPMH Referral to MH Services</w:t>
       </w:r>
     </w:p>
@@ -2891,7 +2964,12 @@
         <w:spacing w:after="160" w:line="259" w:lineRule="auto"/>
       </w:pPr>
       <w:r>
-        <w:t>OPMH supervisor reaches out to FASD MH Supervisor to discuss appropriateness of transferring to FASD program</w:t>
+        <w:t xml:space="preserve">OPMH supervisor reaches out to FASD MH Supervisor to discuss appropriateness of </w:t>
+      </w:r>
+      <w:bookmarkStart w:id="5" w:name="_GoBack"/>
+      <w:bookmarkEnd w:id="5"/>
+      <w:r>
+        <w:t>transferring to FASD program</w:t>
       </w:r>
     </w:p>
     <w:p>
@@ -2931,6 +3009,7 @@
         <w:pStyle w:val="Heading2"/>
       </w:pPr>
       <w:r>
+        <w:lastRenderedPageBreak/>
         <w:t>Insurance Verification</w:t>
       </w:r>
     </w:p>
@@ -2975,11 +3054,11 @@
       <w:pPr>
         <w:pStyle w:val="Heading1"/>
       </w:pPr>
-      <w:bookmarkStart w:id="2" w:name="Confidentiality"/>
+      <w:bookmarkStart w:id="6" w:name="Confidentiality"/>
       <w:r>
         <w:t>4. Confidentiality and Informed Consent</w:t>
       </w:r>
-      <w:bookmarkEnd w:id="2"/>
+      <w:bookmarkEnd w:id="6"/>
     </w:p>
     <w:p>
       <w:pPr>
@@ -2991,100 +3070,97 @@
     </w:p>
     <w:p>
       <w:r>
-        <w:t xml:space="preserve">Informed consent means the caregiver (and, where age-appropriate, the child) understands what therapy is, what it is not, who you are as their therapist, what you will do together, what the risks and </w:t>
-      </w:r>
+        <w:t>Informed consent means the caregiver (and, where age-appropriate, the child) understands what therapy is, what it is not, who you are as their therapist, what you will do together, what the risks and benefits are, and that they are free to ask questions or stop services at any time. Consent is a conversation, not just a signature.</w:t>
+      </w:r>
+    </w:p>
+    <w:p>
+      <w:pPr>
+        <w:pStyle w:val="Heading2"/>
+      </w:pPr>
+      <w:r>
+        <w:t>Consent Forms</w:t>
+      </w:r>
+    </w:p>
+    <w:p>
+      <w:pPr>
+        <w:pStyle w:val="ListBullet"/>
+      </w:pPr>
+      <w:r>
+        <w:t>Review the full consent packet with the family at the first meeting.</w:t>
+      </w:r>
+    </w:p>
+    <w:p>
+      <w:pPr>
+        <w:pStyle w:val="ListBullet"/>
+      </w:pPr>
+      <w:r>
+        <w:t>Make sure every form in the packet is completed and signed.</w:t>
+      </w:r>
+    </w:p>
+    <w:p>
+      <w:pPr>
+        <w:pStyle w:val="ListBullet"/>
+      </w:pPr>
+      <w:r>
+        <w:t>Dates on consent forms must match. We are not allowed to treat any client until consents are signed.</w:t>
+      </w:r>
+    </w:p>
+    <w:p>
+      <w:pPr>
+        <w:pStyle w:val="Heading2"/>
+      </w:pPr>
+      <w:r>
+        <w:t>Who You Are as Their Therapist</w:t>
+      </w:r>
+    </w:p>
+    <w:p>
+      <w:r>
+        <w:t>Briefly tell the family who you are: your role, your training, your supervisor, and the fact that you work specifically with families navigating FASD and other brain-based conditions. Families do better when they know the person across from them.</w:t>
+      </w:r>
+    </w:p>
+    <w:p>
+      <w:pPr>
+        <w:pStyle w:val="Heading2"/>
+      </w:pPr>
+      <w:r>
+        <w:t>Limits to Confidentiality: How to Explain Them to Families</w:t>
+      </w:r>
+    </w:p>
+    <w:p>
+      <w:r>
+        <w:t>Keep this simple. Say something like: 'Most of what you share with me stays between us. There are a few situations where the law requires me to share information, even without your permission, because safety comes first.' Then walk through the limits:</w:t>
+      </w:r>
+    </w:p>
+    <w:p>
+      <w:pPr>
+        <w:pStyle w:val="ListBullet"/>
+      </w:pPr>
+      <w:r>
+        <w:t>Mandated reporting: if I learn that a child or vulnerable adult is being abused, neglected, or exploited, I am required by law to report it.</w:t>
+      </w:r>
+    </w:p>
+    <w:p>
+      <w:pPr>
+        <w:pStyle w:val="ListBullet"/>
+      </w:pPr>
+      <w:r>
+        <w:t>Imminent harm: if someone is in serious danger of hurting themselves or someone else, I have to take steps to keep them safe, which may mean contacting others.</w:t>
+      </w:r>
+    </w:p>
+    <w:p>
+      <w:pPr>
+        <w:pStyle w:val="ListBullet"/>
+      </w:pPr>
+      <w:r>
+        <w:t>Court orders: in rare cases, a judge can order records to be released.</w:t>
+      </w:r>
+    </w:p>
+    <w:p>
+      <w:pPr>
+        <w:pStyle w:val="ListBullet"/>
+      </w:pPr>
       <w:r>
         <w:lastRenderedPageBreak/>
-        <w:t>benefits are, and that they are free to ask questions or stop services at any time. Consent is a conversation, not just a signature.</w:t>
-      </w:r>
-    </w:p>
-    <w:p>
-      <w:pPr>
-        <w:pStyle w:val="Heading2"/>
-      </w:pPr>
-      <w:r>
-        <w:t>Consent Forms</w:t>
-      </w:r>
-    </w:p>
-    <w:p>
-      <w:pPr>
-        <w:pStyle w:val="ListBullet"/>
-      </w:pPr>
-      <w:r>
-        <w:t>Review the full consent packet with the family at the first meeting.</w:t>
-      </w:r>
-    </w:p>
-    <w:p>
-      <w:pPr>
-        <w:pStyle w:val="ListBullet"/>
-      </w:pPr>
-      <w:r>
-        <w:t>Make sure every form in the packet is completed and signed.</w:t>
-      </w:r>
-    </w:p>
-    <w:p>
-      <w:pPr>
-        <w:pStyle w:val="ListBullet"/>
-      </w:pPr>
-      <w:r>
-        <w:t>Dates on consent forms must match. We are not allowed to treat any client until consents are signed.</w:t>
-      </w:r>
-    </w:p>
-    <w:p>
-      <w:pPr>
-        <w:pStyle w:val="Heading2"/>
-      </w:pPr>
-      <w:r>
-        <w:t>Who You Are as Their Therapist</w:t>
-      </w:r>
-    </w:p>
-    <w:p>
-      <w:r>
-        <w:t>Briefly tell the family who you are: your role, your training, your supervisor, and the fact that you work specifically with families navigating FASD and other brain-based conditions. Families do better when they know the person across from them.</w:t>
-      </w:r>
-    </w:p>
-    <w:p>
-      <w:pPr>
-        <w:pStyle w:val="Heading2"/>
-      </w:pPr>
-      <w:r>
-        <w:t>Limits to Confidentiality: How to Explain Them to Families</w:t>
-      </w:r>
-    </w:p>
-    <w:p>
-      <w:r>
-        <w:t>Keep this simple. Say something like: 'Most of what you share with me stays between us. There are a few situations where the law requires me to share information, even without your permission, because safety comes first.' Then walk through the limits:</w:t>
-      </w:r>
-    </w:p>
-    <w:p>
-      <w:pPr>
-        <w:pStyle w:val="ListBullet"/>
-      </w:pPr>
-      <w:r>
-        <w:t>Mandated reporting: if I learn that a child or vulnerable adult is being abused, neglected, or exploited, I am required by law to report it.</w:t>
-      </w:r>
-    </w:p>
-    <w:p>
-      <w:pPr>
-        <w:pStyle w:val="ListBullet"/>
-      </w:pPr>
-      <w:r>
-        <w:t>Imminent harm: if someone is in serious danger of hurting themselves or someone else, I have to take steps to keep them safe, which may mean contacting others.</w:t>
-      </w:r>
-    </w:p>
-    <w:p>
-      <w:pPr>
-        <w:pStyle w:val="ListBullet"/>
-      </w:pPr>
-      <w:r>
-        <w:t>Court orders: in rare cases, a judge can order records to be released.</w:t>
-      </w:r>
-    </w:p>
-    <w:p>
-      <w:pPr>
-        <w:pStyle w:val="ListBullet"/>
-      </w:pPr>
-      <w:r>
         <w:t>Coordination of care: I may talk with other providers you are working with, but only with your written permission.</w:t>
       </w:r>
     </w:p>
@@ -3118,9 +3194,6 @@
       <w:pPr>
         <w:pStyle w:val="Heading1"/>
         <w:rPr>
-          <w:rFonts w:asciiTheme="majorHAnsi" w:eastAsiaTheme="majorEastAsia" w:hAnsiTheme="majorHAnsi" w:cstheme="majorBidi"/>
-          <w:b/>
-          <w:bCs/>
           <w:color w:val="4F81BD" w:themeColor="accent1"/>
           <w:sz w:val="26"/>
           <w:szCs w:val="26"/>
@@ -3128,9 +3201,6 @@
       </w:pPr>
       <w:r>
         <w:rPr>
-          <w:rFonts w:asciiTheme="majorHAnsi" w:eastAsiaTheme="majorEastAsia" w:hAnsiTheme="majorHAnsi" w:cstheme="majorBidi"/>
-          <w:b/>
-          <w:bCs/>
           <w:color w:val="4F81BD" w:themeColor="accent1"/>
           <w:sz w:val="26"/>
           <w:szCs w:val="26"/>
@@ -3151,7 +3221,6 @@
         <w:pStyle w:val="ListBullet"/>
       </w:pPr>
       <w:r>
-        <w:lastRenderedPageBreak/>
         <w:t>Review the FASD Assessment before the session. If the client has not had an FASD evaluation, review any previous or current assessments.</w:t>
       </w:r>
     </w:p>
@@ -3239,11 +3308,11 @@
           <w:rPr>
             <w:rStyle w:val="Hyperlink"/>
           </w:rPr>
-          <w:t xml:space="preserve">Confidentiality and Informed Consent</w:t>
+          <w:t>Confidentiality and Informed Consent</w:t>
         </w:r>
       </w:hyperlink>
       <w:r>
-        <w:t xml:space="preserve">.</w:t>
+        <w:t>.</w:t>
       </w:r>
     </w:p>
     <w:p>
@@ -3293,6 +3362,7 @@
         <w:ind w:left="720"/>
       </w:pPr>
       <w:r>
+        <w:lastRenderedPageBreak/>
         <w:t>Ask about any prior therapy experiences, good or bad, and their current understanding of therapy.</w:t>
       </w:r>
     </w:p>
@@ -3381,7 +3451,7 @@
           <w:rPr>
             <w:rStyle w:val="Hyperlink"/>
           </w:rPr>
-          <w:t xml:space="preserve">Assessments</w:t>
+          <w:t>Assessments</w:t>
         </w:r>
       </w:hyperlink>
       <w:r>
@@ -3392,11 +3462,11 @@
           <w:rPr>
             <w:rStyle w:val="Hyperlink"/>
           </w:rPr>
-          <w:t xml:space="preserve">Outcome Measures</w:t>
+          <w:t>Outcome Measures</w:t>
         </w:r>
       </w:hyperlink>
       <w:r>
-        <w:t xml:space="preserve">.</w:t>
+        <w:t>.</w:t>
       </w:r>
     </w:p>
     <w:p>
@@ -3408,7 +3478,6 @@
       </w:r>
     </w:p>
     <w:p>
-      <w:pPr/>
       <w:r>
         <w:rPr>
           <w:b/>
@@ -3417,16 +3486,24 @@
       </w:r>
     </w:p>
     <w:p>
-      <w:pPr/>
-      <w:r>
-        <w:t xml:space="preserve">Block 2 hours on your calendar. For Medicaid, your actual time with the child and family may be about 1.5 hours; for private insurance, about 60 minutes. The child must be present for at least part of the session in order to bill the IDA or BPS. Have the caregiver bring the child, talk briefly about urgent concerns, and complete your parent-child observation; after the first hour you can make a provisional diagnosis, which starts the 5-business-day assessment timeline. If the meeting runs longer than the assessment, you can bill the extra time as therapy, and you may bill an individual session and an IDA/BPS on the same day as long as you blocked the 1.5-2 hours so there is no scheduling conflict. For more detailed information, go to </w:t>
+      <w:r>
+        <w:t>Block 2 hours on your calendar. For Medicaid, your actual time with the child</w:t>
+      </w:r>
+      <w:r>
+        <w:t xml:space="preserve"> and family may be about 1.5 hours; for private insurance, about 60 minutes. The child must be present for at least part of the session in order to bill the IDA or BPS. Have the caregiver bring the child, talk briefly about urgent concerns, and complete yo</w:t>
+      </w:r>
+      <w:r>
+        <w:t>ur parent-child observation; after the first hour you can make a provisional diagnosis, which starts the 5-business-day assessment timeline. If the meeting runs longer than the assessment, you can bill the extra time as therapy, and you may bill an individ</w:t>
+      </w:r>
+      <w:r>
+        <w:t xml:space="preserve">ual session and an IDA/BPS on the same day as long as you blocked the 1.5-2 hours so there is no scheduling conflict. For more detailed information, go to </w:t>
       </w:r>
       <w:hyperlink w:anchor="OptimizingBilling">
         <w:r>
           <w:rPr>
             <w:rStyle w:val="Hyperlink"/>
           </w:rPr>
-          <w:t xml:space="preserve">Optimizing Billing</w:t>
+          <w:t>Optimizing Billing</w:t>
         </w:r>
       </w:hyperlink>
       <w:r>
@@ -3437,15 +3514,14 @@
           <w:rPr>
             <w:rStyle w:val="Hyperlink"/>
           </w:rPr>
-          <w:t xml:space="preserve">Timeline for Billing</w:t>
+          <w:t>Timeline for Billing</w:t>
         </w:r>
       </w:hyperlink>
       <w:r>
-        <w:t xml:space="preserve">.</w:t>
-      </w:r>
-    </w:p>
-    <w:p>
-      <w:pPr/>
+        <w:t>.</w:t>
+      </w:r>
+    </w:p>
+    <w:p>
       <w:r>
         <w:rPr>
           <w:b/>
@@ -3454,24 +3530,28 @@
       </w:r>
     </w:p>
     <w:p>
-      <w:pPr/>
-      <w:r>
-        <w:t xml:space="preserve">The child must be present for at least part of the session to bill an IDA or BPS. If the child does not attend, the assessment is not billable, so reschedule it for a time the child can be there, and document the no-show or cancellation with a Memo-to-Chart in Lauris. Once an assessment and provisional diagnosis are already on file, a later parent-only session can be billed as therapy under the child's provisional diagnosis. For more detailed information, go to </w:t>
+      <w:r>
+        <w:t>The child must be present for at least part of the session to bill an IDA or BPS. If the child does not attend, the assessment is not billable, so reschedule it for a time the child can b</w:t>
+      </w:r>
+      <w:r>
+        <w:t>e there, and document the no-show or cancellation with a Memo-to-Chart in Lauris. Once an assessment and provisional diagnosis are already on file, a later parent-only session can be billed as therapy under the child's provisional diagnosis. For more detai</w:t>
+      </w:r>
+      <w:r>
+        <w:t xml:space="preserve">led information, go to </w:t>
       </w:r>
       <w:hyperlink w:anchor="WhoCanBill">
         <w:r>
           <w:rPr>
             <w:rStyle w:val="Hyperlink"/>
           </w:rPr>
-          <w:t xml:space="preserve">Who Can Bill What</w:t>
+          <w:t>Who Can Bill What</w:t>
         </w:r>
       </w:hyperlink>
       <w:r>
-        <w:t xml:space="preserve">.</w:t>
-      </w:r>
-    </w:p>
-    <w:p>
-      <w:pPr/>
+        <w:t>.</w:t>
+      </w:r>
+    </w:p>
+    <w:p>
       <w:r>
         <w:rPr>
           <w:b/>
@@ -3480,31 +3560,33 @@
       </w:r>
     </w:p>
     <w:p>
-      <w:pPr/>
-      <w:r>
-        <w:t xml:space="preserve">Schedule a second session - parent only is fine, in office or via Zoom - ideally within the same week so you still meet the 5-business-day assessment window. Bill that follow-up as a therapy session (DAP note) under the child's provisional diagnosis. For more detailed information, go to </w:t>
+      <w:r>
+        <w:t>Schedule a second session - parent only is fine, in office or via Zoom - ideally within the same week so you</w:t>
+      </w:r>
+      <w:r>
+        <w:t xml:space="preserve"> still meet the 5-business-day assessment window. Bill that follow-up as a therapy session (DAP note) under the child's provisional diagnosis. For more detailed information, go to </w:t>
       </w:r>
       <w:hyperlink w:anchor="TimelineBilling">
         <w:r>
           <w:rPr>
             <w:rStyle w:val="Hyperlink"/>
           </w:rPr>
-          <w:t xml:space="preserve">Timeline for Billing</w:t>
+          <w:t>Timeline for Billing</w:t>
         </w:r>
       </w:hyperlink>
       <w:r>
-        <w:t xml:space="preserve">.</w:t>
+        <w:t>.</w:t>
       </w:r>
     </w:p>
     <w:p>
       <w:pPr>
         <w:pStyle w:val="Heading1"/>
       </w:pPr>
-      <w:bookmarkStart w:id="3" w:name="AssessmentsSec"/>
+      <w:bookmarkStart w:id="7" w:name="AssessmentsSec"/>
       <w:r>
         <w:t>6. Assessments</w:t>
       </w:r>
-      <w:bookmarkEnd w:id="3"/>
+      <w:bookmarkEnd w:id="7"/>
     </w:p>
     <w:p>
       <w:pPr>
@@ -3532,6 +3614,7 @@
         <w:pStyle w:val="ListBullet"/>
       </w:pPr>
       <w:r>
+        <w:lastRenderedPageBreak/>
         <w:t>Biopsychosocial Assessment - Child (BPS): children 6-18.</w:t>
       </w:r>
     </w:p>
@@ -3548,7 +3631,6 @@
         <w:pStyle w:val="Heading2"/>
       </w:pPr>
       <w:r>
-        <w:lastRenderedPageBreak/>
         <w:t xml:space="preserve">Special Considerations </w:t>
       </w:r>
       <w:r>
@@ -3694,7 +3776,7 @@
           <w:szCs w:val="26"/>
         </w:rPr>
       </w:pPr>
-      <w:bookmarkStart w:id="7" w:name="OutcomeMeasures"/>
+      <w:bookmarkStart w:id="8" w:name="OutcomeMeasures"/>
       <w:r>
         <w:rPr>
           <w:rFonts w:asciiTheme="majorHAnsi" w:eastAsiaTheme="majorEastAsia" w:hAnsiTheme="majorHAnsi" w:cstheme="majorBidi"/>
@@ -3706,7 +3788,7 @@
         </w:rPr>
         <w:t>Outcomes</w:t>
       </w:r>
-      <w:bookmarkEnd w:id="7"/>
+      <w:bookmarkEnd w:id="8"/>
     </w:p>
     <w:p>
       <w:pPr>
@@ -3789,7 +3871,7 @@
           <w:numId w:val="21"/>
         </w:numPr>
       </w:pPr>
-      <w:hyperlink r:id="rId12" w:history="1">
+      <w:hyperlink r:id="rId13" w:history="1">
         <w:r>
           <w:rPr>
             <w:rStyle w:val="Hyperlink"/>
@@ -3813,7 +3895,7 @@
       <w:pPr>
         <w:pStyle w:val="ListBullet"/>
       </w:pPr>
-      <w:hyperlink r:id="rId13">
+      <w:hyperlink r:id="rId14">
         <w:r>
           <w:rPr>
             <w:rStyle w:val="Hyperlink"/>
@@ -3827,7 +3909,7 @@
       <w:pPr>
         <w:pStyle w:val="ListBullet"/>
       </w:pPr>
-      <w:hyperlink r:id="rId14">
+      <w:hyperlink r:id="rId15">
         <w:r>
           <w:rPr>
             <w:rStyle w:val="Hyperlink"/>
@@ -3841,7 +3923,7 @@
       <w:pPr>
         <w:pStyle w:val="ListBullet"/>
       </w:pPr>
-      <w:hyperlink r:id="rId15">
+      <w:hyperlink r:id="rId16">
         <w:r>
           <w:rPr>
             <w:rStyle w:val="Hyperlink"/>
@@ -3856,7 +3938,6 @@
         <w:pStyle w:val="Heading2"/>
       </w:pPr>
       <w:r>
-        <w:lastRenderedPageBreak/>
         <w:t>Required Training on Prenatal Alcohol Screening</w:t>
       </w:r>
     </w:p>
@@ -3864,7 +3945,7 @@
       <w:r>
         <w:t xml:space="preserve">Watch: </w:t>
       </w:r>
-      <w:hyperlink r:id="rId16">
+      <w:hyperlink r:id="rId17">
         <w:r>
           <w:rPr>
             <w:rStyle w:val="Hyperlink"/>
@@ -4032,6 +4113,7 @@
         <w:pStyle w:val="ListBullet"/>
       </w:pPr>
       <w:r>
+        <w:lastRenderedPageBreak/>
         <w:t>Treatment Plan Reviews must include progress the client has made toward goals.</w:t>
       </w:r>
     </w:p>
@@ -4048,7 +4130,6 @@
         <w:pStyle w:val="ListBullet"/>
       </w:pPr>
       <w:r>
-        <w:lastRenderedPageBreak/>
         <w:t xml:space="preserve">Crisis / Safety Plans must be included. </w:t>
       </w:r>
     </w:p>
@@ -4241,7 +4322,7 @@
       <w:pPr>
         <w:pStyle w:val="ListBullet"/>
       </w:pPr>
-      <w:hyperlink r:id="rId17" w:history="1">
+      <w:hyperlink r:id="rId18" w:history="1">
         <w:r>
           <w:rPr>
             <w:rStyle w:val="Hyperlink"/>
@@ -4271,12 +4352,12 @@
       <w:pPr>
         <w:pStyle w:val="Heading1"/>
       </w:pPr>
-      <w:bookmarkStart w:id="11" w:name="ClosingCase"/>
+      <w:bookmarkStart w:id="9" w:name="ClosingCase"/>
       <w:r>
         <w:lastRenderedPageBreak/>
         <w:t>10. Closing a Case</w:t>
       </w:r>
-      <w:bookmarkEnd w:id="11"/>
+      <w:bookmarkEnd w:id="9"/>
     </w:p>
     <w:p>
       <w:pPr>
@@ -4388,11 +4469,11 @@
       <w:pPr>
         <w:pStyle w:val="Heading2"/>
       </w:pPr>
-      <w:bookmarkStart w:id="8" w:name="LaurisTransferForm"/>
+      <w:bookmarkStart w:id="10" w:name="LaurisTransferForm"/>
       <w:r>
         <w:t>Lauris: Closing a Case</w:t>
       </w:r>
-      <w:bookmarkEnd w:id="8"/>
+      <w:bookmarkEnd w:id="10"/>
     </w:p>
     <w:p>
       <w:pPr>
@@ -4470,7 +4551,7 @@
       <w:pPr>
         <w:pStyle w:val="Heading2"/>
       </w:pPr>
-      <w:bookmarkStart w:id="0" w:name="_Hlk228102086"/>
+      <w:bookmarkStart w:id="11" w:name="_Hlk228102086"/>
       <w:r>
         <w:t>Discharge Workflow</w:t>
       </w:r>
@@ -4499,7 +4580,7 @@
         <w:t>FASD MH Supervisor emails Durae Matthews to close/discharge the client in Lauris.</w:t>
       </w:r>
     </w:p>
-    <w:bookmarkEnd w:id="0"/>
+    <w:bookmarkEnd w:id="11"/>
     <w:p>
       <w:pPr>
         <w:pStyle w:val="Heading2"/>
@@ -4515,15 +4596,19 @@
       </w:r>
     </w:p>
     <w:p>
-      <w:pPr/>
-      <w:r>
-        <w:t xml:space="preserve">Beyond individual supervision, reflective supervision also takes place during the team meeting.</w:t>
-      </w:r>
-    </w:p>
-    <w:p>
-      <w:pPr/>
-      <w:r>
-        <w:t xml:space="preserve">Once you have completed FASCETS, you can also join the monthly FASCETS reflective group. It meets the third Friday of every month from 1:00 to 2:00 pm and is an opportunity to talk through cases or issues using a brain-based lens.</w:t>
+      <w:r>
+        <w:t>Beyond individ</w:t>
+      </w:r>
+      <w:r>
+        <w:t>ual supervision, reflective supervision also takes place during the team meeting.</w:t>
+      </w:r>
+    </w:p>
+    <w:p>
+      <w:r>
+        <w:t>Once you have completed FASCETS, you can also join the monthly FASCETS reflective group. It meets the third Friday of every month from 1:00 to 2:00 pm and is an opportunity t</w:t>
+      </w:r>
+      <w:r>
+        <w:t>o talk through cases or issues using a brain-based lens.</w:t>
       </w:r>
     </w:p>
     <w:p>
@@ -4672,6 +4757,7 @@
     </w:p>
     <w:p>
       <w:r>
+        <w:lastRenderedPageBreak/>
         <w:t>It protects the clinician. Good documentation is your main defense in:</w:t>
       </w:r>
     </w:p>
@@ -4696,7 +4782,6 @@
         <w:pStyle w:val="ListBullet"/>
       </w:pPr>
       <w:r>
-        <w:lastRenderedPageBreak/>
         <w:t>Liability concerns</w:t>
       </w:r>
     </w:p>
@@ -4806,16 +4891,18 @@
       <w:pPr>
         <w:pStyle w:val="Heading2"/>
       </w:pPr>
-      <w:bookmarkStart w:id="10" w:name="ClientTransfers"/>
-      <w:r>
-        <w:t xml:space="preserve">Client Transfers and Dual Enrollment</w:t>
-      </w:r>
-      <w:bookmarkEnd w:id="10"/>
-    </w:p>
-    <w:p>
-      <w:pPr/>
-      <w:r>
-        <w:t xml:space="preserve">Reassigning a client to a new therapist or school, moving a client to a different program, and the rule that a client can be open in only one program at a time are all handled through the Open/Close Transfer Request form in Lauris.</w:t>
+      <w:bookmarkStart w:id="12" w:name="ClientTransfers"/>
+      <w:r>
+        <w:t>Client Transfers and Dual Enrollment</w:t>
+      </w:r>
+      <w:bookmarkEnd w:id="12"/>
+    </w:p>
+    <w:p>
+      <w:r>
+        <w:t xml:space="preserve">Reassigning a client to a new therapist or </w:t>
+      </w:r>
+      <w:r>
+        <w:t>school, moving a client to a different program, and the rule that a client can be open in only one program at a time are all handled through the Open/Close Transfer Request form in Lauris.</w:t>
       </w:r>
     </w:p>
     <w:p>
@@ -4829,7 +4916,10 @@
         <w:t xml:space="preserve">Within the same program: </w:t>
       </w:r>
       <w:r>
-        <w:t xml:space="preserve">a client can be transferred to a new therapist and/or school.</w:t>
+        <w:t>a client can be transferred to a new thera</w:t>
+      </w:r>
+      <w:r>
+        <w:t>pist and/or school.</w:t>
       </w:r>
     </w:p>
     <w:p>
@@ -4840,10 +4930,14 @@
         <w:rPr>
           <w:b/>
         </w:rPr>
+        <w:lastRenderedPageBreak/>
         <w:t xml:space="preserve">Between programs (close and reopen): </w:t>
       </w:r>
       <w:r>
-        <w:t xml:space="preserve">a client cannot be enrolled in two mental health programs at the same time (for example, ECC and OPMH). To move a client to a different program, close them in the current program and inform Intake and Durae so they are opened in the new program (for example, SBMH to OPMH). This is a close-and-reopen, not a transfer. Exceptions to the one-program rule require supervisor approval, case by case.</w:t>
+        <w:t>a client cannot be enrolled in two mental health programs at the same time (for example, ECC and OPMH). To move a client to a different program, close them in the current program and inform Intake and Durae so they are opened in the new program (for exampl</w:t>
+      </w:r>
+      <w:r>
+        <w:t>e, SBMH to OPMH). This is a close-and-reopen, not a transfer. Exceptions to the one-program rule require supervisor approval, case by case.</w:t>
       </w:r>
     </w:p>
     <w:p>
@@ -4851,55 +4945,61 @@
         <w:pStyle w:val="Heading3"/>
       </w:pPr>
       <w:r>
-        <w:t xml:space="preserve">Completing the Open/Close Transfer Request form</w:t>
-      </w:r>
-    </w:p>
-    <w:p>
-      <w:pPr/>
-      <w:r>
-        <w:t xml:space="preserve">Use the Open/Close Transfer Request form in Lauris and complete it in full every time. Durae needs a fully completed form before she can process the request. A complete form must include:</w:t>
-      </w:r>
-    </w:p>
-    <w:p>
-      <w:pPr>
-        <w:pStyle w:val="ListBullet"/>
-      </w:pPr>
-      <w:r>
-        <w:t xml:space="preserve">The originating and receiving programs (for example, OPMH to SBMH).</w:t>
-      </w:r>
-    </w:p>
-    <w:p>
-      <w:pPr>
-        <w:pStyle w:val="ListBullet"/>
-      </w:pPr>
-      <w:r>
-        <w:t xml:space="preserve">Whether the case is being assigned to an intern.</w:t>
-      </w:r>
-    </w:p>
-    <w:p>
-      <w:pPr>
-        <w:pStyle w:val="ListBullet"/>
-      </w:pPr>
-      <w:r>
-        <w:t xml:space="preserve">Which payor will be used.</w:t>
-      </w:r>
-    </w:p>
-    <w:p>
-      <w:pPr>
-        <w:pStyle w:val="ListBullet"/>
-      </w:pPr>
-      <w:r>
-        <w:t xml:space="preserve">Any other identifying information the form requests.</w:t>
-      </w:r>
-    </w:p>
-    <w:p>
-      <w:pPr/>
-      <w:r>
-        <w:t xml:space="preserve">If the form is not completed in full, Durae will reject the request and the case will not be moved until all required information has been received. Do not assume Durae can infer missing details - she has asked that every field be filled out so she knows exactly who is who, when to use intern codes, and when to use billable units and the correct payor.</w:t>
-      </w:r>
-    </w:p>
-    <w:p>
-      <w:pPr/>
+        <w:t>Completing the Open/Close Transfer Request form</w:t>
+      </w:r>
+    </w:p>
+    <w:p>
+      <w:r>
+        <w:t>Use the Open/Close Transfer Request form in Lauris and complete it i</w:t>
+      </w:r>
+      <w:r>
+        <w:t>n full every time. Durae needs a fully completed form before she can process the request. A complete form must include:</w:t>
+      </w:r>
+    </w:p>
+    <w:p>
+      <w:pPr>
+        <w:pStyle w:val="ListBullet"/>
+      </w:pPr>
+      <w:r>
+        <w:t>The originating and receiving programs (for example, OPMH to SBMH).</w:t>
+      </w:r>
+    </w:p>
+    <w:p>
+      <w:pPr>
+        <w:pStyle w:val="ListBullet"/>
+      </w:pPr>
+      <w:r>
+        <w:t>Whether the case is being assigned to an intern.</w:t>
+      </w:r>
+    </w:p>
+    <w:p>
+      <w:pPr>
+        <w:pStyle w:val="ListBullet"/>
+      </w:pPr>
+      <w:r>
+        <w:t>Which payor will be</w:t>
+      </w:r>
+      <w:r>
+        <w:t xml:space="preserve"> used.</w:t>
+      </w:r>
+    </w:p>
+    <w:p>
+      <w:pPr>
+        <w:pStyle w:val="ListBullet"/>
+      </w:pPr>
+      <w:r>
+        <w:t>Any other identifying information the form requests.</w:t>
+      </w:r>
+    </w:p>
+    <w:p>
+      <w:r>
+        <w:t>If the form is not completed in full, Durae will reject the request and the case will not be moved until all required information has been received. Do not assume Durae can infer missing details -</w:t>
+      </w:r>
+      <w:r>
+        <w:t xml:space="preserve"> she has asked that every field be filled out so she knows exactly who is who, when to use intern codes, and when to use billable units and the correct payor.</w:t>
+      </w:r>
+    </w:p>
+    <w:p>
       <w:r>
         <w:t xml:space="preserve">For the step-by-step in Lauris, go to </w:t>
       </w:r>
@@ -4908,7 +5008,13 @@
           <w:rPr>
             <w:rStyle w:val="Hyperlink"/>
           </w:rPr>
-          <w:t xml:space="preserve">Lauris: Closing a Case</w:t>
+          <w:t xml:space="preserve">Lauris: Closing a </w:t>
+        </w:r>
+        <w:r>
+          <w:rPr>
+            <w:rStyle w:val="Hyperlink"/>
+          </w:rPr>
+          <w:t>Case</w:t>
         </w:r>
       </w:hyperlink>
       <w:r>
@@ -4916,9 +5022,11 @@
       </w:r>
     </w:p>
     <w:p>
-      <w:pPr/>
-      <w:r>
-        <w:t xml:space="preserve">Reference - original request from Durae (paraphrased from an email dated 3/30): she is asking that parts of the form be treated as required fields, because it is important she be told who is assigned to the case, when intern codes should be used, and when she needs to switch back to billable units / the client's payor. She stopped assuming some time ago and needs the form filled out with as much information as possible.</w:t>
+      <w:r>
+        <w:t xml:space="preserve">Reference - original request from Durae (paraphrased from an email dated 3/30): she is asking that parts of the form be treated as required fields, because it is important she be told who </w:t>
+      </w:r>
+      <w:r>
+        <w:t>is assigned to the case, when intern codes should be used, and when she needs to switch back to billable units / the client's payor. She stopped assuming some time ago and needs the form filled out with as much information as possible.</w:t>
       </w:r>
     </w:p>
     <w:p>
@@ -4926,13 +5034,15 @@
         <w:pStyle w:val="Heading1"/>
       </w:pPr>
       <w:r>
-        <w:t xml:space="preserve">Using Lauris and Lauris Reports</w:t>
-      </w:r>
-    </w:p>
-    <w:p>
-      <w:pPr/>
-      <w:r>
-        <w:t xml:space="preserve">Lauris is the electronic health record (EHR) where you manage your caseload - scheduling, session notes, forms, outcome measures, and billing all live here. All client files are kept electronically in Lauris; there are no hard files.</w:t>
+        <w:t>Using Lauris and Lau</w:t>
+      </w:r>
+      <w:r>
+        <w:t>ris Reports</w:t>
+      </w:r>
+    </w:p>
+    <w:p>
+      <w:r>
+        <w:t>Lauris is the electronic health record (EHR) where you manage your caseload - scheduling, session notes, forms, outcome measures, and billing all live here. All client files are kept electronically in Lauris; there are no hard files.</w:t>
       </w:r>
     </w:p>
     <w:p>
@@ -4940,7 +5050,10 @@
         <w:pStyle w:val="Heading2"/>
       </w:pPr>
       <w:r>
-        <w:t xml:space="preserve">Common Tasks in Lauris</w:t>
+        <w:t>Common Tas</w:t>
+      </w:r>
+      <w:r>
+        <w:t>ks in Lauris</w:t>
       </w:r>
     </w:p>
     <w:p>
@@ -4955,22 +5068,25 @@
           <w:rPr>
             <w:rStyle w:val="Hyperlink"/>
           </w:rPr>
-          <w:t xml:space="preserve">Lauris: Closing a Case</w:t>
+          <w:t>Lauris: Closing a Case</w:t>
         </w:r>
       </w:hyperlink>
       <w:r>
-        <w:t xml:space="preserve">; for the program-transfer and dual-enrollment rules, go to </w:t>
+        <w:t>; for th</w:t>
+      </w:r>
+      <w:r>
+        <w:t xml:space="preserve">e program-transfer and dual-enrollment rules, go to </w:t>
       </w:r>
       <w:hyperlink w:anchor="ClientTransfers">
         <w:r>
           <w:rPr>
             <w:rStyle w:val="Hyperlink"/>
           </w:rPr>
-          <w:t xml:space="preserve">Client Transfers and Dual Enrollment</w:t>
+          <w:t>Client Transfers and Dual Enrollment</w:t>
         </w:r>
       </w:hyperlink>
       <w:r>
-        <w:t xml:space="preserve">.</w:t>
+        <w:t>.</w:t>
       </w:r>
     </w:p>
     <w:p>
@@ -4985,19 +5101,25 @@
           <w:rPr>
             <w:rStyle w:val="Hyperlink"/>
           </w:rPr>
-          <w:t xml:space="preserve">Closing a Case</w:t>
+          <w:t>Closing</w:t>
+        </w:r>
+        <w:r>
+          <w:rPr>
+            <w:rStyle w:val="Hyperlink"/>
+          </w:rPr>
+          <w:t xml:space="preserve"> a Case</w:t>
         </w:r>
       </w:hyperlink>
       <w:r>
-        <w:t xml:space="preserve">.</w:t>
-      </w:r>
-    </w:p>
-    <w:p>
-      <w:pPr>
-        <w:pStyle w:val="ListBullet"/>
-      </w:pPr>
-      <w:r>
-        <w:t xml:space="preserve">DAP notes, CFARS, no-shows and cancellations (Memo-to-Chart), and uploading signed treatment plans are all done in Lauris, each within its required timeframe.</w:t>
+        <w:t>.</w:t>
+      </w:r>
+    </w:p>
+    <w:p>
+      <w:pPr>
+        <w:pStyle w:val="ListBullet"/>
+      </w:pPr>
+      <w:r>
+        <w:t>DAP notes, CFARS, no-shows and cancellations (Memo-to-Chart), and uploading signed treatment plans are all done in Lauris, each within its required timeframe.</w:t>
       </w:r>
     </w:p>
     <w:p>
@@ -5005,79 +5127,85 @@
         <w:pStyle w:val="Heading2"/>
       </w:pPr>
       <w:r>
-        <w:t xml:space="preserve">Lauris Reports</w:t>
-      </w:r>
-    </w:p>
-    <w:p>
-      <w:pPr/>
-      <w:r>
-        <w:t xml:space="preserve">Bob Toth sends clinicians monthly reports. These reports do not mean a clinician is in trouble; they are a way to track the things we need to stay on top of so the work we do gets reimbursed. Reports include:</w:t>
-      </w:r>
-    </w:p>
-    <w:p>
-      <w:pPr>
-        <w:pStyle w:val="ListBullet"/>
-      </w:pPr>
-      <w:r>
-        <w:t xml:space="preserve">Productivity.</w:t>
-      </w:r>
-    </w:p>
-    <w:p>
-      <w:pPr>
-        <w:pStyle w:val="ListBullet"/>
-      </w:pPr>
-      <w:r>
-        <w:t xml:space="preserve">Reminders to complete CFARS / annual consents, Assessments (BPS, IDA), and Treatment Plans.</w:t>
-      </w:r>
-    </w:p>
-    <w:p>
-      <w:pPr>
-        <w:pStyle w:val="ListBullet"/>
-      </w:pPr>
-      <w:r>
-        <w:t xml:space="preserve">Number of sessions.</w:t>
-      </w:r>
-    </w:p>
-    <w:p>
-      <w:pPr/>
-      <w:r>
-        <w:t xml:space="preserve">You can request these reports as often as you like. Because there can be a number of corrections, it helps to have them sent throughout the month so you can stay on top of them.</w:t>
-      </w:r>
-    </w:p>
-    <w:p>
-      <w:pPr/>
-      <w:r>
-        <w:t xml:space="preserve">For Mental Health Supervisors, there are additional reports. Common problems they catch:</w:t>
-      </w:r>
-    </w:p>
-    <w:p>
-      <w:pPr>
-        <w:pStyle w:val="ListBullet"/>
-      </w:pPr>
-      <w:r>
-        <w:t xml:space="preserve">Wrong service type - the service on the Lauris calendar does not match the form completed (for example, scheduled as FASD Case Management but the form is entered as FASD Consult).</w:t>
-      </w:r>
-    </w:p>
-    <w:p>
-      <w:pPr>
-        <w:pStyle w:val="ListBullet"/>
-      </w:pPr>
-      <w:r>
-        <w:t xml:space="preserve">Time overlaps - something is on the calendar and a different service is entered over the same time.</w:t>
-      </w:r>
-    </w:p>
-    <w:p>
-      <w:pPr>
-        <w:pStyle w:val="ListBullet"/>
-      </w:pPr>
-      <w:r>
-        <w:t xml:space="preserve">A completed service on the calendar where the form was never finished.</w:t>
-      </w:r>
-    </w:p>
-    <w:p>
-      <w:pPr/>
-      <w:r>
-        <w:t xml:space="preserve">A reminder also appears in Lauris the following year: another BPS or IDA cannot be conducted until one year from the original date of completion.</w:t>
+        <w:lastRenderedPageBreak/>
+        <w:t>Lauris Reports</w:t>
+      </w:r>
+    </w:p>
+    <w:p>
+      <w:r>
+        <w:t>Bob Toth sends clinicians monthly reports. These reports do not mean a clinician is in trouble; they are a way to track the things we need to stay on top of so the work we do gets reimbursed. Reports include:</w:t>
+      </w:r>
+    </w:p>
+    <w:p>
+      <w:pPr>
+        <w:pStyle w:val="ListBullet"/>
+      </w:pPr>
+      <w:r>
+        <w:t>Productivity.</w:t>
+      </w:r>
+    </w:p>
+    <w:p>
+      <w:pPr>
+        <w:pStyle w:val="ListBullet"/>
+      </w:pPr>
+      <w:r>
+        <w:t>Reminders to complete CFARS / ann</w:t>
+      </w:r>
+      <w:r>
+        <w:t>ual consents, Assessments (BPS, IDA), and Treatment Plans.</w:t>
+      </w:r>
+    </w:p>
+    <w:p>
+      <w:pPr>
+        <w:pStyle w:val="ListBullet"/>
+      </w:pPr>
+      <w:r>
+        <w:t>Number of sessions.</w:t>
+      </w:r>
+    </w:p>
+    <w:p>
+      <w:r>
+        <w:t>You can request these reports as often as you like. Because there can be a number of corrections, it helps to have them sent throughout the month so you can stay on top of them.</w:t>
+      </w:r>
+    </w:p>
+    <w:p>
+      <w:r>
+        <w:t>For Mental Health Supervisors, there are additional reports. Common problems they catch:</w:t>
+      </w:r>
+    </w:p>
+    <w:p>
+      <w:pPr>
+        <w:pStyle w:val="ListBullet"/>
+      </w:pPr>
+      <w:r>
+        <w:t>Wrong service type - the service on the Lauris calendar does not match the form completed (for example, scheduled as FASD Case Management but the form is entered as F</w:t>
+      </w:r>
+      <w:r>
+        <w:t>ASD Consult).</w:t>
+      </w:r>
+    </w:p>
+    <w:p>
+      <w:pPr>
+        <w:pStyle w:val="ListBullet"/>
+      </w:pPr>
+      <w:r>
+        <w:t>Time overlaps - something is on the calendar and a different service is entered over the same time.</w:t>
+      </w:r>
+    </w:p>
+    <w:p>
+      <w:pPr>
+        <w:pStyle w:val="ListBullet"/>
+      </w:pPr>
+      <w:r>
+        <w:t>A completed service on the calendar where the form was never finished.</w:t>
+      </w:r>
+    </w:p>
+    <w:p>
+      <w:r>
+        <w:t>A reminder also appears in Lauris the following year: another BPS or ID</w:t>
+      </w:r>
+      <w:r>
+        <w:t>A cannot be conducted until one year from the original date of completion.</w:t>
       </w:r>
     </w:p>
     <w:p>
@@ -5194,6 +5322,7 @@
       </w:r>
       <w:proofErr w:type="spellStart"/>
       <w:r>
+        <w:lastRenderedPageBreak/>
         <w:t>ProviderConnect</w:t>
       </w:r>
       <w:proofErr w:type="spellEnd"/>
@@ -5216,110 +5345,439 @@
     </w:p>
     <w:p>
       <w:r>
+        <w:t>Each month, registered interns will receive a log of their accrued therapy hours and supervision hours. The log is to be signed by the intern, the intern’s supervisor, and the qualified supervisor (if that person is within the agency). Only actual supervision time should be logged to the supervision service code in Lauris, and the appointment must be marked "complete" in Lauris in order for it to count.</w:t>
+      </w:r>
+    </w:p>
+    <w:p>
+      <w:r>
+        <w:t>What counts toward supervision for licensure:</w:t>
+      </w:r>
+    </w:p>
+    <w:p>
+      <w:pPr>
+        <w:pStyle w:val="ListBullet"/>
+      </w:pPr>
+      <w:r>
+        <w:t>Individual Supervision</w:t>
+      </w:r>
+    </w:p>
+    <w:p>
+      <w:pPr>
+        <w:pStyle w:val="ListBullet"/>
+      </w:pPr>
+      <w:r>
+        <w:t>Group Supervision</w:t>
+      </w:r>
+    </w:p>
+    <w:p>
+      <w:pPr>
+        <w:pStyle w:val="ListBullet"/>
+      </w:pPr>
+      <w:r>
+        <w:t>Reflective Supervision</w:t>
+      </w:r>
+    </w:p>
+    <w:p>
+      <w:pPr>
+        <w:pStyle w:val="ListBullet"/>
+      </w:pPr>
+      <w:r>
+        <w:t>Clinical meetings — only if your team meets in breakout rooms after the main portion and discusses clinical content (reviewing cases, reflecting on cases, etc.).</w:t>
+      </w:r>
+    </w:p>
+    <w:p>
+      <w:r>
+        <w:t>What does not count toward supervision for licensure:</w:t>
+      </w:r>
+    </w:p>
+    <w:p>
+      <w:pPr>
+        <w:pStyle w:val="ListBullet"/>
+      </w:pPr>
+      <w:r>
+        <w:t>Meetings with people who are not supervising you</w:t>
+      </w:r>
+    </w:p>
+    <w:p>
+      <w:pPr>
+        <w:pStyle w:val="ListBullet"/>
+      </w:pPr>
+      <w:r>
+        <w:t>Team parties</w:t>
+      </w:r>
+    </w:p>
+    <w:p>
+      <w:pPr>
+        <w:pStyle w:val="ListBullet"/>
+      </w:pPr>
+      <w:r>
+        <w:t>Trainings</w:t>
+      </w:r>
+    </w:p>
+    <w:p>
+      <w:pPr>
+        <w:pStyle w:val="ListBullet"/>
+      </w:pPr>
+      <w:r>
+        <w:t>Chart reviews</w:t>
+      </w:r>
+    </w:p>
+    <w:p>
+      <w:pPr>
+        <w:pStyle w:val="ListBullet"/>
+      </w:pPr>
+      <w:r>
+        <w:t>Book club</w:t>
+      </w:r>
+    </w:p>
+    <w:p>
+      <w:pPr>
+        <w:pStyle w:val="ListBullet"/>
+      </w:pPr>
+      <w:r>
+        <w:t>Other non-supervisory activities</w:t>
+      </w:r>
+    </w:p>
+    <w:p>
+      <w:r>
+        <w:t xml:space="preserve">Please keep this in mind when logging time in Lauris. </w:t>
+      </w:r>
+    </w:p>
+    <w:p>
+      <w:r>
+        <w:br w:type="page"/>
+      </w:r>
+    </w:p>
+    <w:p>
+      <w:pPr>
+        <w:pStyle w:val="Heading1"/>
+      </w:pPr>
+      <w:r>
         <w:lastRenderedPageBreak/>
-        <w:t>Each month, registered interns will receive a log of their accrued therapy hours and supervision hours. The log is to be signed by the intern, the intern’s supervisor, and the qualified supervisor (if that person is within the agency). Only actual supervision time should be logged to the supervision service code in Lauris, and the appointment must be marked "complete" in Lauris in order for it to count.</w:t>
-      </w:r>
-    </w:p>
-    <w:p>
-      <w:r>
-        <w:t>What counts toward supervision for licensure:</w:t>
-      </w:r>
-    </w:p>
-    <w:p>
-      <w:pPr>
-        <w:pStyle w:val="ListBullet"/>
-      </w:pPr>
-      <w:r>
-        <w:t>Individual Supervision</w:t>
-      </w:r>
-    </w:p>
-    <w:p>
-      <w:pPr>
-        <w:pStyle w:val="ListBullet"/>
-      </w:pPr>
-      <w:r>
-        <w:t>Group Supervision</w:t>
-      </w:r>
-    </w:p>
-    <w:p>
-      <w:pPr>
-        <w:pStyle w:val="ListBullet"/>
-      </w:pPr>
-      <w:r>
-        <w:t>Reflective Supervision</w:t>
-      </w:r>
-    </w:p>
-    <w:p>
-      <w:pPr>
-        <w:pStyle w:val="ListBullet"/>
-      </w:pPr>
-      <w:r>
-        <w:t>Clinical meetings — only if your team meets in breakout rooms after the main portion and discusses clinical content (reviewing cases, reflecting on cases, etc.).</w:t>
-      </w:r>
-    </w:p>
-    <w:p>
-      <w:r>
-        <w:t>What does not count toward supervision for licensure:</w:t>
-      </w:r>
-    </w:p>
-    <w:p>
-      <w:pPr>
-        <w:pStyle w:val="ListBullet"/>
-      </w:pPr>
-      <w:r>
-        <w:t>Meetings with people who are not supervising you</w:t>
-      </w:r>
-    </w:p>
-    <w:p>
-      <w:pPr>
-        <w:pStyle w:val="ListBullet"/>
-      </w:pPr>
-      <w:r>
-        <w:t>Team parties</w:t>
-      </w:r>
-    </w:p>
-    <w:p>
-      <w:pPr>
-        <w:pStyle w:val="ListBullet"/>
-      </w:pPr>
-      <w:r>
-        <w:t>Trainings</w:t>
-      </w:r>
-    </w:p>
-    <w:p>
-      <w:pPr>
-        <w:pStyle w:val="ListBullet"/>
-      </w:pPr>
-      <w:r>
-        <w:t>Chart reviews</w:t>
-      </w:r>
-    </w:p>
-    <w:p>
-      <w:pPr>
-        <w:pStyle w:val="ListBullet"/>
-      </w:pPr>
-      <w:r>
-        <w:t>Book club</w:t>
-      </w:r>
-    </w:p>
-    <w:p>
-      <w:pPr>
-        <w:pStyle w:val="ListBullet"/>
-      </w:pPr>
-      <w:r>
-        <w:t>Other non-supervisory activities</w:t>
-      </w:r>
-    </w:p>
-    <w:p>
-      <w:r>
-        <w:t xml:space="preserve">Please keep this in mind when logging time in Lauris. </w:t>
-      </w:r>
-      <w:bookmarkStart w:id="1" w:name="_GoBack"/>
-      <w:bookmarkEnd w:id="1"/>
-    </w:p>
-    <w:p>
-      <w:r>
-        <w:br w:type="page"/>
+        <w:t>For Mental Health Supervisors</w:t>
+      </w:r>
+    </w:p>
+    <w:p>
+      <w:r>
+        <w:t>This section covers the recurring responsibilities and resources specific to supervising the m</w:t>
+      </w:r>
+      <w:r>
+        <w:t>ental health teams.</w:t>
+      </w:r>
+    </w:p>
+    <w:p>
+      <w:pPr>
+        <w:pStyle w:val="Heading2"/>
+      </w:pPr>
+      <w:r>
+        <w:t>Expectations</w:t>
+      </w:r>
+    </w:p>
+    <w:p>
+      <w:r>
+        <w:t>A clinical supervisor provides guidance, support, and oversight to mental health clinicians to help ensure individuals and families receive quality care. Supervisors support staff development through coaching, case consulta</w:t>
+      </w:r>
+      <w:r>
+        <w:t>tion, and training, while helping ensure services are delivered ethically and in line with program standards.</w:t>
+      </w:r>
+    </w:p>
+    <w:p>
+      <w:pPr>
+        <w:pStyle w:val="Heading2"/>
+      </w:pPr>
+      <w:r>
+        <w:t>Leader Portal</w:t>
+      </w:r>
+    </w:p>
+    <w:p>
+      <w:r>
+        <w:t>The MH Leader Portal gives an overview of the mental health teams and their contact information, along with information on chart rev</w:t>
+      </w:r>
+      <w:r>
+        <w:t xml:space="preserve">iews and hiring. </w:t>
+      </w:r>
+      <w:hyperlink r:id="rId19">
+        <w:r>
+          <w:rPr>
+            <w:rStyle w:val="Hyperlink"/>
+          </w:rPr>
+          <w:t>Open the MH Leader Portal</w:t>
+        </w:r>
+      </w:hyperlink>
+      <w:r>
+        <w:t>.</w:t>
+      </w:r>
+    </w:p>
+    <w:p>
+      <w:pPr>
+        <w:pStyle w:val="Heading2"/>
+      </w:pPr>
+      <w:r>
+        <w:t>Monthly Updates</w:t>
+      </w:r>
+    </w:p>
+    <w:p>
+      <w:pPr>
+        <w:pStyle w:val="ListBullet"/>
+      </w:pPr>
+      <w:r>
+        <w:t>Update the calendar at least monthly (a reminder pops up each month).</w:t>
+      </w:r>
+    </w:p>
+    <w:p>
+      <w:pPr>
+        <w:pStyle w:val="ListBullet"/>
+      </w:pPr>
+      <w:r>
+        <w:t>Update the</w:t>
+      </w:r>
+      <w:r>
+        <w:t xml:space="preserve"> all-staff roster - include interns, MH clinicians, all supervisors, and parent advocates. (Intake does not need to be included.)</w:t>
+      </w:r>
+    </w:p>
+    <w:p>
+      <w:pPr>
+        <w:pStyle w:val="Heading2"/>
+      </w:pPr>
+      <w:r>
+        <w:t>Qualified Supervisors (QS)</w:t>
+      </w:r>
+    </w:p>
+    <w:p>
+      <w:pPr>
+        <w:pStyle w:val="ListBullet"/>
+      </w:pPr>
+      <w:r>
+        <w:t>If you are the qualified supervisor (QS) for a clinician, you must be the same profession and degre</w:t>
+      </w:r>
+      <w:r>
+        <w:t xml:space="preserve">e. Lauris tracks the hours, and your name needs to be on the QS list. </w:t>
+      </w:r>
+      <w:hyperlink r:id="rId20">
+        <w:r>
+          <w:rPr>
+            <w:rStyle w:val="Hyperlink"/>
+          </w:rPr>
+          <w:t>QS list (Google Drive)</w:t>
+        </w:r>
+      </w:hyperlink>
+      <w:r>
+        <w:t>.</w:t>
+      </w:r>
+    </w:p>
+    <w:p>
+      <w:pPr>
+        <w:pStyle w:val="Heading2"/>
+      </w:pPr>
+      <w:r>
+        <w:t>Supervisor Meetings</w:t>
+      </w:r>
+    </w:p>
+    <w:p>
+      <w:pPr>
+        <w:pStyle w:val="ListBullet"/>
+      </w:pPr>
+      <w:r>
+        <w:t xml:space="preserve">Supervisor meetings are held once a month, on the </w:t>
+      </w:r>
+      <w:r>
+        <w:t>third Friday at 12:00 pm.</w:t>
+      </w:r>
+    </w:p>
+    <w:p>
+      <w:pPr>
+        <w:pStyle w:val="Heading2"/>
+      </w:pPr>
+      <w:r>
+        <w:t>Interns</w:t>
+      </w:r>
+    </w:p>
+    <w:p>
+      <w:r>
+        <w:t>Because intern work is non-billable, the ideal cases to assign interns are ones where insurance is not effectively paying. Good fits include:</w:t>
+      </w:r>
+    </w:p>
+    <w:p>
+      <w:pPr>
+        <w:pStyle w:val="ListBullet"/>
+      </w:pPr>
+      <w:r>
+        <w:t>High-copay cases.</w:t>
+      </w:r>
+    </w:p>
+    <w:p>
+      <w:pPr>
+        <w:pStyle w:val="ListBullet"/>
+      </w:pPr>
+      <w:r>
+        <w:t>High-deductible cases.</w:t>
+      </w:r>
+    </w:p>
+    <w:p>
+      <w:pPr>
+        <w:pStyle w:val="ListBullet"/>
+      </w:pPr>
+      <w:r>
+        <w:t>Clients with no insurance.</w:t>
+      </w:r>
+    </w:p>
+    <w:p>
+      <w:pPr>
+        <w:pStyle w:val="ListBullet"/>
+      </w:pPr>
+      <w:r>
+        <w:t>Virtual grou</w:t>
+      </w:r>
+      <w:r>
+        <w:t>ps.</w:t>
+      </w:r>
+    </w:p>
+    <w:p>
+      <w:r>
+        <w:t xml:space="preserve">For the intern service codes and payor, go to </w:t>
+      </w:r>
+      <w:hyperlink w:anchor="InternCodes">
+        <w:r>
+          <w:rPr>
+            <w:rStyle w:val="Hyperlink"/>
+          </w:rPr>
+          <w:t>Intern Service Codes</w:t>
+        </w:r>
+      </w:hyperlink>
+      <w:r>
+        <w:t>.</w:t>
+      </w:r>
+    </w:p>
+    <w:p>
+      <w:pPr>
+        <w:pStyle w:val="Heading2"/>
+      </w:pPr>
+      <w:r>
+        <w:t>Quarterly Supervisor Review</w:t>
+      </w:r>
+    </w:p>
+    <w:p>
+      <w:r>
+        <w:t xml:space="preserve">Bob sends a report each quarter. Every active client must be reviewed by the supervisor at least once per quarter. Supervisors should enter notes for any guidance they give a supervisee verbally, as </w:t>
+      </w:r>
+      <w:r>
+        <w:lastRenderedPageBreak/>
+        <w:t>documentation that the conversation occurred - for exampl</w:t>
+      </w:r>
+      <w:r>
+        <w:t>e: "Discussed client's self-injurious statements and advised the therapist to complete a safety plan with the child and caregivers."</w:t>
+      </w:r>
+    </w:p>
+    <w:p>
+      <w:pPr>
+        <w:pStyle w:val="Heading2"/>
+      </w:pPr>
+      <w:r>
+        <w:t>MH Audits</w:t>
+      </w:r>
+    </w:p>
+    <w:p>
+      <w:r>
+        <w:t>The MH department conducts audits quarterly. Each program is assigned to a quarter, and supervisors facilitate th</w:t>
+      </w:r>
+      <w:r>
+        <w:t>e audit with their staff once per year. Example schedule:</w:t>
+      </w:r>
+    </w:p>
+    <w:p>
+      <w:pPr>
+        <w:pStyle w:val="ListBullet"/>
+      </w:pPr>
+      <w:r>
+        <w:t>Q1 - OPMH / ECMHC Sarasota</w:t>
+      </w:r>
+    </w:p>
+    <w:p>
+      <w:pPr>
+        <w:pStyle w:val="ListBullet"/>
+      </w:pPr>
+      <w:r>
+        <w:t>Q2 - OPMH / ECMHC North Port</w:t>
+      </w:r>
+    </w:p>
+    <w:p>
+      <w:pPr>
+        <w:pStyle w:val="ListBullet"/>
+      </w:pPr>
+      <w:r>
+        <w:t>Q3 - SBMH</w:t>
+      </w:r>
+    </w:p>
+    <w:p>
+      <w:pPr>
+        <w:pStyle w:val="ListBullet"/>
+      </w:pPr>
+      <w:r>
+        <w:t>Q4 - FASD / ECC</w:t>
+      </w:r>
+    </w:p>
+    <w:p>
+      <w:pPr>
+        <w:pStyle w:val="Heading2"/>
+      </w:pPr>
+      <w:r>
+        <w:t>Compliance Monitoring</w:t>
+      </w:r>
+    </w:p>
+    <w:p>
+      <w:r>
+        <w:t xml:space="preserve">Track team compliance using the MH compliance monitoring spreadsheet. </w:t>
+      </w:r>
+      <w:hyperlink r:id="rId21" w:anchor="gid=53724778">
+        <w:r>
+          <w:rPr>
+            <w:rStyle w:val="Hyperlink"/>
+          </w:rPr>
+          <w:t>Open the Compliance Monitoring spreadsheet</w:t>
+        </w:r>
+      </w:hyperlink>
+      <w:r>
+        <w:t>.</w:t>
+      </w:r>
+    </w:p>
+    <w:p>
+      <w:pPr>
+        <w:pStyle w:val="Heading2"/>
+      </w:pPr>
+      <w:r>
+        <w:t>Transferring Cases</w:t>
+      </w:r>
+    </w:p>
+    <w:p>
+      <w:r>
+        <w:t xml:space="preserve">For how to transfer a case or move a client between programs, go to </w:t>
+      </w:r>
+      <w:hyperlink w:anchor="ClientTransfers">
+        <w:r>
+          <w:rPr>
+            <w:rStyle w:val="Hyperlink"/>
+          </w:rPr>
+          <w:t>Client Transfers and Dual Enrollment</w:t>
+        </w:r>
+      </w:hyperlink>
+      <w:r>
+        <w:t>.</w:t>
+      </w:r>
+    </w:p>
+    <w:p>
+      <w:pPr>
+        <w:pStyle w:val="Heading2"/>
+      </w:pPr>
+      <w:r>
+        <w:t>Collaboration with Other Programs</w:t>
+      </w:r>
+    </w:p>
+    <w:p>
+      <w:r>
+        <w:t>Supervisors are expected to collaborate with other programs. Collaborating across programs is essential because individuals and families often have needs that cannot b</w:t>
+      </w:r>
+      <w:r>
+        <w:t>e fully addressed by a single service. It also helps supervisees understand the value of working together to provide coordinated, comprehensive support and achieve the best outcomes.</w:t>
       </w:r>
     </w:p>
     <w:p>
@@ -5327,7 +5785,6 @@
         <w:pStyle w:val="Heading1"/>
       </w:pPr>
       <w:r>
-        <w:lastRenderedPageBreak/>
         <w:t>Appendix A. Onboarding Training Handout Links</w:t>
       </w:r>
     </w:p>
@@ -5418,6 +5875,7 @@
     </w:p>
     <w:p>
       <w:r>
+        <w:lastRenderedPageBreak/>
         <w:t>50-item self-rating across all six stages. Complete BEFORE training begins.</w:t>
       </w:r>
     </w:p>
@@ -5604,7 +6062,6 @@
         <w:pStyle w:val="Heading1"/>
       </w:pPr>
       <w:r>
-        <w:lastRenderedPageBreak/>
         <w:t>Appendix B. Additional Resources, Training Recordings, and Example Documents</w:t>
       </w:r>
     </w:p>
@@ -5620,7 +6077,7 @@
       <w:pPr>
         <w:pStyle w:val="ListBullet"/>
       </w:pPr>
-      <w:hyperlink r:id="rId18">
+      <w:hyperlink r:id="rId22">
         <w:r>
           <w:rPr>
             <w:rStyle w:val="Hyperlink"/>
@@ -5642,7 +6099,7 @@
       <w:pPr>
         <w:pStyle w:val="ListBullet"/>
       </w:pPr>
-      <w:hyperlink r:id="rId19">
+      <w:hyperlink r:id="rId23">
         <w:r>
           <w:rPr>
             <w:rStyle w:val="Hyperlink"/>
@@ -5656,7 +6113,7 @@
       <w:pPr>
         <w:pStyle w:val="ListBullet"/>
       </w:pPr>
-      <w:hyperlink r:id="rId20">
+      <w:hyperlink r:id="rId24">
         <w:r>
           <w:rPr>
             <w:rStyle w:val="Hyperlink"/>
@@ -5670,7 +6127,7 @@
       <w:pPr>
         <w:pStyle w:val="ListBullet"/>
       </w:pPr>
-      <w:hyperlink r:id="rId21">
+      <w:hyperlink r:id="rId25">
         <w:r>
           <w:rPr>
             <w:rStyle w:val="Hyperlink"/>
@@ -5685,6 +6142,7 @@
         <w:pStyle w:val="Heading2"/>
       </w:pPr>
       <w:r>
+        <w:lastRenderedPageBreak/>
         <w:t>Example Clinical Documents</w:t>
       </w:r>
     </w:p>
@@ -5692,7 +6150,7 @@
       <w:pPr>
         <w:pStyle w:val="ListBullet"/>
       </w:pPr>
-      <w:hyperlink r:id="rId22">
+      <w:hyperlink r:id="rId26">
         <w:r>
           <w:rPr>
             <w:rStyle w:val="Hyperlink"/>
@@ -5706,7 +6164,7 @@
       <w:pPr>
         <w:pStyle w:val="ListBullet"/>
       </w:pPr>
-      <w:hyperlink r:id="rId23">
+      <w:hyperlink r:id="rId27">
         <w:r>
           <w:rPr>
             <w:rStyle w:val="Hyperlink"/>
@@ -5728,7 +6186,7 @@
       <w:pPr>
         <w:pStyle w:val="ListBullet"/>
       </w:pPr>
-      <w:hyperlink r:id="rId24" w:history="1">
+      <w:hyperlink r:id="rId28" w:history="1">
         <w:r>
           <w:rPr>
             <w:rStyle w:val="Hyperlink"/>
@@ -5747,7 +6205,7 @@
       </w:r>
     </w:p>
     <w:p>
-      <w:hyperlink r:id="rId25">
+      <w:hyperlink r:id="rId29">
         <w:r>
           <w:rPr>
             <w:rStyle w:val="Hyperlink"/>
@@ -5764,7 +6222,7 @@
       </w:r>
     </w:p>
     <w:p>
-      <w:hyperlink r:id="rId26">
+      <w:hyperlink r:id="rId30">
         <w:r>
           <w:rPr>
             <w:rStyle w:val="Hyperlink"/>
@@ -5792,7 +6250,7 @@
       <w:pPr>
         <w:pStyle w:val="ListBullet"/>
       </w:pPr>
-      <w:hyperlink r:id="rId27">
+      <w:hyperlink r:id="rId31">
         <w:r>
           <w:rPr>
             <w:rStyle w:val="Hyperlink"/>
@@ -5832,7 +6290,7 @@
       <w:r>
         <w:t xml:space="preserve">Durae Matthews, Authorization Specialist: </w:t>
       </w:r>
-      <w:hyperlink r:id="rId28" w:history="1">
+      <w:hyperlink r:id="rId32" w:history="1">
         <w:r>
           <w:rPr>
             <w:rStyle w:val="Hyperlink"/>
@@ -19437,7 +19895,7 @@
 </file>
 
 <file path=customXml/itemProps1.xml><?xml version="1.0" encoding="utf-8"?>
-<ds:datastoreItem xmlns:ds="http://schemas.openxmlformats.org/officeDocument/2006/customXml" ds:itemID="{E9934173-0730-4E61-BD63-468853C2BBDD}">
+<ds:datastoreItem xmlns:ds="http://schemas.openxmlformats.org/officeDocument/2006/customXml" ds:itemID="{923573DE-CBB3-4E63-936D-1712194BE6FC}">
   <ds:schemaRefs>
     <ds:schemaRef ds:uri="http://schemas.openxmlformats.org/officeDocument/2006/bibliography"/>
   </ds:schemaRefs>

</xml_diff>

<commit_message>
Rebuild manual structure: remove planning notes, clean numbering, new TOC
- Delete the entire "@Claude" reorganization planning block
- Style "1. Welcome..." as a real heading; delete duplicate File Keeping
  heading (now covered by the Using Lauris intro)
- Promote sections that were wrongly nested under Closing a Case to their
  own top-level sections (Supervision, Medical Providers, Documentation,
  Productivity, Client Transfers, CAQH, Interns logging)
- Renumber to clean sequential sections 1-23 with N.M subsections;
  Appendices A-D
- Rebuild the Table of Contents as a 2-level indented list matching the
  body; body now starts on a fresh page after the TOC

Co-Authored-By: Claude Opus 4.8 (1M context) <noreply@anthropic.com>
</commit_message>
<xml_diff>
--- a/FASD_Mental_Health_Onboarding_Manual.docx
+++ b/FASD_Mental_Health_Onboarding_Manual.docx
@@ -98,761 +98,661 @@
       </w:r>
     </w:p>
     <w:p>
-      <w:pPr>
-        <w:ind w:left="360"/>
-      </w:pPr>
-      <w:r>
+      <w:pPr/>
+      <w:r>
+        <w:rPr>
+          <w:b/>
+        </w:rPr>
         <w:t>1. Welcome and About the Practice</w:t>
       </w:r>
     </w:p>
     <w:p>
-      <w:pPr>
-        <w:ind w:left="360"/>
-      </w:pPr>
-      <w:r>
+      <w:pPr/>
+      <w:r>
+        <w:rPr>
+          <w:b/>
+        </w:rPr>
         <w:t>2. FASD Families May Need More</w:t>
       </w:r>
     </w:p>
     <w:p>
-      <w:pPr>
-        <w:ind w:left="360"/>
-      </w:pPr>
-      <w:r>
+      <w:pPr/>
+      <w:r>
+        <w:rPr>
+          <w:b/>
+        </w:rPr>
         <w:t>3. Billing</w:t>
       </w:r>
     </w:p>
     <w:p>
       <w:pPr>
-        <w:ind w:left="360"/>
-      </w:pPr>
-      <w:r>
-        <w:t>4. Confidentiality and Informed Consent</w:t>
-      </w:r>
-    </w:p>
-    <w:p>
-      <w:pPr>
-        <w:ind w:left="360"/>
-      </w:pPr>
-      <w:r>
-        <w:t>5. The First Session</w:t>
-      </w:r>
-    </w:p>
-    <w:p>
-      <w:pPr>
-        <w:ind w:left="360"/>
-      </w:pPr>
-      <w:r>
-        <w:t>6. Assessments</w:t>
-      </w:r>
-    </w:p>
-    <w:p>
-      <w:pPr>
-        <w:ind w:left="360"/>
-      </w:pPr>
-      <w:r>
-        <w:t>7. Treatment Plans (with Billing Change Callouts)</w:t>
-      </w:r>
-    </w:p>
-    <w:p>
-      <w:pPr>
-        <w:ind w:left="360"/>
-      </w:pPr>
-      <w:r>
-        <w:t>8. DAP Notes (Progress Notes)</w:t>
-      </w:r>
-    </w:p>
-    <w:p>
-      <w:pPr>
-        <w:ind w:left="360"/>
-      </w:pPr>
-      <w:r>
-        <w:t>9. Outcomes</w:t>
-      </w:r>
-    </w:p>
-    <w:p>
-      <w:pPr>
-        <w:ind w:left="360"/>
-      </w:pPr>
-      <w:r>
-        <w:t>10. Closing a Case</w:t>
-      </w:r>
-    </w:p>
-    <w:p>
-      <w:pPr>
-        <w:ind w:left="360"/>
-      </w:pPr>
-      <w:r>
-        <w:t>11. Procedures Summary for Interns and New Hires</w:t>
-      </w:r>
-    </w:p>
-    <w:p>
-      <w:pPr>
-        <w:ind w:left="360"/>
-      </w:pPr>
-      <w:r>
-        <w:t>12. Notes from Melissa’s PowerPoint Training Slides</w:t>
-      </w:r>
-    </w:p>
-    <w:p>
-      <w:pPr>
-        <w:ind w:left="360"/>
-      </w:pPr>
-      <w:r>
-        <w:t>13. Additional Procedures and Requirements</w:t>
-      </w:r>
-    </w:p>
-    <w:p>
-      <w:pPr>
-        <w:ind w:left="360"/>
-      </w:pPr>
-      <w:r>
-        <w:t>13.1 Case Transfers and the Transfer Form</w:t>
-      </w:r>
-    </w:p>
-    <w:p>
-      <w:pPr>
-        <w:ind w:left="360"/>
-      </w:pPr>
-      <w:r>
-        <w:t>13.2 Licensed Therapists: CAQH Attestation</w:t>
-      </w:r>
-    </w:p>
-    <w:p>
-      <w:pPr>
-        <w:ind w:left="360"/>
-      </w:pPr>
-      <w:r>
-        <w:t>13.3 Billing for FASD — Payor Usage</w:t>
-      </w:r>
-    </w:p>
-    <w:p>
-      <w:pPr>
-        <w:ind w:left="360"/>
-      </w:pPr>
-      <w:r>
-        <w:t>13.4 Registered Interns: Logging Supervision Hours for Licensure</w:t>
-      </w:r>
-    </w:p>
-    <w:p>
-      <w:pPr>
-        <w:ind w:left="360"/>
-      </w:pPr>
-      <w:r>
-        <w:t>14. How Conflicts in This Manual Are Flagged</w:t>
-      </w:r>
-    </w:p>
-    <w:p>
-      <w:pPr>
-        <w:ind w:left="360"/>
-      </w:pPr>
-      <w:r>
+        <w:ind w:left="504"/>
+      </w:pPr>
+      <w:r>
+        <w:t>3.1 The Billing Absolutes — No Ifs, Ands, or Buts</w:t>
+      </w:r>
+    </w:p>
+    <w:p>
+      <w:pPr>
+        <w:ind w:left="504"/>
+      </w:pPr>
+      <w:r>
+        <w:t>3.2 Service Codes</w:t>
+      </w:r>
+    </w:p>
+    <w:p>
+      <w:pPr>
+        <w:ind w:left="504"/>
+      </w:pPr>
+      <w:r>
+        <w:t>3.3 Intern Service Codes</w:t>
+      </w:r>
+    </w:p>
+    <w:p>
+      <w:pPr>
+        <w:ind w:left="504"/>
+      </w:pPr>
+      <w:r>
+        <w:t>3.4 Z Codes</w:t>
+      </w:r>
+    </w:p>
+    <w:p>
+      <w:pPr>
+        <w:ind w:left="504"/>
+      </w:pPr>
+      <w:r>
+        <w:t>3.5 Optimizing Billing</w:t>
+      </w:r>
+    </w:p>
+    <w:p>
+      <w:pPr>
+        <w:ind w:left="504"/>
+      </w:pPr>
+      <w:r>
+        <w:t>3.6 Who Can Bill What</w:t>
+      </w:r>
+    </w:p>
+    <w:p>
+      <w:pPr>
+        <w:ind w:left="504"/>
+      </w:pPr>
+      <w:r>
+        <w:t>3.7 Timeline for Billing</w:t>
+      </w:r>
+    </w:p>
+    <w:p>
+      <w:pPr>
+        <w:ind w:left="504"/>
+      </w:pPr>
+      <w:r>
+        <w:t>3.8 Sarasota County Funds</w:t>
+      </w:r>
+    </w:p>
+    <w:p>
+      <w:pPr>
+        <w:ind w:left="504"/>
+      </w:pPr>
+      <w:r>
+        <w:t>3.9 Insurance Requirements</w:t>
+      </w:r>
+    </w:p>
+    <w:p>
+      <w:pPr>
+        <w:ind w:left="504"/>
+      </w:pPr>
+      <w:r>
+        <w:t>3.10 Groups</w:t>
+      </w:r>
+    </w:p>
+    <w:p>
+      <w:pPr/>
+      <w:r>
+        <w:rPr>
+          <w:b/>
+        </w:rPr>
+        <w:t>4. FASD Catchment Area</w:t>
+      </w:r>
+    </w:p>
+    <w:p>
+      <w:pPr/>
+      <w:r>
+        <w:rPr>
+          <w:b/>
+        </w:rPr>
+        <w:t>5. Choosing the Billing Client: Child vs. Adult</w:t>
+      </w:r>
+    </w:p>
+    <w:p>
+      <w:pPr/>
+      <w:r>
+        <w:rPr>
+          <w:b/>
+        </w:rPr>
+        <w:t>6. Referral to Mental Health</w:t>
+      </w:r>
+    </w:p>
+    <w:p>
+      <w:pPr/>
+      <w:r>
+        <w:rPr>
+          <w:b/>
+        </w:rPr>
+        <w:t>7. Intake</w:t>
+      </w:r>
+    </w:p>
+    <w:p>
+      <w:pPr>
+        <w:ind w:left="504"/>
+      </w:pPr>
+      <w:r>
+        <w:t>7.1 What Intake Does Before Reaching the Therapist</w:t>
+      </w:r>
+    </w:p>
+    <w:p>
+      <w:pPr>
+        <w:ind w:left="504"/>
+      </w:pPr>
+      <w:r>
+        <w:t>7.2 Insurance Verification</w:t>
+      </w:r>
+    </w:p>
+    <w:p>
+      <w:pPr>
+        <w:ind w:left="504"/>
+      </w:pPr>
+      <w:r>
+        <w:t>7.3 Unit Availability, Updates, and Service Limits</w:t>
+      </w:r>
+    </w:p>
+    <w:p>
+      <w:pPr/>
+      <w:r>
+        <w:rPr>
+          <w:b/>
+        </w:rPr>
+        <w:t>8. Confidentiality and Informed Consent</w:t>
+      </w:r>
+    </w:p>
+    <w:p>
+      <w:pPr>
+        <w:ind w:left="504"/>
+      </w:pPr>
+      <w:r>
+        <w:t>8.1 Informed Consent: What It Means</w:t>
+      </w:r>
+    </w:p>
+    <w:p>
+      <w:pPr>
+        <w:ind w:left="504"/>
+      </w:pPr>
+      <w:r>
+        <w:t>8.2 Consent Forms</w:t>
+      </w:r>
+    </w:p>
+    <w:p>
+      <w:pPr>
+        <w:ind w:left="504"/>
+      </w:pPr>
+      <w:r>
+        <w:t>8.3 Who You Are as Their Therapist</w:t>
+      </w:r>
+    </w:p>
+    <w:p>
+      <w:pPr>
+        <w:ind w:left="504"/>
+      </w:pPr>
+      <w:r>
+        <w:t>8.4 Limits to Confidentiality: How to Explain Them to Families</w:t>
+      </w:r>
+    </w:p>
+    <w:p>
+      <w:pPr>
+        <w:ind w:left="504"/>
+      </w:pPr>
+      <w:r>
+        <w:t>8.5 Parent / Child Confidentiality</w:t>
+      </w:r>
+    </w:p>
+    <w:p>
+      <w:pPr>
+        <w:ind w:left="504"/>
+      </w:pPr>
+      <w:r>
+        <w:t>8.6 Complaints About Therapy</w:t>
+      </w:r>
+    </w:p>
+    <w:p>
+      <w:pPr/>
+      <w:r>
+        <w:rPr>
+          <w:b/>
+        </w:rPr>
+        <w:t>9. Before the First Session</w:t>
+      </w:r>
+    </w:p>
+    <w:p>
+      <w:pPr/>
+      <w:r>
+        <w:rPr>
+          <w:b/>
+        </w:rPr>
+        <w:t>10. The First Session</w:t>
+      </w:r>
+    </w:p>
+    <w:p>
+      <w:pPr>
+        <w:ind w:left="504"/>
+      </w:pPr>
+      <w:r>
+        <w:t>10.1 How the First Session Runs</w:t>
+      </w:r>
+    </w:p>
+    <w:p>
+      <w:pPr>
+        <w:ind w:left="504"/>
+      </w:pPr>
+      <w:r>
+        <w:t>10.2 Topics to Cover in the First Session</w:t>
+      </w:r>
+    </w:p>
+    <w:p>
+      <w:pPr>
+        <w:ind w:left="504"/>
+      </w:pPr>
+      <w:r>
+        <w:t>10.3 Frequently Asked Questions</w:t>
+      </w:r>
+    </w:p>
+    <w:p>
+      <w:pPr/>
+      <w:r>
+        <w:rPr>
+          <w:b/>
+        </w:rPr>
+        <w:t>11. Assessments</w:t>
+      </w:r>
+    </w:p>
+    <w:p>
+      <w:pPr>
+        <w:ind w:left="504"/>
+      </w:pPr>
+      <w:r>
+        <w:t>11.1 What Assessments Are and Which to Use</w:t>
+      </w:r>
+    </w:p>
+    <w:p>
+      <w:pPr>
+        <w:ind w:left="504"/>
+      </w:pPr>
+      <w:r>
+        <w:t>11.2 Special Considerations with FASD Evaluations</w:t>
+      </w:r>
+    </w:p>
+    <w:p>
+      <w:pPr>
+        <w:ind w:left="504"/>
+      </w:pPr>
+      <w:r>
+        <w:t>11.3 Required Elements at Assessment</w:t>
+      </w:r>
+    </w:p>
+    <w:p>
+      <w:pPr>
+        <w:ind w:left="504"/>
+      </w:pPr>
+      <w:r>
+        <w:t>11.4 Blank Forms and Example Materials</w:t>
+      </w:r>
+    </w:p>
+    <w:p>
+      <w:pPr>
+        <w:ind w:left="504"/>
+      </w:pPr>
+      <w:r>
+        <w:t>11.5 Required Training on Prenatal Alcohol Screening</w:t>
+      </w:r>
+    </w:p>
+    <w:p>
+      <w:pPr/>
+      <w:r>
+        <w:rPr>
+          <w:b/>
+        </w:rPr>
+        <w:t>12. Treatment Plans</w:t>
+      </w:r>
+    </w:p>
+    <w:p>
+      <w:pPr>
+        <w:ind w:left="504"/>
+      </w:pPr>
+      <w:r>
+        <w:t>12.1 Overview and Compliance</w:t>
+      </w:r>
+    </w:p>
+    <w:p>
+      <w:pPr>
+        <w:ind w:left="504"/>
+      </w:pPr>
+      <w:r>
+        <w:t>12.2 What the Treatment Plan Session Looks Like</w:t>
+      </w:r>
+    </w:p>
+    <w:p>
+      <w:pPr>
+        <w:ind w:left="504"/>
+      </w:pPr>
+      <w:r>
+        <w:t>12.3 Required Content and Signatures</w:t>
+      </w:r>
+    </w:p>
+    <w:p>
+      <w:pPr>
+        <w:ind w:left="504"/>
+      </w:pPr>
+      <w:r>
+        <w:t>12.4 Getting the Treatment Plan Signed via FOXIT</w:t>
+      </w:r>
+    </w:p>
+    <w:p>
+      <w:pPr/>
+      <w:r>
+        <w:rPr>
+          <w:b/>
+        </w:rPr>
+        <w:t>13. DAP Notes (Progress Notes)</w:t>
+      </w:r>
+    </w:p>
+    <w:p>
+      <w:pPr>
+        <w:ind w:left="504"/>
+      </w:pPr>
+      <w:r>
+        <w:t>13.1 Example Documents</w:t>
+      </w:r>
+    </w:p>
+    <w:p>
+      <w:pPr/>
+      <w:r>
+        <w:rPr>
+          <w:b/>
+        </w:rPr>
+        <w:t>14. Closing a Case</w:t>
+      </w:r>
+    </w:p>
+    <w:p>
+      <w:pPr>
+        <w:ind w:left="504"/>
+      </w:pPr>
+      <w:r>
+        <w:t>14.1 Discharge Reminders</w:t>
+      </w:r>
+    </w:p>
+    <w:p>
+      <w:pPr>
+        <w:ind w:left="504"/>
+      </w:pPr>
+      <w:r>
+        <w:t>14.2 Discharge Plan Requirements</w:t>
+      </w:r>
+    </w:p>
+    <w:p>
+      <w:pPr>
+        <w:ind w:left="504"/>
+      </w:pPr>
+      <w:r>
+        <w:t>14.3 Lauris Billing for Discharge</w:t>
+      </w:r>
+    </w:p>
+    <w:p>
+      <w:pPr>
+        <w:ind w:left="504"/>
+      </w:pPr>
+      <w:r>
+        <w:t>14.4 Lauris: Closing a Case</w:t>
+      </w:r>
+    </w:p>
+    <w:p>
+      <w:pPr>
+        <w:ind w:left="504"/>
+      </w:pPr>
+      <w:r>
+        <w:t>14.5 Lauris: Discharge Plan</w:t>
+      </w:r>
+    </w:p>
+    <w:p>
+      <w:pPr>
+        <w:ind w:left="504"/>
+      </w:pPr>
+      <w:r>
+        <w:t>14.6 Discharge Workflow</w:t>
+      </w:r>
+    </w:p>
+    <w:p>
+      <w:pPr/>
+      <w:r>
+        <w:rPr>
+          <w:b/>
+        </w:rPr>
+        <w:t>15. Supervision and Case Consultation</w:t>
+      </w:r>
+    </w:p>
+    <w:p>
+      <w:pPr/>
+      <w:r>
+        <w:rPr>
+          <w:b/>
+        </w:rPr>
+        <w:t>16. Why Mental Health Therapists Are Considered Medical Providers</w:t>
+      </w:r>
+    </w:p>
+    <w:p>
+      <w:pPr/>
+      <w:r>
+        <w:rPr>
+          <w:b/>
+        </w:rPr>
+        <w:t>17. Why Documentation Is a Requirement of the Job, Not Just a Company Preference</w:t>
+      </w:r>
+    </w:p>
+    <w:p>
+      <w:pPr/>
+      <w:r>
+        <w:rPr>
+          <w:b/>
+        </w:rPr>
+        <w:t>18. Productivity Expectations</w:t>
+      </w:r>
+    </w:p>
+    <w:p>
+      <w:pPr/>
+      <w:r>
+        <w:rPr>
+          <w:b/>
+        </w:rPr>
+        <w:t>19. Client Transfers and Dual Enrollment</w:t>
+      </w:r>
+    </w:p>
+    <w:p>
+      <w:pPr/>
+      <w:r>
+        <w:rPr>
+          <w:b/>
+        </w:rPr>
+        <w:t>20. Using Lauris and Lauris Reports</w:t>
+      </w:r>
+    </w:p>
+    <w:p>
+      <w:pPr>
+        <w:ind w:left="504"/>
+      </w:pPr>
+      <w:r>
+        <w:t>20.1 Common Tasks in Lauris</w:t>
+      </w:r>
+    </w:p>
+    <w:p>
+      <w:pPr>
+        <w:ind w:left="504"/>
+      </w:pPr>
+      <w:r>
+        <w:t>20.2 Lauris Reports</w:t>
+      </w:r>
+    </w:p>
+    <w:p>
+      <w:pPr/>
+      <w:r>
+        <w:rPr>
+          <w:b/>
+        </w:rPr>
+        <w:t>21. Licensed Therapists: CAQH Attestation</w:t>
+      </w:r>
+    </w:p>
+    <w:p>
+      <w:pPr/>
+      <w:r>
+        <w:rPr>
+          <w:b/>
+        </w:rPr>
+        <w:t>22. Registered Interns: Logging Supervision Hours for Licensure</w:t>
+      </w:r>
+    </w:p>
+    <w:p>
+      <w:pPr/>
+      <w:r>
+        <w:rPr>
+          <w:b/>
+        </w:rPr>
+        <w:t>23. For Mental Health Supervisors</w:t>
+      </w:r>
+    </w:p>
+    <w:p>
+      <w:pPr>
+        <w:ind w:left="504"/>
+      </w:pPr>
+      <w:r>
+        <w:t>23.1 Expectations</w:t>
+      </w:r>
+    </w:p>
+    <w:p>
+      <w:pPr>
+        <w:ind w:left="504"/>
+      </w:pPr>
+      <w:r>
+        <w:t>23.2 Leader Portal</w:t>
+      </w:r>
+    </w:p>
+    <w:p>
+      <w:pPr>
+        <w:ind w:left="504"/>
+      </w:pPr>
+      <w:r>
+        <w:t>23.3 Monthly Updates</w:t>
+      </w:r>
+    </w:p>
+    <w:p>
+      <w:pPr>
+        <w:ind w:left="504"/>
+      </w:pPr>
+      <w:r>
+        <w:t>23.4 Qualified Supervisors (QS)</w:t>
+      </w:r>
+    </w:p>
+    <w:p>
+      <w:pPr>
+        <w:ind w:left="504"/>
+      </w:pPr>
+      <w:r>
+        <w:t>23.5 Supervisor Meetings</w:t>
+      </w:r>
+    </w:p>
+    <w:p>
+      <w:pPr>
+        <w:ind w:left="504"/>
+      </w:pPr>
+      <w:r>
+        <w:t>23.6 Interns</w:t>
+      </w:r>
+    </w:p>
+    <w:p>
+      <w:pPr>
+        <w:ind w:left="504"/>
+      </w:pPr>
+      <w:r>
+        <w:t>23.7 Quarterly Supervisor Review</w:t>
+      </w:r>
+    </w:p>
+    <w:p>
+      <w:pPr>
+        <w:ind w:left="504"/>
+      </w:pPr>
+      <w:r>
+        <w:t>23.8 MH Audits</w:t>
+      </w:r>
+    </w:p>
+    <w:p>
+      <w:pPr>
+        <w:ind w:left="504"/>
+      </w:pPr>
+      <w:r>
+        <w:t>23.9 Compliance Monitoring</w:t>
+      </w:r>
+    </w:p>
+    <w:p>
+      <w:pPr>
+        <w:ind w:left="504"/>
+      </w:pPr>
+      <w:r>
+        <w:t>23.10 Transferring Cases</w:t>
+      </w:r>
+    </w:p>
+    <w:p>
+      <w:pPr>
+        <w:ind w:left="504"/>
+      </w:pPr>
+      <w:r>
+        <w:t>23.11 Collaboration with Other Programs</w:t>
+      </w:r>
+    </w:p>
+    <w:p>
+      <w:pPr/>
+      <w:r>
+        <w:rPr>
+          <w:b/>
+        </w:rPr>
         <w:t>Appendix A. Onboarding Training Handout Links</w:t>
       </w:r>
     </w:p>
     <w:p>
-      <w:pPr>
-        <w:ind w:left="360"/>
-      </w:pPr>
-      <w:r>
+      <w:pPr/>
+      <w:r>
+        <w:rPr>
+          <w:b/>
+        </w:rPr>
         <w:t>Appendix B. Additional Resources, Training Recordings, and Example Documents</w:t>
       </w:r>
     </w:p>
     <w:p>
-      <w:pPr>
-        <w:ind w:left="360"/>
-      </w:pPr>
-      <w:r>
+      <w:pPr/>
+      <w:r>
+        <w:rPr>
+          <w:b/>
+        </w:rPr>
         <w:t>Appendix C. Key Contacts</w:t>
       </w:r>
     </w:p>
     <w:p>
-      <w:r>
-        <w:br w:type="page"/>
+      <w:pPr/>
+      <w:r>
+        <w:rPr>
+          <w:b/>
+        </w:rPr>
+        <w:t>Appendix D. Sources and Regulatory References</w:t>
       </w:r>
     </w:p>
     <w:p>
       <w:pPr>
         <w:pStyle w:val="Heading1"/>
-      </w:pPr>
-      <w:r>
-        <w:lastRenderedPageBreak/>
-        <w:t>@Claude, I am trying to reorganize the document.</w:t>
-      </w:r>
-    </w:p>
-    <w:p>
-      <w:pPr>
-        <w:pStyle w:val="Heading1"/>
-        <w:rPr>
-          <w:rFonts w:ascii="Calibri" w:eastAsiaTheme="minorEastAsia" w:hAnsi="Calibri" w:cstheme="minorBidi"/>
-          <w:b w:val="0"/>
-          <w:bCs w:val="0"/>
-          <w:color w:val="auto"/>
-          <w:sz w:val="22"/>
-          <w:szCs w:val="22"/>
-        </w:rPr>
-      </w:pPr>
-      <w:r>
-        <w:rPr>
-          <w:rFonts w:ascii="Calibri" w:eastAsiaTheme="minorEastAsia" w:hAnsi="Calibri" w:cstheme="minorBidi"/>
-          <w:b w:val="0"/>
-          <w:bCs w:val="0"/>
-          <w:strike/>
-          <w:color w:val="auto"/>
-          <w:sz w:val="22"/>
-          <w:szCs w:val="22"/>
-        </w:rPr>
-        <w:t xml:space="preserve">✓  </w:t>
-      </w:r>
-      <w:r>
-        <w:rPr>
-          <w:rFonts w:ascii="Calibri" w:eastAsiaTheme="minorEastAsia" w:hAnsi="Calibri" w:cstheme="minorBidi"/>
-          <w:b w:val="0"/>
-          <w:bCs w:val="0"/>
-          <w:strike/>
-          <w:color w:val="auto"/>
-          <w:sz w:val="22"/>
-          <w:szCs w:val="22"/>
-        </w:rPr>
-        <w:t xml:space="preserve">Section X: </w:t>
-      </w:r>
-      <w:r>
-        <w:rPr>
-          <w:rFonts w:ascii="Calibri" w:eastAsiaTheme="minorEastAsia" w:hAnsi="Calibri" w:cstheme="minorBidi"/>
-          <w:b w:val="0"/>
-          <w:bCs w:val="0"/>
-          <w:strike/>
-          <w:color w:val="auto"/>
-          <w:sz w:val="22"/>
-          <w:szCs w:val="22"/>
-        </w:rPr>
-        <w:t>Welcome (this can be changed by different programs)</w:t>
-      </w:r>
-    </w:p>
-    <w:p>
-      <w:r>
-        <w:rPr>
-          <w:strike/>
-        </w:rPr>
-        <w:t>✓ Section X: FASD Catchment Area:  The Florida Center (which is a</w:t>
-      </w:r>
-      <w:r>
-        <w:rPr>
-          <w:strike/>
-        </w:rPr>
-        <w:t xml:space="preserve"> Florida-licensed agency</w:t>
-      </w:r>
-      <w:r>
-        <w:rPr>
-          <w:strike/>
-        </w:rPr>
-        <w:t>)</w:t>
-      </w:r>
-      <w:r>
-        <w:rPr>
-          <w:strike/>
-        </w:rPr>
-        <w:t xml:space="preserve"> can provide telehealth services to Medicaid clients anywhere in the state</w:t>
-      </w:r>
-      <w:r>
-        <w:rPr>
-          <w:strike/>
-        </w:rPr>
-        <w:t>. There</w:t>
-      </w:r>
-      <w:r>
-        <w:rPr>
-          <w:strike/>
-        </w:rPr>
-        <w:t xml:space="preserve"> are no county or regional limits. </w:t>
-      </w:r>
-      <w:r>
-        <w:rPr>
-          <w:strike/>
-        </w:rPr>
-        <w:t xml:space="preserve"> Services need to be done virtually. </w:t>
-      </w:r>
-    </w:p>
-    <w:p>
-      <w:r>
-        <w:rPr>
-          <w:strike/>
-        </w:rPr>
-        <w:t xml:space="preserve">✓ Section X:  </w:t>
-      </w:r>
-      <w:r>
-        <w:rPr>
-          <w:strike/>
-        </w:rPr>
-        <w:t>Choosing the Billing Client: Child vs. Adult</w:t>
-      </w:r>
-      <w:r>
-        <w:rPr>
-          <w:strike/>
-        </w:rPr>
-        <w:t xml:space="preserve">. </w:t>
-      </w:r>
-      <w:r>
-        <w:rPr>
-          <w:strike/>
-        </w:rPr>
-        <w:t>Services can be billed under the child or the adult; if billing the adult, the focus should stay on parenting</w:t>
-      </w:r>
-      <w:r>
-        <w:rPr>
-          <w:strike/>
-        </w:rPr>
-        <w:t xml:space="preserve">. </w:t>
-      </w:r>
-      <w:r>
-        <w:rPr>
-          <w:strike/>
-        </w:rPr>
-        <w:t xml:space="preserve"> </w:t>
-      </w:r>
-      <w:r>
-        <w:rPr>
-          <w:strike/>
-        </w:rPr>
-        <w:t>If you determine that the primary goals for treatment are to work with the parent, please consult with your supervisor about whether or not the parent should be the identified client who is open to services.</w:t>
-      </w:r>
-    </w:p>
-    <w:p>
-      <w:r>
-        <w:rPr>
-          <w:strike/>
-        </w:rPr>
-        <w:t xml:space="preserve">✓ Section X: </w:t>
-      </w:r>
-      <w:r>
-        <w:rPr>
-          <w:strike/>
-        </w:rPr>
-        <w:t>Referral to Mental Health: Put the FASD Mental Health Referral Process</w:t>
-      </w:r>
-    </w:p>
-    <w:p>
-      <w:r>
-        <w:rPr>
-          <w:strike/>
-        </w:rPr>
-        <w:t xml:space="preserve">✓ Section X: </w:t>
-      </w:r>
-      <w:r>
-        <w:rPr>
-          <w:strike/>
-        </w:rPr>
-        <w:t xml:space="preserve">Intake:  Insurance Verification, What Intake does before reaching the therapist, </w:t>
-      </w:r>
-      <w:r>
-        <w:rPr>
-          <w:strike/>
-        </w:rPr>
-        <w:t xml:space="preserve">unit availability </w:t>
-      </w:r>
-    </w:p>
-    <w:p>
-      <w:r>
-        <w:rPr>
-          <w:strike/>
-        </w:rPr>
-        <w:t xml:space="preserve">✓ Section X: </w:t>
-      </w:r>
-      <w:r>
-        <w:rPr>
-          <w:strike/>
-        </w:rPr>
-        <w:t xml:space="preserve">Before the First Session: </w:t>
-      </w:r>
-      <w:r>
-        <w:rPr>
-          <w:strike/>
-        </w:rPr>
-        <w:t xml:space="preserve"> (</w:t>
-      </w:r>
-      <w:r>
-        <w:rPr>
-          <w:strike/>
-        </w:rPr>
-        <w:t xml:space="preserve"> </w:t>
-      </w:r>
-      <w:r>
-        <w:rPr>
-          <w:strike/>
-        </w:rPr>
-        <w:t>It was in the</w:t>
-      </w:r>
-      <w:r>
-        <w:rPr>
-          <w:strike/>
-        </w:rPr>
-        <w:t xml:space="preserve"> Before the Assessment here and change the name</w:t>
-      </w:r>
-      <w:r>
-        <w:rPr>
-          <w:strike/>
-        </w:rPr>
-        <w:t>)</w:t>
-      </w:r>
-    </w:p>
-    <w:p>
-      <w:r>
-        <w:rPr>
-          <w:strike/>
-        </w:rPr>
-        <w:t xml:space="preserve">✓ Section X: </w:t>
-      </w:r>
-      <w:r>
-        <w:rPr>
-          <w:strike/>
-        </w:rPr>
-        <w:t>The First Session, focus on what to cover and then do a couple of subheadings: Confidentiality and Informed Consent</w:t>
-      </w:r>
-      <w:r>
-        <w:rPr>
-          <w:strike/>
-        </w:rPr>
-        <w:t xml:space="preserve"> (put the section Confidentiality and Informed Consent here)</w:t>
-      </w:r>
-      <w:r>
-        <w:rPr>
-          <w:strike/>
-        </w:rPr>
-        <w:t xml:space="preserve">,  Outcome Measures, Crisis Planning, </w:t>
-      </w:r>
-      <w:r>
-        <w:rPr>
-          <w:strike/>
-        </w:rPr>
-        <w:t xml:space="preserve"> Assessments (What Assessments are and Which to Use, Special Considerations with FASD Evaluations, Who Can Bill) </w:t>
-      </w:r>
-      <w:r>
-        <w:rPr>
-          <w:strike/>
-        </w:rPr>
-        <w:t xml:space="preserve">also a subheading,  I am not sure how to put this here or the title, but it would be helpful to include some frequently asked questions. </w:t>
-      </w:r>
-    </w:p>
-    <w:p>
-      <w:pPr>
-        <w:pStyle w:val="ListParagraph"/>
-        <w:numPr>
-          <w:ilvl w:val="0"/>
-          <w:numId w:val="22"/>
-        </w:numPr>
-      </w:pPr>
-      <w:r>
-        <w:rPr>
-          <w:strike/>
-        </w:rPr>
-        <w:t xml:space="preserve">✓ How should I try to schedule a session for IDA/BPS? </w:t>
-      </w:r>
-      <w:r>
-        <w:rPr>
-          <w:strike/>
-        </w:rPr>
-        <w:t xml:space="preserve"> (the answers might already be in the text, you can move it over )</w:t>
-      </w:r>
-    </w:p>
-    <w:p>
-      <w:pPr>
-        <w:pStyle w:val="ListParagraph"/>
-        <w:numPr>
-          <w:ilvl w:val="0"/>
-          <w:numId w:val="22"/>
-        </w:numPr>
-      </w:pPr>
-      <w:r>
-        <w:rPr>
-          <w:strike/>
-        </w:rPr>
-        <w:t>✓ What if the child does not attend the session?</w:t>
-      </w:r>
-    </w:p>
-    <w:p>
-      <w:pPr>
-        <w:pStyle w:val="ListParagraph"/>
-        <w:numPr>
-          <w:ilvl w:val="0"/>
-          <w:numId w:val="22"/>
-        </w:numPr>
-      </w:pPr>
-      <w:r>
-        <w:rPr>
-          <w:strike/>
-        </w:rPr>
-        <w:t xml:space="preserve">✓ What if I cannot get all the information done within the period of time? </w:t>
-      </w:r>
-    </w:p>
-    <w:p>
-      <w:r>
-        <w:rPr>
-          <w:strike/>
-        </w:rPr>
-        <w:t>✓ Section X: DAP Notes</w:t>
-      </w:r>
-    </w:p>
-    <w:p>
-      <w:r>
-        <w:rPr>
-          <w:strike/>
-        </w:rPr>
-        <w:t xml:space="preserve">✓ Section X: Closing a case, I changed the order of things </w:t>
-      </w:r>
-      <w:r>
-        <w:rPr>
-          <w:strike/>
-        </w:rPr>
-        <w:t xml:space="preserve">and moved File keeping to another section. </w:t>
-      </w:r>
-    </w:p>
-    <w:p>
-      <w:r>
-        <w:rPr>
-          <w:strike/>
-        </w:rPr>
-        <w:t>✓ Section X: Combine Client Transfers and Dual Enrollment, Case Transfers and Transfer Form (there might be some duplication, so let me know what you see – I also need an overview of the name)</w:t>
-      </w:r>
-    </w:p>
-    <w:p>
-      <w:r>
-        <w:rPr>
-          <w:strike/>
-        </w:rPr>
-        <w:t xml:space="preserve">✓ Section X:  Supervision and Case Consultation – can you add here a couple of things.  You are already talking about individual supervision, but we also have reflective supervision in the team meeting, once complete FASCETS, there is a monthly FASCETS reflective group to discuss cases.  </w:t>
-      </w:r>
-    </w:p>
-    <w:p>
-      <w:r>
-        <w:rPr>
-          <w:strike/>
-        </w:rPr>
-        <w:t xml:space="preserve">✓ Section X:  Groups. The therapist gets 39hrs (156 units) for the fiscal year for groups. A client cannot be seen twice in a day, for example, participating in a group and seeing a client individually. It is required that each child in the group must have a note for documentation.  Groups are only reimbursed in person, not virtually.  </w:t>
-      </w:r>
-    </w:p>
-    <w:p>
-      <w:r>
-        <w:rPr>
-          <w:strike/>
-        </w:rPr>
-        <w:lastRenderedPageBreak/>
-        <w:t xml:space="preserve">✓ Even though this is an intern and no real dollars attached, we still follow the guidelines. </w:t>
-      </w:r>
-    </w:p>
-    <w:p>
-      <w:r>
-        <w:rPr>
-          <w:strike/>
-        </w:rPr>
-        <w:t>✓ ()</w:t>
-      </w:r>
-    </w:p>
-    <w:p>
-      <w:r>
-        <w:rPr>
-          <w:strike/>
-        </w:rPr>
-        <w:t>✓ Section X: Using Lauris and Lauris Reports:  Lauris Opening/Closing a Case</w:t>
-      </w:r>
-    </w:p>
-    <w:p>
-      <w:r>
-        <w:rPr>
-          <w:strike/>
-        </w:rPr>
-        <w:t>✓ Section X:  Licensed Therapists: CAQH Attestation</w:t>
-      </w:r>
-    </w:p>
-    <w:p>
-      <w:r>
-        <w:rPr>
-          <w:strike/>
-        </w:rPr>
-        <w:t>✓ Section X: Registered Interns: Logging Supervision hours…</w:t>
-      </w:r>
-    </w:p>
-    <w:p>
-      <w:r>
-        <w:rPr>
-          <w:strike/>
-        </w:rPr>
-        <w:t>✓ Section X:  This is a section for mental health supervisors (not sure the title)</w:t>
-      </w:r>
-    </w:p>
-    <w:p>
-      <w:r>
-        <w:rPr>
-          <w:strike/>
-        </w:rPr>
-        <w:t>✓ Here are some things I want to include:  Intranet link for supervisors:  It a source of great information that will give an overview of the mental health teams and contact information, information about chart reviews the hiring</w:t>
-      </w:r>
-    </w:p>
-    <w:p>
-      <w:hyperlink r:id="rId8" w:history="1">
-        <w:r>
-          <w:rPr>
-            <w:rStyle w:val="Hyperlink"/>
-          </w:rPr>
-          <w:t>https://sites.google.com/thefloridacenter.org/programs/mental-health-services-home/leader-portal</w:t>
-        </w:r>
-      </w:hyperlink>
-      <w:r>
-        <w:rPr>
-          <w:strike/>
-        </w:rPr>
-        <w:t xml:space="preserve">✓ </w:t>
-      </w:r>
-    </w:p>
-    <w:p>
-      <w:r>
-        <w:rPr>
-          <w:strike/>
-        </w:rPr>
-        <w:t xml:space="preserve">✓ Update at least monthly calendar, pops up each month, Update all staff roster, include interns, MH, all supervisors, parent advocates (not needed:  Intake) </w:t>
-      </w:r>
-    </w:p>
-    <w:p>
-      <w:r>
-        <w:rPr>
-          <w:strike/>
-        </w:rPr>
-        <w:t xml:space="preserve">✓ </w:t>
-      </w:r>
-      <w:proofErr w:type="spellStart"/>
-      <w:r>
-        <w:rPr>
-          <w:strike/>
-        </w:rPr>
-        <w:t>QS,if</w:t>
-      </w:r>
-      <w:proofErr w:type="spellEnd"/>
-      <w:r>
-        <w:rPr>
-          <w:strike/>
-        </w:rPr>
-        <w:t xml:space="preserve"> you are the qualified supervisor for a clinician, need to be the same profession/degree, Lauris will track hours, need to put name on the list.   </w:t>
-      </w:r>
-      <w:hyperlink r:id="rId9" w:history="1">
-        <w:r>
-          <w:rPr>
-            <w:rStyle w:val="Hyperlink"/>
-          </w:rPr>
-          <w:t>https://drive.google.com/drive/folders/1UxrA_apKRptiNVHbhy4CTyHs9-4EEmf-</w:t>
-        </w:r>
-      </w:hyperlink>
-    </w:p>
-    <w:p>
-      <w:r>
-        <w:rPr>
-          <w:strike/>
-        </w:rPr>
-        <w:t>✓ Supervisor meetings, once a month, 3rd Friday of the month at 12pm in</w:t>
-      </w:r>
-      <w:r>
-        <w:rPr>
-          <w:strike/>
-        </w:rPr>
-        <w:t xml:space="preserve"> June and then</w:t>
-      </w:r>
-      <w:r>
-        <w:rPr>
-          <w:strike/>
-        </w:rPr>
-        <w:t xml:space="preserve"> August </w:t>
-      </w:r>
-    </w:p>
-    <w:p>
-      <w:r>
-        <w:rPr>
-          <w:strike/>
-        </w:rPr>
-        <w:t xml:space="preserve">✓ Expectations:  </w:t>
-      </w:r>
-    </w:p>
-    <w:p/>
-    <w:p>
-      <w:r>
-        <w:rPr>
-          <w:strike/>
-        </w:rPr>
-        <w:t xml:space="preserve">✓ Compliance </w:t>
-      </w:r>
-      <w:proofErr w:type="spellStart"/>
-      <w:r>
-        <w:rPr>
-          <w:strike/>
-        </w:rPr>
-        <w:t>Montioring</w:t>
-      </w:r>
-      <w:proofErr w:type="spellEnd"/>
-      <w:r>
-        <w:rPr>
-          <w:strike/>
-        </w:rPr>
-        <w:t xml:space="preserve">:  </w:t>
-      </w:r>
-      <w:hyperlink r:id="rId10" w:anchor="gid=53724778" w:history="1">
-        <w:r>
-          <w:rPr>
-            <w:rStyle w:val="Hyperlink"/>
-          </w:rPr>
-          <w:t>https://docs.google.com/spreadsheets/d/1S3vp0XlTZfZbKKy6j3msC_2Qv_FPJAWG/edit?gid=53724778#gid=53724778</w:t>
-        </w:r>
-      </w:hyperlink>
-    </w:p>
-    <w:p/>
-    <w:p>
-      <w:r>
-        <w:rPr>
-          <w:strike/>
-        </w:rPr>
-        <w:t>✓ How to Transfer cases:</w:t>
-      </w:r>
-    </w:p>
-    <w:p/>
-    <w:p>
-      <w:r>
-        <w:rPr>
-          <w:strike/>
-        </w:rPr>
-        <w:t xml:space="preserve">✓ Quarterly Supervisor Review:  </w:t>
-      </w:r>
-      <w:r>
-        <w:rPr>
-          <w:strike/>
-        </w:rPr>
-        <w:t>Bob sends a report, and basically every active client needs to be reviewed by the supervisor at least one time per quarter.  Supervisors should enter notes for areas of guidance that they verbally tell their supervisees as a form of documentation that the conversation occurred (example:  Discussed client’s receive self-injurious statements and advised therapist to complete a safety plan with the child and caregivers).</w:t>
-      </w:r>
-    </w:p>
-    <w:p>
-      <w:r>
-        <w:rPr>
-          <w:strike/>
-        </w:rPr>
-        <w:t>✓ MH Audits:  MH department does this quarterly.  Assign each program to a quarter and supervisors facilitate with their staff one per year (</w:t>
-      </w:r>
-      <w:r>
-        <w:rPr>
-          <w:strike/>
-        </w:rPr>
-        <w:t>(example:  Q1 is OPMH/ECMHC Sarasota, Q2 OPMH/ECMHC North Port, Q3 SBMH, Q4 FASD/ECC.</w:t>
-      </w:r>
-      <w:r>
-        <w:rPr>
-          <w:strike/>
-        </w:rPr>
-        <w:t>)</w:t>
-      </w:r>
-    </w:p>
-    <w:p>
-      <w:r>
-        <w:rPr>
-          <w:strike/>
-        </w:rPr>
-        <w:lastRenderedPageBreak/>
-        <w:t>✓ Collaboration with other programs:  Why is it important</w:t>
-      </w:r>
-    </w:p>
-    <w:p>
+        <w:pageBreakBefore/>
+      </w:pPr>
       <w:r>
         <w:t>1. Welcome and About the Practice</w:t>
       </w:r>
@@ -979,9 +879,6 @@
       </w:pPr>
       <w:r>
         <w:t>3.1 The Billing Absolutes — No Ifs, Ands, or Buts</w:t>
-      </w:r>
-      <w:r>
-        <w:t xml:space="preserve"> </w:t>
       </w:r>
     </w:p>
     <w:tbl>
@@ -1044,11 +941,10 @@
         <w:pStyle w:val="Heading2"/>
       </w:pPr>
       <w:bookmarkStart w:id="0" w:name="ServiceCodes"/>
-      <w:r>
-        <w:lastRenderedPageBreak/>
+      <w:bookmarkEnd w:id="0"/>
+      <w:r>
         <w:t>3.2 Service Codes</w:t>
       </w:r>
-      <w:bookmarkEnd w:id="0"/>
     </w:p>
     <w:p>
       <w:r>
@@ -1793,11 +1689,10 @@
         <w:pStyle w:val="Heading2"/>
       </w:pPr>
       <w:bookmarkStart w:id="1" w:name="InternCodes"/>
-      <w:r>
-        <w:lastRenderedPageBreak/>
+      <w:bookmarkEnd w:id="1"/>
+      <w:r>
         <w:t>3.3 Intern Service Codes</w:t>
       </w:r>
-      <w:bookmarkEnd w:id="1"/>
     </w:p>
     <w:p>
       <w:r>
@@ -2182,10 +2077,10 @@
         <w:pStyle w:val="Heading2"/>
       </w:pPr>
       <w:bookmarkStart w:id="2" w:name="OptimizingBilling"/>
+      <w:bookmarkEnd w:id="2"/>
       <w:r>
         <w:t>3.5 Optimizing Billing</w:t>
       </w:r>
-      <w:bookmarkEnd w:id="2"/>
     </w:p>
     <w:p>
       <w:pPr>
@@ -2238,10 +2133,10 @@
         <w:pStyle w:val="Heading2"/>
       </w:pPr>
       <w:bookmarkStart w:id="3" w:name="WhoCanBill"/>
+      <w:bookmarkEnd w:id="3"/>
       <w:r>
         <w:t>3.6 Who Can Bill What</w:t>
       </w:r>
-      <w:bookmarkEnd w:id="3"/>
     </w:p>
     <w:p>
       <w:r>
@@ -2297,10 +2192,10 @@
         <w:pStyle w:val="Heading2"/>
       </w:pPr>
       <w:bookmarkStart w:id="4" w:name="TimelineBilling"/>
+      <w:bookmarkEnd w:id="4"/>
       <w:r>
         <w:t>3.7 Timeline for Billing</w:t>
       </w:r>
-      <w:bookmarkEnd w:id="4"/>
     </w:p>
     <w:p>
       <w:r>
@@ -2664,7 +2559,7 @@
         <w:pStyle w:val="Heading2"/>
       </w:pPr>
       <w:r>
-        <w:t>Groups</w:t>
+        <w:t>3.10 Groups</w:t>
       </w:r>
     </w:p>
     <w:p>
@@ -2731,7 +2626,7 @@
         <w:pStyle w:val="Heading1"/>
       </w:pPr>
       <w:r>
-        <w:t>FASD Catchment Area</w:t>
+        <w:t>4. FASD Catchment Area</w:t>
       </w:r>
     </w:p>
     <w:p>
@@ -2744,8 +2639,7 @@
         <w:pStyle w:val="Heading1"/>
       </w:pPr>
       <w:r>
-        <w:lastRenderedPageBreak/>
-        <w:t>Choosing the Billing Client: Child vs. Adult</w:t>
+        <w:t>5. Choosing the Billing Client: Child vs. Adult</w:t>
       </w:r>
     </w:p>
     <w:p>
@@ -2758,7 +2652,7 @@
         <w:pStyle w:val="Heading1"/>
       </w:pPr>
       <w:r>
-        <w:t>Referral to Mental Health</w:t>
+        <w:t>6. Referral to Mental Health</w:t>
       </w:r>
     </w:p>
     <w:p>
@@ -2977,7 +2871,7 @@
         <w:pStyle w:val="Heading1"/>
       </w:pPr>
       <w:r>
-        <w:t>Intake</w:t>
+        <w:t>7. Intake</w:t>
       </w:r>
     </w:p>
     <w:p>
@@ -2985,7 +2879,7 @@
         <w:pStyle w:val="Heading2"/>
       </w:pPr>
       <w:r>
-        <w:t>What Intake Does Before Reaching the Therapist</w:t>
+        <w:t>7.1 What Intake Does Before Reaching the Therapist</w:t>
       </w:r>
     </w:p>
     <w:p>
@@ -3009,8 +2903,7 @@
         <w:pStyle w:val="Heading2"/>
       </w:pPr>
       <w:r>
-        <w:lastRenderedPageBreak/>
-        <w:t>Insurance Verification</w:t>
+        <w:t>7.2 Insurance Verification</w:t>
       </w:r>
     </w:p>
     <w:p>
@@ -3023,7 +2916,7 @@
         <w:pStyle w:val="Heading2"/>
       </w:pPr>
       <w:r>
-        <w:t>Unit Availability, Updates, and Service Limits</w:t>
+        <w:t>7.3 Unit Availability, Updates, and Service Limits</w:t>
       </w:r>
     </w:p>
     <w:p>
@@ -3055,17 +2948,17 @@
         <w:pStyle w:val="Heading1"/>
       </w:pPr>
       <w:bookmarkStart w:id="6" w:name="Confidentiality"/>
-      <w:r>
-        <w:t>4. Confidentiality and Informed Consent</w:t>
-      </w:r>
       <w:bookmarkEnd w:id="6"/>
+      <w:r>
+        <w:t>8. Confidentiality and Informed Consent</w:t>
+      </w:r>
     </w:p>
     <w:p>
       <w:pPr>
         <w:pStyle w:val="Heading2"/>
       </w:pPr>
       <w:r>
-        <w:t>Informed Consent: What It Means</w:t>
+        <w:t>8.1 Informed Consent: What It Means</w:t>
       </w:r>
     </w:p>
     <w:p>
@@ -3078,7 +2971,7 @@
         <w:pStyle w:val="Heading2"/>
       </w:pPr>
       <w:r>
-        <w:t>Consent Forms</w:t>
+        <w:t>8.2 Consent Forms</w:t>
       </w:r>
     </w:p>
     <w:p>
@@ -3110,7 +3003,7 @@
         <w:pStyle w:val="Heading2"/>
       </w:pPr>
       <w:r>
-        <w:t>Who You Are as Their Therapist</w:t>
+        <w:t>8.3 Who You Are as Their Therapist</w:t>
       </w:r>
     </w:p>
     <w:p>
@@ -3123,7 +3016,7 @@
         <w:pStyle w:val="Heading2"/>
       </w:pPr>
       <w:r>
-        <w:t>Limits to Confidentiality: How to Explain Them to Families</w:t>
+        <w:t>8.4 Limits to Confidentiality: How to Explain Them to Families</w:t>
       </w:r>
     </w:p>
     <w:p>
@@ -3169,7 +3062,7 @@
         <w:pStyle w:val="Heading2"/>
       </w:pPr>
       <w:r>
-        <w:t>Parent / Child Confidentiality</w:t>
+        <w:t>8.5 Parent / Child Confidentiality</w:t>
       </w:r>
     </w:p>
     <w:p>
@@ -3182,7 +3075,7 @@
         <w:pStyle w:val="Heading2"/>
       </w:pPr>
       <w:r>
-        <w:t>Complaints About Therapy</w:t>
+        <w:t>8.6 Complaints About Therapy</w:t>
       </w:r>
     </w:p>
     <w:p>
@@ -3200,12 +3093,7 @@
         </w:rPr>
       </w:pPr>
       <w:r>
-        <w:rPr>
-          <w:color w:val="4F81BD" w:themeColor="accent1"/>
-          <w:sz w:val="26"/>
-          <w:szCs w:val="26"/>
-        </w:rPr>
-        <w:t>Before the First Session</w:t>
+        <w:t>9. Before the First Session</w:t>
       </w:r>
     </w:p>
     <w:p>
@@ -3229,7 +3117,7 @@
         <w:pStyle w:val="Heading1"/>
       </w:pPr>
       <w:r>
-        <w:t>5. The First Session</w:t>
+        <w:t>10. The First Session</w:t>
       </w:r>
     </w:p>
     <w:p>
@@ -3237,7 +3125,7 @@
         <w:pStyle w:val="Heading2"/>
       </w:pPr>
       <w:r>
-        <w:t>How the First Session Runs</w:t>
+        <w:t>10.1 How the First Session Runs</w:t>
       </w:r>
     </w:p>
     <w:p>
@@ -3277,7 +3165,7 @@
         <w:pStyle w:val="Heading2"/>
       </w:pPr>
       <w:r>
-        <w:t>Topics to Cover in the First Session</w:t>
+        <w:t>10.2 Topics to Cover in the First Session</w:t>
       </w:r>
     </w:p>
     <w:p>
@@ -3474,7 +3362,7 @@
         <w:pStyle w:val="Heading2"/>
       </w:pPr>
       <w:r>
-        <w:t>Frequently Asked Questions</w:t>
+        <w:t>10.3 Frequently Asked Questions</w:t>
       </w:r>
     </w:p>
     <w:p>
@@ -3583,17 +3471,17 @@
         <w:pStyle w:val="Heading1"/>
       </w:pPr>
       <w:bookmarkStart w:id="7" w:name="AssessmentsSec"/>
-      <w:r>
-        <w:t>6. Assessments</w:t>
-      </w:r>
       <w:bookmarkEnd w:id="7"/>
+      <w:r>
+        <w:t>11. Assessments</w:t>
+      </w:r>
     </w:p>
     <w:p>
       <w:pPr>
         <w:pStyle w:val="Heading2"/>
       </w:pPr>
       <w:r>
-        <w:t>What Assessments Are and Which to Use</w:t>
+        <w:t>11.1 What Assessments Are and Which to Use</w:t>
       </w:r>
     </w:p>
     <w:p>
@@ -3631,10 +3519,7 @@
         <w:pStyle w:val="Heading2"/>
       </w:pPr>
       <w:r>
-        <w:t xml:space="preserve">Special Considerations </w:t>
-      </w:r>
-      <w:r>
-        <w:t>with FASD Evaluations</w:t>
+        <w:t>11.2 Special Considerations with FASD Evaluations</w:t>
       </w:r>
     </w:p>
     <w:p>
@@ -3696,7 +3581,7 @@
         <w:pStyle w:val="Heading2"/>
       </w:pPr>
       <w:r>
-        <w:t>Required Elements at Assessment</w:t>
+        <w:t>11.3 Required Elements at Assessment</w:t>
       </w:r>
     </w:p>
     <w:p>
@@ -3888,7 +3773,7 @@
         <w:pStyle w:val="Heading2"/>
       </w:pPr>
       <w:r>
-        <w:t>Blank Forms and Example Materials</w:t>
+        <w:t>11.4 Blank Forms and Example Materials</w:t>
       </w:r>
     </w:p>
     <w:p>
@@ -3938,7 +3823,7 @@
         <w:pStyle w:val="Heading2"/>
       </w:pPr>
       <w:r>
-        <w:t>Required Training on Prenatal Alcohol Screening</w:t>
+        <w:t>11.5 Required Training on Prenatal Alcohol Screening</w:t>
       </w:r>
     </w:p>
     <w:p>
@@ -3968,7 +3853,7 @@
         <w:pStyle w:val="Heading1"/>
       </w:pPr>
       <w:r>
-        <w:t>7. Treatment Plans</w:t>
+        <w:t>12. Treatment Plans</w:t>
       </w:r>
     </w:p>
     <w:p>
@@ -3976,7 +3861,7 @@
         <w:pStyle w:val="Heading2"/>
       </w:pPr>
       <w:r>
-        <w:t>Overview and Compliance</w:t>
+        <w:t>12.1 Overview and Compliance</w:t>
       </w:r>
     </w:p>
     <w:p>
@@ -3999,7 +3884,7 @@
         <w:pStyle w:val="Heading2"/>
       </w:pPr>
       <w:r>
-        <w:t>What the Treatment Plan Session Looks Like</w:t>
+        <w:t>12.2 What the Treatment Plan Session Looks Like</w:t>
       </w:r>
     </w:p>
     <w:p>
@@ -4073,7 +3958,7 @@
         <w:pStyle w:val="Heading2"/>
       </w:pPr>
       <w:r>
-        <w:t>Required Content and Signatures</w:t>
+        <w:t>12.3 Required Content and Signatures</w:t>
       </w:r>
     </w:p>
     <w:p>
@@ -4167,7 +4052,7 @@
         <w:pStyle w:val="Heading2"/>
       </w:pPr>
       <w:r>
-        <w:t>Getting the Treatment Plan Signed via FOXIT</w:t>
+        <w:t>12.4 Getting the Treatment Plan Signed via FOXIT</w:t>
       </w:r>
     </w:p>
     <w:p>
@@ -4239,7 +4124,7 @@
         <w:pStyle w:val="Heading1"/>
       </w:pPr>
       <w:r>
-        <w:t>8. DAP Notes (Progress Notes)</w:t>
+        <w:t>13. DAP Notes (Progress Notes)</w:t>
       </w:r>
     </w:p>
     <w:p>
@@ -4315,7 +4200,7 @@
         <w:pStyle w:val="Heading2"/>
       </w:pPr>
       <w:r>
-        <w:t>Example Documents</w:t>
+        <w:t>13.1 Example Documents</w:t>
       </w:r>
     </w:p>
     <w:p>
@@ -4353,18 +4238,17 @@
         <w:pStyle w:val="Heading1"/>
       </w:pPr>
       <w:bookmarkStart w:id="9" w:name="ClosingCase"/>
-      <w:r>
-        <w:lastRenderedPageBreak/>
-        <w:t>10. Closing a Case</w:t>
-      </w:r>
       <w:bookmarkEnd w:id="9"/>
+      <w:r>
+        <w:t>14. Closing a Case</w:t>
+      </w:r>
     </w:p>
     <w:p>
       <w:pPr>
         <w:pStyle w:val="Heading2"/>
       </w:pPr>
       <w:r>
-        <w:t>Discharge Reminders</w:t>
+        <w:t>14.1 Discharge Reminders</w:t>
       </w:r>
     </w:p>
     <w:p>
@@ -4396,7 +4280,7 @@
         <w:pStyle w:val="Heading2"/>
       </w:pPr>
       <w:r>
-        <w:t>Discharge Plan Requirements</w:t>
+        <w:t>14.2 Discharge Plan Requirements</w:t>
       </w:r>
     </w:p>
     <w:p>
@@ -4436,7 +4320,7 @@
         <w:pStyle w:val="Heading2"/>
       </w:pPr>
       <w:r>
-        <w:t>Lauris Billing for Discharge</w:t>
+        <w:t>14.3 Lauris Billing for Discharge</w:t>
       </w:r>
     </w:p>
     <w:p>
@@ -4470,10 +4354,10 @@
         <w:pStyle w:val="Heading2"/>
       </w:pPr>
       <w:bookmarkStart w:id="10" w:name="LaurisTransferForm"/>
-      <w:r>
-        <w:t>Lauris: Closing a Case</w:t>
-      </w:r>
       <w:bookmarkEnd w:id="10"/>
+      <w:r>
+        <w:t>14.4 Lauris: Closing a Case</w:t>
+      </w:r>
     </w:p>
     <w:p>
       <w:pPr>
@@ -4512,7 +4396,7 @@
         <w:pStyle w:val="Heading2"/>
       </w:pPr>
       <w:r>
-        <w:t>Lauris: Discharge Plan</w:t>
+        <w:t>14.5 Lauris: Discharge Plan</w:t>
       </w:r>
     </w:p>
     <w:p>
@@ -4553,7 +4437,7 @@
       </w:pPr>
       <w:bookmarkStart w:id="11" w:name="_Hlk228102086"/>
       <w:r>
-        <w:t>Discharge Workflow</w:t>
+        <w:t>14.6 Discharge Workflow</w:t>
       </w:r>
     </w:p>
     <w:p>
@@ -4583,11 +4467,10 @@
     <w:bookmarkEnd w:id="11"/>
     <w:p>
       <w:pPr>
-        <w:pStyle w:val="Heading2"/>
-      </w:pPr>
-      <w:r>
-        <w:lastRenderedPageBreak/>
-        <w:t>Supervision and Case Consultation</w:t>
+        <w:pStyle w:val="Heading1"/>
+      </w:pPr>
+      <w:r>
+        <w:t>15. Supervision and Case Consultation</w:t>
       </w:r>
     </w:p>
     <w:p>
@@ -4613,10 +4496,10 @@
     </w:p>
     <w:p>
       <w:pPr>
-        <w:pStyle w:val="Heading2"/>
-      </w:pPr>
-      <w:r>
-        <w:t>12.2 Why Mental Health Therapists Are Considered Medical Providers</w:t>
+        <w:pStyle w:val="Heading1"/>
+      </w:pPr>
+      <w:r>
+        <w:t>16. Why Mental Health Therapists Are Considered Medical Providers</w:t>
       </w:r>
     </w:p>
     <w:p>
@@ -4744,10 +4627,10 @@
     </w:p>
     <w:p>
       <w:pPr>
-        <w:pStyle w:val="Heading2"/>
-      </w:pPr>
-      <w:r>
-        <w:t>12.3 Why Documentation Is a Requirement of the Job, Not Just a Company Preference</w:t>
+        <w:pStyle w:val="Heading1"/>
+      </w:pPr>
+      <w:r>
+        <w:t>17. Why Documentation Is a Requirement of the Job, Not Just a Company Preference</w:t>
       </w:r>
     </w:p>
     <w:p>
@@ -4837,34 +4720,10 @@
     </w:p>
     <w:p>
       <w:pPr>
-        <w:pStyle w:val="Heading2"/>
-        <w:rPr>
-          <w:rFonts w:ascii="Calibri" w:eastAsiaTheme="minorEastAsia" w:hAnsi="Calibri" w:cstheme="minorBidi"/>
-          <w:b w:val="0"/>
-          <w:bCs w:val="0"/>
-          <w:color w:val="auto"/>
-          <w:sz w:val="22"/>
-          <w:szCs w:val="22"/>
-        </w:rPr>
-      </w:pPr>
-      <w:r>
-        <w:rPr>
-          <w:rFonts w:ascii="Calibri" w:eastAsiaTheme="minorEastAsia" w:hAnsi="Calibri" w:cstheme="minorBidi"/>
-          <w:b w:val="0"/>
-          <w:bCs w:val="0"/>
-          <w:color w:val="auto"/>
-          <w:sz w:val="22"/>
-          <w:szCs w:val="22"/>
-        </w:rPr>
-        <w:t xml:space="preserve">File Keeping: All client files are kept electronically in Lauris. There are no hard files. </w:t>
-      </w:r>
-    </w:p>
-    <w:p>
-      <w:pPr>
-        <w:pStyle w:val="Heading2"/>
-      </w:pPr>
-      <w:r>
-        <w:t>12.4 Productivity Expectations</w:t>
+        <w:pStyle w:val="Heading1"/>
+      </w:pPr>
+      <w:r>
+        <w:t>18. Productivity Expectations</w:t>
       </w:r>
     </w:p>
     <w:p>
@@ -4889,13 +4748,13 @@
     </w:p>
     <w:p>
       <w:pPr>
-        <w:pStyle w:val="Heading2"/>
+        <w:pStyle w:val="Heading1"/>
       </w:pPr>
       <w:bookmarkStart w:id="12" w:name="ClientTransfers"/>
-      <w:r>
-        <w:t>Client Transfers and Dual Enrollment</w:t>
-      </w:r>
       <w:bookmarkEnd w:id="12"/>
+      <w:r>
+        <w:t>19. Client Transfers and Dual Enrollment</w:t>
+      </w:r>
     </w:p>
     <w:p>
       <w:r>
@@ -5034,10 +4893,7 @@
         <w:pStyle w:val="Heading1"/>
       </w:pPr>
       <w:r>
-        <w:t>Using Lauris and Lau</w:t>
-      </w:r>
-      <w:r>
-        <w:t>ris Reports</w:t>
+        <w:t>20. Using Lauris and Lauris Reports</w:t>
       </w:r>
     </w:p>
     <w:p>
@@ -5050,10 +4906,7 @@
         <w:pStyle w:val="Heading2"/>
       </w:pPr>
       <w:r>
-        <w:t>Common Tas</w:t>
-      </w:r>
-      <w:r>
-        <w:t>ks in Lauris</w:t>
+        <w:t>20.1 Common Tasks in Lauris</w:t>
       </w:r>
     </w:p>
     <w:p>
@@ -5127,8 +4980,7 @@
         <w:pStyle w:val="Heading2"/>
       </w:pPr>
       <w:r>
-        <w:lastRenderedPageBreak/>
-        <w:t>Lauris Reports</w:t>
+        <w:t>20.2 Lauris Reports</w:t>
       </w:r>
     </w:p>
     <w:p>
@@ -5210,10 +5062,10 @@
     </w:p>
     <w:p>
       <w:pPr>
-        <w:pStyle w:val="Heading2"/>
-      </w:pPr>
-      <w:r>
-        <w:t>13.2 Licensed Therapists: CAQH Attestation</w:t>
+        <w:pStyle w:val="Heading1"/>
+      </w:pPr>
+      <w:r>
+        <w:t>21. Licensed Therapists: CAQH Attestation</w:t>
       </w:r>
     </w:p>
     <w:p>
@@ -5332,137 +5184,152 @@
     </w:p>
     <w:p>
       <w:pPr>
+        <w:pStyle w:val="Heading1"/>
+      </w:pPr>
+      <w:r>
+        <w:t>22. Registered Interns: Logging Supervision Hours for Licensure</w:t>
+      </w:r>
+    </w:p>
+    <w:p>
+      <w:r>
+        <w:t>This subsection applies to registered interns who are accruing therapy and supervision hours toward licensure. It does not apply to licensed therapists.</w:t>
+      </w:r>
+    </w:p>
+    <w:p>
+      <w:r>
+        <w:t>Each month, registered interns will receive a log of their accrued therapy hours and supervision hours. The log is to be signed by the intern, the intern’s supervisor, and the qualified supervisor (if that person is within the agency). Only actual supervision time should be logged to the supervision service code in Lauris, and the appointment must be marked "complete" in Lauris in order for it to count.</w:t>
+      </w:r>
+    </w:p>
+    <w:p>
+      <w:r>
+        <w:t>What counts toward supervision for licensure:</w:t>
+      </w:r>
+    </w:p>
+    <w:p>
+      <w:pPr>
+        <w:pStyle w:val="ListBullet"/>
+      </w:pPr>
+      <w:r>
+        <w:t>Individual Supervision</w:t>
+      </w:r>
+    </w:p>
+    <w:p>
+      <w:pPr>
+        <w:pStyle w:val="ListBullet"/>
+      </w:pPr>
+      <w:r>
+        <w:t>Group Supervision</w:t>
+      </w:r>
+    </w:p>
+    <w:p>
+      <w:pPr>
+        <w:pStyle w:val="ListBullet"/>
+      </w:pPr>
+      <w:r>
+        <w:t>Reflective Supervision</w:t>
+      </w:r>
+    </w:p>
+    <w:p>
+      <w:pPr>
+        <w:pStyle w:val="ListBullet"/>
+      </w:pPr>
+      <w:r>
+        <w:t>Clinical meetings — only if your team meets in breakout rooms after the main portion and discusses clinical content (reviewing cases, reflecting on cases, etc.).</w:t>
+      </w:r>
+    </w:p>
+    <w:p>
+      <w:r>
+        <w:t>What does not count toward supervision for licensure:</w:t>
+      </w:r>
+    </w:p>
+    <w:p>
+      <w:pPr>
+        <w:pStyle w:val="ListBullet"/>
+      </w:pPr>
+      <w:r>
+        <w:t>Meetings with people who are not supervising you</w:t>
+      </w:r>
+    </w:p>
+    <w:p>
+      <w:pPr>
+        <w:pStyle w:val="ListBullet"/>
+      </w:pPr>
+      <w:r>
+        <w:t>Team parties</w:t>
+      </w:r>
+    </w:p>
+    <w:p>
+      <w:pPr>
+        <w:pStyle w:val="ListBullet"/>
+      </w:pPr>
+      <w:r>
+        <w:t>Trainings</w:t>
+      </w:r>
+    </w:p>
+    <w:p>
+      <w:pPr>
+        <w:pStyle w:val="ListBullet"/>
+      </w:pPr>
+      <w:r>
+        <w:t>Chart reviews</w:t>
+      </w:r>
+    </w:p>
+    <w:p>
+      <w:pPr>
+        <w:pStyle w:val="ListBullet"/>
+      </w:pPr>
+      <w:r>
+        <w:t>Book club</w:t>
+      </w:r>
+    </w:p>
+    <w:p>
+      <w:pPr>
+        <w:pStyle w:val="ListBullet"/>
+      </w:pPr>
+      <w:r>
+        <w:t>Other non-supervisory activities</w:t>
+      </w:r>
+    </w:p>
+    <w:p>
+      <w:r>
+        <w:t xml:space="preserve">Please keep this in mind when logging time in Lauris. </w:t>
+      </w:r>
+    </w:p>
+    <w:p>
+      <w:r>
+        <w:br w:type="page"/>
+      </w:r>
+    </w:p>
+    <w:p>
+      <w:pPr>
+        <w:pStyle w:val="Heading1"/>
+      </w:pPr>
+      <w:r>
+        <w:t>23. For Mental Health Supervisors</w:t>
+      </w:r>
+    </w:p>
+    <w:p>
+      <w:r>
+        <w:t>This section covers the recurring responsibilities and resources specific to supervising the m</w:t>
+      </w:r>
+      <w:r>
+        <w:t>ental health teams.</w:t>
+      </w:r>
+    </w:p>
+    <w:p>
+      <w:pPr>
         <w:pStyle w:val="Heading2"/>
       </w:pPr>
       <w:r>
-        <w:t>13.4 Registered Interns: Logging Supervision Hours for Licensure</w:t>
-      </w:r>
-    </w:p>
-    <w:p>
-      <w:r>
-        <w:t>This subsection applies to registered interns who are accruing therapy and supervision hours toward licensure. It does not apply to licensed therapists.</w:t>
-      </w:r>
-    </w:p>
-    <w:p>
-      <w:r>
-        <w:t>Each month, registered interns will receive a log of their accrued therapy hours and supervision hours. The log is to be signed by the intern, the intern’s supervisor, and the qualified supervisor (if that person is within the agency). Only actual supervision time should be logged to the supervision service code in Lauris, and the appointment must be marked "complete" in Lauris in order for it to count.</w:t>
-      </w:r>
-    </w:p>
-    <w:p>
-      <w:r>
-        <w:t>What counts toward supervision for licensure:</w:t>
-      </w:r>
-    </w:p>
-    <w:p>
-      <w:pPr>
-        <w:pStyle w:val="ListBullet"/>
-      </w:pPr>
-      <w:r>
-        <w:t>Individual Supervision</w:t>
-      </w:r>
-    </w:p>
-    <w:p>
-      <w:pPr>
-        <w:pStyle w:val="ListBullet"/>
-      </w:pPr>
-      <w:r>
-        <w:t>Group Supervision</w:t>
-      </w:r>
-    </w:p>
-    <w:p>
-      <w:pPr>
-        <w:pStyle w:val="ListBullet"/>
-      </w:pPr>
-      <w:r>
-        <w:t>Reflective Supervision</w:t>
-      </w:r>
-    </w:p>
-    <w:p>
-      <w:pPr>
-        <w:pStyle w:val="ListBullet"/>
-      </w:pPr>
-      <w:r>
-        <w:t>Clinical meetings — only if your team meets in breakout rooms after the main portion and discusses clinical content (reviewing cases, reflecting on cases, etc.).</w:t>
-      </w:r>
-    </w:p>
-    <w:p>
-      <w:r>
-        <w:t>What does not count toward supervision for licensure:</w:t>
-      </w:r>
-    </w:p>
-    <w:p>
-      <w:pPr>
-        <w:pStyle w:val="ListBullet"/>
-      </w:pPr>
-      <w:r>
-        <w:t>Meetings with people who are not supervising you</w:t>
-      </w:r>
-    </w:p>
-    <w:p>
-      <w:pPr>
-        <w:pStyle w:val="ListBullet"/>
-      </w:pPr>
-      <w:r>
-        <w:t>Team parties</w:t>
-      </w:r>
-    </w:p>
-    <w:p>
-      <w:pPr>
-        <w:pStyle w:val="ListBullet"/>
-      </w:pPr>
-      <w:r>
-        <w:t>Trainings</w:t>
-      </w:r>
-    </w:p>
-    <w:p>
-      <w:pPr>
-        <w:pStyle w:val="ListBullet"/>
-      </w:pPr>
-      <w:r>
-        <w:t>Chart reviews</w:t>
-      </w:r>
-    </w:p>
-    <w:p>
-      <w:pPr>
-        <w:pStyle w:val="ListBullet"/>
-      </w:pPr>
-      <w:r>
-        <w:t>Book club</w:t>
-      </w:r>
-    </w:p>
-    <w:p>
-      <w:pPr>
-        <w:pStyle w:val="ListBullet"/>
-      </w:pPr>
-      <w:r>
-        <w:t>Other non-supervisory activities</w:t>
-      </w:r>
-    </w:p>
-    <w:p>
-      <w:r>
-        <w:t xml:space="preserve">Please keep this in mind when logging time in Lauris. </w:t>
-      </w:r>
-    </w:p>
-    <w:p>
-      <w:r>
-        <w:br w:type="page"/>
-      </w:r>
-    </w:p>
-    <w:p>
-      <w:pPr>
-        <w:pStyle w:val="Heading1"/>
-      </w:pPr>
-      <w:r>
-        <w:lastRenderedPageBreak/>
-        <w:t>For Mental Health Supervisors</w:t>
-      </w:r>
-    </w:p>
-    <w:p>
-      <w:r>
-        <w:t>This section covers the recurring responsibilities and resources specific to supervising the m</w:t>
-      </w:r>
-      <w:r>
-        <w:t>ental health teams.</w:t>
+        <w:t>23.1 Expectations</w:t>
+      </w:r>
+    </w:p>
+    <w:p>
+      <w:r>
+        <w:t>A clinical supervisor provides guidance, support, and oversight to mental health clinicians to help ensure individuals and families receive quality care. Supervisors support staff development through coaching, case consulta</w:t>
+      </w:r>
+      <w:r>
+        <w:t>tion, and training, while helping ensure services are delivered ethically and in line with program standards.</w:t>
       </w:r>
     </w:p>
     <w:p>
@@ -5470,23 +5337,7 @@
         <w:pStyle w:val="Heading2"/>
       </w:pPr>
       <w:r>
-        <w:t>Expectations</w:t>
-      </w:r>
-    </w:p>
-    <w:p>
-      <w:r>
-        <w:t>A clinical supervisor provides guidance, support, and oversight to mental health clinicians to help ensure individuals and families receive quality care. Supervisors support staff development through coaching, case consulta</w:t>
-      </w:r>
-      <w:r>
-        <w:t>tion, and training, while helping ensure services are delivered ethically and in line with program standards.</w:t>
-      </w:r>
-    </w:p>
-    <w:p>
-      <w:pPr>
-        <w:pStyle w:val="Heading2"/>
-      </w:pPr>
-      <w:r>
-        <w:t>Leader Portal</w:t>
+        <w:t>23.2 Leader Portal</w:t>
       </w:r>
     </w:p>
     <w:p>
@@ -5513,7 +5364,7 @@
         <w:pStyle w:val="Heading2"/>
       </w:pPr>
       <w:r>
-        <w:t>Monthly Updates</w:t>
+        <w:t>23.3 Monthly Updates</w:t>
       </w:r>
     </w:p>
     <w:p>
@@ -5540,7 +5391,7 @@
         <w:pStyle w:val="Heading2"/>
       </w:pPr>
       <w:r>
-        <w:t>Qualified Supervisors (QS)</w:t>
+        <w:t>23.4 Qualified Supervisors (QS)</w:t>
       </w:r>
     </w:p>
     <w:p>
@@ -5570,7 +5421,7 @@
         <w:pStyle w:val="Heading2"/>
       </w:pPr>
       <w:r>
-        <w:t>Supervisor Meetings</w:t>
+        <w:t>23.5 Supervisor Meetings</w:t>
       </w:r>
     </w:p>
     <w:p>
@@ -5589,7 +5440,7 @@
         <w:pStyle w:val="Heading2"/>
       </w:pPr>
       <w:r>
-        <w:t>Interns</w:t>
+        <w:t>23.6 Interns</w:t>
       </w:r>
     </w:p>
     <w:p>
@@ -5653,7 +5504,7 @@
         <w:pStyle w:val="Heading2"/>
       </w:pPr>
       <w:r>
-        <w:t>Quarterly Supervisor Review</w:t>
+        <w:t>23.7 Quarterly Supervisor Review</w:t>
       </w:r>
     </w:p>
     <w:p>
@@ -5673,7 +5524,7 @@
         <w:pStyle w:val="Heading2"/>
       </w:pPr>
       <w:r>
-        <w:t>MH Audits</w:t>
+        <w:t>23.8 MH Audits</w:t>
       </w:r>
     </w:p>
     <w:p>
@@ -5721,7 +5572,7 @@
         <w:pStyle w:val="Heading2"/>
       </w:pPr>
       <w:r>
-        <w:t>Compliance Monitoring</w:t>
+        <w:t>23.9 Compliance Monitoring</w:t>
       </w:r>
     </w:p>
     <w:p>
@@ -5745,7 +5596,7 @@
         <w:pStyle w:val="Heading2"/>
       </w:pPr>
       <w:r>
-        <w:t>Transferring Cases</w:t>
+        <w:t>23.10 Transferring Cases</w:t>
       </w:r>
     </w:p>
     <w:p>
@@ -5769,7 +5620,7 @@
         <w:pStyle w:val="Heading2"/>
       </w:pPr>
       <w:r>
-        <w:t>Collaboration with Other Programs</w:t>
+        <w:t>23.11 Collaboration with Other Programs</w:t>
       </w:r>
     </w:p>
     <w:p>
@@ -6142,7 +5993,6 @@
         <w:pStyle w:val="Heading2"/>
       </w:pPr>
       <w:r>
-        <w:lastRenderedPageBreak/>
         <w:t>Example Clinical Documents</w:t>
       </w:r>
     </w:p>
@@ -6333,7 +6183,6 @@
         <w:pStyle w:val="Heading1"/>
       </w:pPr>
       <w:r>
-        <w:lastRenderedPageBreak/>
         <w:t>Appendix D. Sources and Regulatory References</w:t>
       </w:r>
     </w:p>

</xml_diff>

<commit_message>
Add centered "Page X of Y" page numbers to the footer
Co-Authored-By: Claude Opus 4.8 (1M context) <noreply@anthropic.com>
</commit_message>
<xml_diff>
--- a/FASD_Mental_Health_Onboarding_Manual.docx
+++ b/FASD_Mental_Health_Onboarding_Manual.docx
@@ -6307,6 +6307,7 @@
       </w:r>
     </w:p>
     <w:sectPr>
+      <w:footerReference w:type="default" r:id="rId35"/>
       <w:pgSz w:w="12240" w:h="15840"/>
       <w:pgMar w:top="1440" w:right="1440" w:bottom="1440" w:left="1440" w:header="720" w:footer="720" w:gutter="0"/>
       <w:cols w:space="720"/>
@@ -6339,6 +6340,33 @@
     </w:p>
   </w:endnote>
 </w:endnotes>
+</file>
+
+<file path=word/footer1.xml><?xml version="1.0" encoding="utf-8"?>
+<w:ftr xmlns:m="http://schemas.openxmlformats.org/officeDocument/2006/math" xmlns:mc="http://schemas.openxmlformats.org/markup-compatibility/2006" xmlns:mo="http://schemas.microsoft.com/office/mac/office/2008/main" xmlns:mv="urn:schemas-microsoft-com:mac:vml" xmlns:o="urn:schemas-microsoft-com:office:office" xmlns:r="http://schemas.openxmlformats.org/officeDocument/2006/relationships" xmlns:v="urn:schemas-microsoft-com:vml" xmlns:w10="urn:schemas-microsoft-com:office:word" xmlns:w14="http://schemas.microsoft.com/office/word/2010/wordml" xmlns:w="http://schemas.openxmlformats.org/wordprocessingml/2006/main" xmlns:wne="http://schemas.microsoft.com/office/word/2006/wordml" xmlns:wp14="http://schemas.microsoft.com/office/word/2010/wordprocessingDrawing" xmlns:wp="http://schemas.openxmlformats.org/drawingml/2006/wordprocessingDrawing" xmlns:wpc="http://schemas.microsoft.com/office/word/2010/wordprocessingCanvas" xmlns:wpg="http://schemas.microsoft.com/office/word/2010/wordprocessingGroup" xmlns:wpi="http://schemas.microsoft.com/office/word/2010/wordprocessingInk" xmlns:wps="http://schemas.microsoft.com/office/word/2010/wordprocessingShape" mc:Ignorable="w14 wp14">
+  <w:p>
+    <w:pPr>
+      <w:pStyle w:val="Footer"/>
+      <w:jc w:val="center"/>
+    </w:pPr>
+    <w:r>
+      <w:t xml:space="preserve">Page </w:t>
+    </w:r>
+    <w:fldSimple w:instr="PAGE">
+      <w:r>
+        <w:t>1</w:t>
+      </w:r>
+    </w:fldSimple>
+    <w:r>
+      <w:t xml:space="preserve"> of </w:t>
+    </w:r>
+    <w:fldSimple w:instr="NUMPAGES">
+      <w:r>
+        <w:t>1</w:t>
+      </w:r>
+    </w:fldSimple>
+  </w:p>
+</w:ftr>
 </file>
 
 <file path=word/footnotes.xml><?xml version="1.0" encoding="utf-8"?>

</xml_diff>